<commit_message>
docs: record remote checkpoint and git history cleanup
Co-authored-by: Cursor <cursoragent@cursor.com>
</commit_message>
<xml_diff>
--- a/docs/DREAMSCRAFT_SITE_REGISTRO_DESENVOLVIMENTO.docx
+++ b/docs/DREAMSCRAFT_SITE_REGISTRO_DESENVOLVIMENTO.docx
@@ -51,7 +51,7 @@
           <w:color w:val="625B72"/>
           <w:sz w:val="18"/>
         </w:rPr>
-        <w:t>Versão 1.1  ·  15/09/2026</w:t>
+        <w:t>Versão 1.2  ·  16/09/2026</w:t>
       </w:r>
     </w:p>
     <w:tbl>
@@ -483,14 +483,15 @@
             <w:pPr>
               <w:spacing w:after="0"/>
             </w:pPr>
+            <w:r/>
             <w:r>
               <w:rPr>
                 <w:rFonts w:ascii="Cascadia Code" w:hAnsi="Cascadia Code"/>
                 <w:b/>
-                <w:color w:val="AF66F9"/>
+                <w:color w:val="6A78F6"/>
                 <w:sz w:val="16"/>
               </w:rPr>
-              <w:t>CONFIRMADO</w:t>
+              <w:t>INFORMADO</w:t>
             </w:r>
           </w:p>
         </w:tc>
@@ -510,13 +511,15 @@
             <w:pPr>
               <w:spacing w:after="0"/>
             </w:pPr>
+            <w:r/>
             <w:r>
               <w:rPr>
                 <w:rFonts w:ascii="Cascadia Code" w:hAnsi="Cascadia Code"/>
+                <w:b w:val="0"/>
                 <w:color w:val="18132E"/>
                 <w:sz w:val="17"/>
               </w:rPr>
-              <w:t>A branch local de trabalho informada como feat/home-v4-2 não existe atualmente no GitHub remoto.</w:t>
+              <w:t>A branch feat/home-v4-2 foi enviada com sucesso para origin/feat/home-v4-2 após limpeza controlada do histórico local. Working tree informado como limpo e branch rastreando o remoto.</w:t>
             </w:r>
           </w:p>
         </w:tc>
@@ -550,6 +553,7 @@
             <w:pPr>
               <w:spacing w:after="0"/>
             </w:pPr>
+            <w:r/>
             <w:r>
               <w:rPr>
                 <w:rFonts w:ascii="Cascadia Code" w:hAnsi="Cascadia Code"/>
@@ -557,7 +561,7 @@
                 <w:color w:val="21104E"/>
                 <w:sz w:val="16"/>
               </w:rPr>
-              <w:t>EXPLICAÇÃO</w:t>
+              <w:t>CHECKPOINT</w:t>
             </w:r>
           </w:p>
         </w:tc>
@@ -577,13 +581,15 @@
             <w:pPr>
               <w:spacing w:after="0"/>
             </w:pPr>
+            <w:r/>
             <w:r>
               <w:rPr>
                 <w:rFonts w:ascii="Cascadia Code" w:hAnsi="Cascadia Code"/>
+                <w:b w:val="0"/>
                 <w:color w:val="18132E"/>
                 <w:sz w:val="17"/>
               </w:rPr>
-              <w:t>Durante as rodadas de Home/motion, o fluxo foi mantido deliberadamente como 'sem commit / sem push' para não versionar trabalho visual ainda não aprovado. Isso protegeu main, mas deixou o remoto desatualizado por tempo demais.</w:t>
+              <w:t>O primeiro push falhou por um PDF oficial de ~242 MB existente no histórico local. A feature ainda não publicada foi reescrita de forma controlada para retirar somente esse PDF do Git comum; o arquivo físico foi preservado localmente e ignorado por caminho exato.</w:t>
             </w:r>
           </w:p>
         </w:tc>
@@ -1124,6 +1130,7 @@
             <w:pPr>
               <w:spacing w:after="0"/>
             </w:pPr>
+            <w:r/>
             <w:r>
               <w:rPr>
                 <w:rFonts w:ascii="Cascadia Code" w:hAnsi="Cascadia Code"/>
@@ -1151,13 +1158,15 @@
             <w:pPr>
               <w:spacing w:after="0"/>
             </w:pPr>
+            <w:r/>
             <w:r>
               <w:rPr>
                 <w:rFonts w:ascii="Cascadia Code" w:hAnsi="Cascadia Code"/>
+                <w:b w:val="0"/>
                 <w:color w:val="18132E"/>
                 <w:sz w:val="17"/>
               </w:rPr>
-              <w:t>9feb880 — feat: implement diagnostic v2 experience (checkpoint aprovado).</w:t>
+              <w:t>a2b0f74 — feat: implement diagnostic v2 experience (equivalente reescrito de 9feb880 após limpeza do histórico da feature).</w:t>
             </w:r>
           </w:p>
         </w:tc>
@@ -1737,11 +1746,12 @@
             <w:pPr>
               <w:spacing w:after="0"/>
             </w:pPr>
+            <w:r/>
             <w:r>
               <w:rPr>
                 <w:rFonts w:ascii="Cascadia Code" w:hAnsi="Cascadia Code"/>
                 <w:b/>
-                <w:color w:val="21104E"/>
+                <w:color w:val="6A78F6"/>
                 <w:sz w:val="16"/>
               </w:rPr>
               <w:t>INFORMADO</w:t>
@@ -1764,13 +1774,15 @@
             <w:pPr>
               <w:spacing w:after="0"/>
             </w:pPr>
+            <w:r/>
             <w:r>
               <w:rPr>
                 <w:rFonts w:ascii="Cascadia Code" w:hAnsi="Cascadia Code"/>
+                <w:b w:val="0"/>
                 <w:color w:val="18132E"/>
                 <w:sz w:val="17"/>
               </w:rPr>
-              <w:t>Resultados abaixo foram reportados pelo Cursor durante as rodadas. Devem ser repetidos no checkpoint final antes de merge/deploy.</w:t>
+              <w:t>QA final e pós-rewrite reportados pelo Cursor: testes 43/43, typecheck, build e diff-check OK; smoke em / e /estimar sem pageerror/overflow; handoff Home → /estimar OK. vite preview apresentou 500 Nitro/Cloudflare, registrado como pendência de ambiente/preview e não como regressão do rebase.</w:t>
             </w:r>
           </w:p>
         </w:tc>
@@ -1863,7 +1875,11 @@
     </w:p>
     <w:p>
       <w:r>
-        <w:t>O repositório remoto não foi abandonado. O fluxo de trabalho adotado durante as muitas iterações visuais foi manter a feature local sem commit/push até aprovação. Isso reduziu risco de poluir main, mas acumulou tempo demais sem checkpoint remoto. A partir de agora, essa prática deve mudar.</w:t>
+        <w:rPr>
+          <w:rFonts w:ascii="Cascadia Code" w:hAnsi="Cascadia Code"/>
+          <w:sz w:val="19"/>
+        </w:rPr>
+        <w:t>O repositório remoto não foi abandonado. Durante as iterações visuais, a feature permaneceu local para evitar versionar estados não aprovados. Quando o milestone foi finalmente fechado, o primeiro push revelou um segundo problema: um PDF oficial de marca com ~242 MB já fazia parte do histórico local da feature. A branch ainda não havia sido publicada, então o histórico local pôde ser limpo de forma controlada antes do primeiro push bem-sucedido.</w:t>
       </w:r>
     </w:p>
     <w:tbl>
@@ -2050,8 +2066,9 @@
       <w:r>
         <w:rPr>
           <w:rFonts w:ascii="Cascadia Code" w:hAnsi="Cascadia Code"/>
+          <w:sz w:val="18"/>
         </w:rPr>
-        <w:t>02  Executar QA final da Home antes de versionar.</w:t>
+        <w:t>02  QA final executado antes do versionamento.</w:t>
       </w:r>
     </w:p>
     <w:p>
@@ -2061,10 +2078,9 @@
       <w:r>
         <w:rPr>
           <w:rFonts w:ascii="Cascadia Code" w:hAnsi="Cascadia Code"/>
-          <w:color w:val="18132E"/>
           <w:sz w:val="18"/>
         </w:rPr>
-        <w:t>03  Remover .playwright-mcp e artefatos temporários.</w:t>
+        <w:t>03  Artefatos temporários verificados; .playwright-mcp não estava presente no workspace no fechamento.</w:t>
       </w:r>
     </w:p>
     <w:p>
@@ -2074,10 +2090,9 @@
       <w:r>
         <w:rPr>
           <w:rFonts w:ascii="Cascadia Code" w:hAnsi="Cascadia Code"/>
-          <w:color w:val="18132E"/>
           <w:sz w:val="18"/>
         </w:rPr>
-        <w:t>04  Commitar a Home V6G + motion + fluxo-sistema.svg + documentação.</w:t>
+        <w:t>04  Home V6G + motion + fluxo-sistema.svg versionados no commit 0dcb283.</w:t>
       </w:r>
     </w:p>
     <w:p>
@@ -2087,10 +2102,9 @@
       <w:r>
         <w:rPr>
           <w:rFonts w:ascii="Cascadia Code" w:hAnsi="Cascadia Code"/>
-          <w:color w:val="18132E"/>
           <w:sz w:val="18"/>
         </w:rPr>
-        <w:t>05  Adicionar este DOCX ao diretório docs/ do repositório local.</w:t>
+        <w:t>05  Diário versionado em docs/DREAMSCRAFT_SITE_REGISTRO_DESENVOLVIMENTO.docx no commit bd2530c.</w:t>
       </w:r>
     </w:p>
     <w:p>
@@ -2100,10 +2114,9 @@
       <w:r>
         <w:rPr>
           <w:rFonts w:ascii="Cascadia Code" w:hAnsi="Cascadia Code"/>
-          <w:color w:val="18132E"/>
           <w:sz w:val="18"/>
         </w:rPr>
-        <w:t>06  Push da branch feat/home-v4-2 para origin como checkpoint remoto.</w:t>
+        <w:t>06  Push concluído: feat/home-v4-2 → origin/feat/home-v4-2, sem force.</w:t>
       </w:r>
     </w:p>
     <w:p>
@@ -2113,8 +2126,9 @@
       <w:r>
         <w:rPr>
           <w:rFonts w:ascii="Cascadia Code" w:hAnsi="Cascadia Code"/>
+          <w:sz w:val="18"/>
         </w:rPr>
-        <w:t>07  Após o push da feature, abrir PR/revisar e só então decidir merge em main.</w:t>
+        <w:t>07  PR/merge ainda não executados; main e deploy permanecem intocados.</w:t>
       </w:r>
     </w:p>
     <w:p>
@@ -2124,10 +2138,9 @@
       <w:r>
         <w:rPr>
           <w:rFonts w:ascii="Cascadia Code" w:hAnsi="Cascadia Code"/>
-          <w:color w:val="18132E"/>
           <w:sz w:val="18"/>
         </w:rPr>
-        <w:t>08  Depois do merge, iniciar auditoria das rotas restantes.</w:t>
+        <w:t>08  Próximo trabalho: auditoria das rotas restantes e definição do escopo real de lançamento.</w:t>
       </w:r>
     </w:p>
     <w:p>
@@ -2246,10 +2259,10 @@
               <w:rPr>
                 <w:rFonts w:ascii="Cascadia Code" w:hAnsi="Cascadia Code"/>
                 <w:b/>
-                <w:color w:val="AF66F9"/>
+                <w:color w:val="6A78F6"/>
                 <w:sz w:val="16"/>
               </w:rPr>
-              <w:t>PRÓXIMO</w:t>
+              <w:t>CONCLUÍDO</w:t>
             </w:r>
           </w:p>
         </w:tc>
@@ -2277,7 +2290,7 @@
                 <w:color w:val="18132E"/>
                 <w:sz w:val="17"/>
               </w:rPr>
-              <w:t>QA final, limpeza de artefatos temporários e revisão do diff antes do commit.</w:t>
+              <w:t>QA final, revisão do diff e fechamento técnico concluídos.</w:t>
             </w:r>
           </w:p>
         </w:tc>
@@ -2316,10 +2329,10 @@
               <w:rPr>
                 <w:rFonts w:ascii="Cascadia Code" w:hAnsi="Cascadia Code"/>
                 <w:b/>
-                <w:color w:val="21104E"/>
+                <w:color w:val="6A78F6"/>
                 <w:sz w:val="16"/>
               </w:rPr>
-              <w:t>PLANEJADO</w:t>
+              <w:t>CONCLUÍDO</w:t>
             </w:r>
           </w:p>
         </w:tc>
@@ -2347,7 +2360,7 @@
                 <w:color w:val="18132E"/>
                 <w:sz w:val="17"/>
               </w:rPr>
-              <w:t>Commit local da Home V6G, motion, pictograma Fluxo · Sistema e documentação.</w:t>
+              <w:t>Commit da Home: 0dcb283 — feat: finalize home v6g experience.</w:t>
             </w:r>
           </w:p>
         </w:tc>
@@ -2386,10 +2399,10 @@
               <w:rPr>
                 <w:rFonts w:ascii="Cascadia Code" w:hAnsi="Cascadia Code"/>
                 <w:b/>
-                <w:color w:val="21104E"/>
+                <w:color w:val="6A78F6"/>
                 <w:sz w:val="16"/>
               </w:rPr>
-              <w:t>PLANEJADO</w:t>
+              <w:t>CONCLUÍDO</w:t>
             </w:r>
           </w:p>
         </w:tc>
@@ -2417,7 +2430,7 @@
                 <w:color w:val="18132E"/>
                 <w:sz w:val="17"/>
               </w:rPr>
-              <w:t>Push da branch feat/home-v4-2 para o GitHub após o fechamento técnico.</w:t>
+              <w:t>Push da feat/home-v4-2 concluído para origin sem force; main não foi mergeada.</w:t>
             </w:r>
           </w:p>
         </w:tc>
@@ -2456,10 +2469,10 @@
               <w:rPr>
                 <w:rFonts w:ascii="Cascadia Code" w:hAnsi="Cascadia Code"/>
                 <w:b/>
-                <w:color w:val="21104E"/>
+                <w:color w:val="6A78F6"/>
                 <w:sz w:val="16"/>
               </w:rPr>
-              <w:t>PLANEJADO</w:t>
+              <w:t>CONCLUÍDO</w:t>
             </w:r>
           </w:p>
         </w:tc>
@@ -2487,7 +2500,7 @@
                 <w:color w:val="18132E"/>
                 <w:sz w:val="17"/>
               </w:rPr>
-              <w:t>Versionar este DOCX canônico em docs/DREAMSCRAFT_SITE_REGISTRO_DESENVOLVIMENTO.docx.</w:t>
+              <w:t>Diário versionado: bd2530c — docs: record home v6g development milestone.</w:t>
             </w:r>
           </w:p>
         </w:tc>
@@ -2521,14 +2534,15 @@
             <w:pPr>
               <w:spacing w:after="0"/>
             </w:pPr>
+            <w:r/>
             <w:r>
               <w:rPr>
                 <w:rFonts w:ascii="Cascadia Code" w:hAnsi="Cascadia Code"/>
                 <w:b/>
-                <w:color w:val="21104E"/>
+                <w:color w:val="AF66F9"/>
                 <w:sz w:val="16"/>
               </w:rPr>
-              <w:t>PLANEJADO</w:t>
+              <w:t>PRÓXIMO</w:t>
             </w:r>
           </w:p>
         </w:tc>
@@ -2548,13 +2562,15 @@
             <w:pPr>
               <w:spacing w:after="0"/>
             </w:pPr>
+            <w:r/>
             <w:r>
               <w:rPr>
                 <w:rFonts w:ascii="Cascadia Code" w:hAnsi="Cascadia Code"/>
+                <w:b w:val="0"/>
                 <w:color w:val="18132E"/>
                 <w:sz w:val="17"/>
               </w:rPr>
-              <w:t>Auditoria de rotas: manter, redesenhar, fundir, redirecionar, ocultar ou interna.</w:t>
+              <w:t>Auditoria de rotas: manter, finalizar, fundir, redirecionar, ocultar ou tratar como interna.</w:t>
             </w:r>
           </w:p>
         </w:tc>
@@ -2771,7 +2787,11 @@
     </w:p>
     <w:p>
       <w:r>
-        <w:t>O site está em uma fase de consolidação da Home V6G e do sistema de motion. O maior risco operacional identificado não é técnico: é perda de rastreabilidade entre muitas iterações locais e um GitHub remoto desatualizado. A correção de governança é começar a registrar checkpoints remotos e manter este documento vivo.</w:t>
+        <w:rPr>
+          <w:rFonts w:ascii="Cascadia Code" w:hAnsi="Cascadia Code"/>
+          <w:sz w:val="19"/>
+        </w:rPr>
+        <w:t>A Home V6G e o Diagnóstico V2 estão versionados na branch remota feat/home-v4-2. O checkpoint resolveu também o primeiro bloqueio de publicação da branch: um PDF oficial &gt;100 MB existente no histórico local. Main permanece sem merge e nenhum deploy foi realizado. A próxima frente é auditar as rotas e reduzir o site ao escopo real de lançamento.</w:t>
       </w:r>
     </w:p>
     <w:p>
@@ -2793,8 +2813,9 @@
       <w:r>
         <w:rPr>
           <w:rFonts w:ascii="Cascadia Code" w:hAnsi="Cascadia Code"/>
+          <w:sz w:val="18"/>
         </w:rPr>
-        <w:t>Após o fechamento técnico: inserir aqui o hash do commit da Home, confirmação do push da branch, PR/merge (se houver) e data do checkpoint remoto.</w:t>
+        <w:t>Checkpoint remoto registrado: Home 0dcb283 · Diário bd2530c · branch feat/home-v4-2 enviada para origin sem force. Ainda não houve PR/merge em main nem deploy.</w:t>
       </w:r>
     </w:p>
     <w:p>
@@ -3520,6 +3541,882 @@
         <w:t>• Depois de cada milestone versionado, inserir hash do commit e, quando houver, PR/merge/deploy correspondente.</w:t>
       </w:r>
     </w:p>
+    <w:p>
+      <w:r>
+        <w:br w:type="page"/>
+      </w:r>
+    </w:p>
+    <w:p>
+      <w:pPr>
+        <w:pStyle w:val="Heading1"/>
+      </w:pPr>
+      <w:r>
+        <w:t>20. 16/09/2026 · CHECKPOINT REMOTO E INCIDENTE DO PDF &gt;100 MB</w:t>
+      </w:r>
+    </w:p>
+    <w:tbl>
+      <w:tblPr>
+        <w:tblW w:type="auto" w:w="0"/>
+        <w:jc w:val="left"/>
+        <w:tblLook w:firstColumn="1" w:firstRow="1" w:lastColumn="0" w:lastRow="0" w:noHBand="0" w:noVBand="1" w:val="04A0"/>
+      </w:tblPr>
+      <w:tblGrid>
+        <w:gridCol w:w="5040"/>
+        <w:gridCol w:w="5040"/>
+      </w:tblGrid>
+      <w:tr>
+        <w:tc>
+          <w:tcPr>
+            <w:tcW w:type="dxa" w:w="5040"/>
+            <w:shd w:fill="F1F3FF"/>
+          </w:tcPr>
+          <w:p>
+            <w:pPr>
+              <w:spacing w:after="0"/>
+            </w:pPr>
+            <w:r/>
+            <w:r>
+              <w:rPr>
+                <w:rFonts w:ascii="Cascadia Code" w:hAnsi="Cascadia Code"/>
+                <w:b/>
+                <w:color w:val="6A78F6"/>
+                <w:sz w:val="16"/>
+              </w:rPr>
+              <w:t>MARCO</w:t>
+            </w:r>
+          </w:p>
+        </w:tc>
+        <w:tc>
+          <w:tcPr>
+            <w:tcW w:type="dxa" w:w="5040"/>
+            <w:shd w:fill="F1F3FF"/>
+          </w:tcPr>
+          <w:p>
+            <w:pPr>
+              <w:spacing w:after="0"/>
+            </w:pPr>
+            <w:r/>
+            <w:r>
+              <w:rPr>
+                <w:rFonts w:ascii="Cascadia Code" w:hAnsi="Cascadia Code"/>
+                <w:b w:val="0"/>
+                <w:color w:val="18132E"/>
+                <w:sz w:val="17"/>
+              </w:rPr>
+              <w:t>Primeiro checkpoint remoto completo da fase Home V6G: branch feat/home-v4-2 publicada com sucesso após limpeza controlada do histórico local.</w:t>
+            </w:r>
+          </w:p>
+        </w:tc>
+      </w:tr>
+    </w:tbl>
+    <w:tbl>
+      <w:tblPr>
+        <w:tblW w:type="auto" w:w="0"/>
+        <w:jc w:val="center"/>
+        <w:tblLook w:firstColumn="1" w:firstRow="1" w:lastColumn="0" w:lastRow="0" w:noHBand="0" w:noVBand="1" w:val="04A0"/>
+      </w:tblPr>
+      <w:tblGrid>
+        <w:gridCol w:w="5040"/>
+        <w:gridCol w:w="5040"/>
+      </w:tblGrid>
+      <w:tr>
+        <w:tc>
+          <w:tcPr>
+            <w:tcW w:type="dxa" w:w="5040"/>
+            <w:shd w:fill="21104E"/>
+          </w:tcPr>
+          <w:p>
+            <w:pPr>
+              <w:spacing w:after="0"/>
+            </w:pPr>
+            <w:r/>
+            <w:r>
+              <w:rPr>
+                <w:rFonts w:ascii="Cascadia Code" w:hAnsi="Cascadia Code"/>
+                <w:b/>
+                <w:color w:val="EFE5FD"/>
+                <w:sz w:val="16"/>
+              </w:rPr>
+              <w:t>ITEM</w:t>
+            </w:r>
+          </w:p>
+        </w:tc>
+        <w:tc>
+          <w:tcPr>
+            <w:tcW w:type="dxa" w:w="5040"/>
+            <w:shd w:fill="21104E"/>
+          </w:tcPr>
+          <w:p>
+            <w:pPr>
+              <w:spacing w:after="0"/>
+            </w:pPr>
+            <w:r/>
+            <w:r>
+              <w:rPr>
+                <w:rFonts w:ascii="Cascadia Code" w:hAnsi="Cascadia Code"/>
+                <w:b/>
+                <w:color w:val="EFE5FD"/>
+                <w:sz w:val="16"/>
+              </w:rPr>
+              <w:t>REGISTRO</w:t>
+            </w:r>
+          </w:p>
+        </w:tc>
+      </w:tr>
+      <w:tr>
+        <w:tc>
+          <w:tcPr>
+            <w:tcW w:type="dxa" w:w="5040"/>
+          </w:tcPr>
+          <w:p>
+            <w:pPr>
+              <w:spacing w:after="0"/>
+            </w:pPr>
+            <w:r/>
+            <w:r>
+              <w:rPr>
+                <w:rFonts w:ascii="Cascadia Code" w:hAnsi="Cascadia Code"/>
+                <w:b/>
+                <w:color w:val="6A78F6"/>
+                <w:sz w:val="16"/>
+              </w:rPr>
+              <w:t>Problema</w:t>
+            </w:r>
+          </w:p>
+        </w:tc>
+        <w:tc>
+          <w:tcPr>
+            <w:tcW w:type="dxa" w:w="5040"/>
+          </w:tcPr>
+          <w:p>
+            <w:pPr>
+              <w:spacing w:after="0"/>
+            </w:pPr>
+            <w:r/>
+            <w:r>
+              <w:rPr>
+                <w:rFonts w:ascii="Cascadia Code" w:hAnsi="Cascadia Code"/>
+                <w:b w:val="0"/>
+                <w:color w:val="18132E"/>
+                <w:sz w:val="16"/>
+              </w:rPr>
+              <w:t>O primeiro push foi rejeitado pelo GitHub porque docs/brand/Linguagem_Visual_Dreamscraft.pdf tinha ~242 MB, acima do limite do Git comum.</w:t>
+            </w:r>
+          </w:p>
+        </w:tc>
+      </w:tr>
+      <w:tr>
+        <w:tc>
+          <w:tcPr>
+            <w:tcW w:type="dxa" w:w="5040"/>
+          </w:tcPr>
+          <w:p>
+            <w:pPr>
+              <w:spacing w:after="0"/>
+            </w:pPr>
+            <w:r/>
+            <w:r>
+              <w:rPr>
+                <w:rFonts w:ascii="Cascadia Code" w:hAnsi="Cascadia Code"/>
+                <w:b/>
+                <w:color w:val="6A78F6"/>
+                <w:sz w:val="16"/>
+              </w:rPr>
+              <w:t>Origem</w:t>
+            </w:r>
+          </w:p>
+        </w:tc>
+        <w:tc>
+          <w:tcPr>
+            <w:tcW w:type="dxa" w:w="5040"/>
+          </w:tcPr>
+          <w:p>
+            <w:pPr>
+              <w:spacing w:after="0"/>
+            </w:pPr>
+            <w:r/>
+            <w:r>
+              <w:rPr>
+                <w:rFonts w:ascii="Cascadia Code" w:hAnsi="Cascadia Code"/>
+                <w:b w:val="0"/>
+                <w:color w:val="18132E"/>
+                <w:sz w:val="16"/>
+              </w:rPr>
+              <w:t>O PDF havia sido introduzido no commit local 497883e — docs: add brand docs and agent instructions.</w:t>
+            </w:r>
+          </w:p>
+        </w:tc>
+      </w:tr>
+      <w:tr>
+        <w:tc>
+          <w:tcPr>
+            <w:tcW w:type="dxa" w:w="5040"/>
+          </w:tcPr>
+          <w:p>
+            <w:pPr>
+              <w:spacing w:after="0"/>
+            </w:pPr>
+            <w:r/>
+            <w:r>
+              <w:rPr>
+                <w:rFonts w:ascii="Cascadia Code" w:hAnsi="Cascadia Code"/>
+                <w:b/>
+                <w:color w:val="6A78F6"/>
+                <w:sz w:val="16"/>
+              </w:rPr>
+              <w:t>Restrição</w:t>
+            </w:r>
+          </w:p>
+        </w:tc>
+        <w:tc>
+          <w:tcPr>
+            <w:tcW w:type="dxa" w:w="5040"/>
+          </w:tcPr>
+          <w:p>
+            <w:pPr>
+              <w:spacing w:after="0"/>
+            </w:pPr>
+            <w:r/>
+            <w:r>
+              <w:rPr>
+                <w:rFonts w:ascii="Cascadia Code" w:hAnsi="Cascadia Code"/>
+                <w:b w:val="0"/>
+                <w:color w:val="18132E"/>
+                <w:sz w:val="16"/>
+              </w:rPr>
+              <w:t>Não apagar nem substituir asset oficial. Também não adotar complexidade adicional sem benefício claro.</w:t>
+            </w:r>
+          </w:p>
+        </w:tc>
+      </w:tr>
+      <w:tr>
+        <w:tc>
+          <w:tcPr>
+            <w:tcW w:type="dxa" w:w="5040"/>
+          </w:tcPr>
+          <w:p>
+            <w:pPr>
+              <w:spacing w:after="0"/>
+            </w:pPr>
+            <w:r/>
+            <w:r>
+              <w:rPr>
+                <w:rFonts w:ascii="Cascadia Code" w:hAnsi="Cascadia Code"/>
+                <w:b/>
+                <w:color w:val="6A78F6"/>
+                <w:sz w:val="16"/>
+              </w:rPr>
+              <w:t>Decisão</w:t>
+            </w:r>
+          </w:p>
+        </w:tc>
+        <w:tc>
+          <w:tcPr>
+            <w:tcW w:type="dxa" w:w="5040"/>
+          </w:tcPr>
+          <w:p>
+            <w:pPr>
+              <w:spacing w:after="0"/>
+            </w:pPr>
+            <w:r/>
+            <w:r>
+              <w:rPr>
+                <w:rFonts w:ascii="Cascadia Code" w:hAnsi="Cascadia Code"/>
+                <w:b w:val="0"/>
+                <w:color w:val="18132E"/>
+                <w:sz w:val="16"/>
+              </w:rPr>
+              <w:t>Não usar Git LFS apenas por esse PDF neste momento. Preservar o arquivo oficial localmente e removê-lo apenas do histórico Git da feature.</w:t>
+            </w:r>
+          </w:p>
+        </w:tc>
+      </w:tr>
+      <w:tr>
+        <w:tc>
+          <w:tcPr>
+            <w:tcW w:type="dxa" w:w="5040"/>
+          </w:tcPr>
+          <w:p>
+            <w:pPr>
+              <w:spacing w:after="0"/>
+            </w:pPr>
+            <w:r/>
+            <w:r>
+              <w:rPr>
+                <w:rFonts w:ascii="Cascadia Code" w:hAnsi="Cascadia Code"/>
+                <w:b/>
+                <w:color w:val="6A78F6"/>
+                <w:sz w:val="16"/>
+              </w:rPr>
+              <w:t>Proteção</w:t>
+            </w:r>
+          </w:p>
+        </w:tc>
+        <w:tc>
+          <w:tcPr>
+            <w:tcW w:type="dxa" w:w="5040"/>
+          </w:tcPr>
+          <w:p>
+            <w:pPr>
+              <w:spacing w:after="0"/>
+            </w:pPr>
+            <w:r/>
+            <w:r>
+              <w:rPr>
+                <w:rFonts w:ascii="Cascadia Code" w:hAnsi="Cascadia Code"/>
+                <w:b w:val="0"/>
+                <w:color w:val="18132E"/>
+                <w:sz w:val="16"/>
+              </w:rPr>
+              <w:t>Backup local criado: backup/home-v4-2-before-large-pdf-cleanup → 41664ae. O backup não foi enviado ao remoto.</w:t>
+            </w:r>
+          </w:p>
+        </w:tc>
+      </w:tr>
+      <w:tr>
+        <w:tc>
+          <w:tcPr>
+            <w:tcW w:type="dxa" w:w="5040"/>
+          </w:tcPr>
+          <w:p>
+            <w:pPr>
+              <w:spacing w:after="0"/>
+            </w:pPr>
+            <w:r/>
+            <w:r>
+              <w:rPr>
+                <w:rFonts w:ascii="Cascadia Code" w:hAnsi="Cascadia Code"/>
+                <w:b/>
+                <w:color w:val="6A78F6"/>
+                <w:sz w:val="16"/>
+              </w:rPr>
+              <w:t>Método</w:t>
+            </w:r>
+          </w:p>
+        </w:tc>
+        <w:tc>
+          <w:tcPr>
+            <w:tcW w:type="dxa" w:w="5040"/>
+          </w:tcPr>
+          <w:p>
+            <w:pPr>
+              <w:spacing w:after="0"/>
+            </w:pPr>
+            <w:r/>
+            <w:r>
+              <w:rPr>
+                <w:rFonts w:ascii="Cascadia Code" w:hAnsi="Cascadia Code"/>
+                <w:b w:val="0"/>
+                <w:color w:val="18132E"/>
+                <w:sz w:val="16"/>
+              </w:rPr>
+              <w:t>git rebase -i origin/main, editando somente o commit que introduziu o PDF; git rm --cached do PDF; ignore exato; amend; rebase continue.</w:t>
+            </w:r>
+          </w:p>
+        </w:tc>
+      </w:tr>
+      <w:tr>
+        <w:tc>
+          <w:tcPr>
+            <w:tcW w:type="dxa" w:w="5040"/>
+          </w:tcPr>
+          <w:p>
+            <w:pPr>
+              <w:spacing w:after="0"/>
+            </w:pPr>
+            <w:r/>
+            <w:r>
+              <w:rPr>
+                <w:rFonts w:ascii="Cascadia Code" w:hAnsi="Cascadia Code"/>
+                <w:b/>
+                <w:color w:val="6A78F6"/>
+                <w:sz w:val="16"/>
+              </w:rPr>
+              <w:t>Ignore</w:t>
+            </w:r>
+          </w:p>
+        </w:tc>
+        <w:tc>
+          <w:tcPr>
+            <w:tcW w:type="dxa" w:w="5040"/>
+          </w:tcPr>
+          <w:p>
+            <w:pPr>
+              <w:spacing w:after="0"/>
+            </w:pPr>
+            <w:r/>
+            <w:r>
+              <w:rPr>
+                <w:rFonts w:ascii="Cascadia Code" w:hAnsi="Cascadia Code"/>
+                <w:b w:val="0"/>
+                <w:color w:val="18132E"/>
+                <w:sz w:val="16"/>
+              </w:rPr>
+              <w:t>/docs/brand/Linguagem_Visual_Dreamscraft.pdf</w:t>
+            </w:r>
+          </w:p>
+        </w:tc>
+      </w:tr>
+      <w:tr>
+        <w:tc>
+          <w:tcPr>
+            <w:tcW w:type="dxa" w:w="5040"/>
+          </w:tcPr>
+          <w:p>
+            <w:pPr>
+              <w:spacing w:after="0"/>
+            </w:pPr>
+            <w:r/>
+            <w:r>
+              <w:rPr>
+                <w:rFonts w:ascii="Cascadia Code" w:hAnsi="Cascadia Code"/>
+                <w:b/>
+                <w:color w:val="6A78F6"/>
+                <w:sz w:val="16"/>
+              </w:rPr>
+              <w:t>Validação</w:t>
+            </w:r>
+          </w:p>
+        </w:tc>
+        <w:tc>
+          <w:tcPr>
+            <w:tcW w:type="dxa" w:w="5040"/>
+          </w:tcPr>
+          <w:p>
+            <w:pPr>
+              <w:spacing w:after="0"/>
+            </w:pPr>
+            <w:r/>
+            <w:r>
+              <w:rPr>
+                <w:rFonts w:ascii="Cascadia Code" w:hAnsi="Cascadia Code"/>
+                <w:b w:val="0"/>
+                <w:color w:val="18132E"/>
+                <w:sz w:val="16"/>
+              </w:rPr>
+              <w:t>HEAD da feature não alcança mais o PDF; arquivo físico preservado localmente com 254149003 bytes; demais mudanças do histórico preservadas.</w:t>
+            </w:r>
+          </w:p>
+        </w:tc>
+      </w:tr>
+      <w:tr>
+        <w:tc>
+          <w:tcPr>
+            <w:tcW w:type="dxa" w:w="5040"/>
+          </w:tcPr>
+          <w:p>
+            <w:pPr>
+              <w:spacing w:after="0"/>
+            </w:pPr>
+            <w:r/>
+            <w:r>
+              <w:rPr>
+                <w:rFonts w:ascii="Cascadia Code" w:hAnsi="Cascadia Code"/>
+                <w:b/>
+                <w:color w:val="6A78F6"/>
+                <w:sz w:val="16"/>
+              </w:rPr>
+              <w:t>Push</w:t>
+            </w:r>
+          </w:p>
+        </w:tc>
+        <w:tc>
+          <w:tcPr>
+            <w:tcW w:type="dxa" w:w="5040"/>
+          </w:tcPr>
+          <w:p>
+            <w:pPr>
+              <w:spacing w:after="0"/>
+            </w:pPr>
+            <w:r/>
+            <w:r>
+              <w:rPr>
+                <w:rFonts w:ascii="Cascadia Code" w:hAnsi="Cascadia Code"/>
+                <w:b w:val="0"/>
+                <w:color w:val="18132E"/>
+                <w:sz w:val="16"/>
+              </w:rPr>
+              <w:t>feat/home-v4-2 enviada para origin sem --force e configurada para rastrear origin/feat/home-v4-2.</w:t>
+            </w:r>
+          </w:p>
+        </w:tc>
+      </w:tr>
+      <w:tr>
+        <w:tc>
+          <w:tcPr>
+            <w:tcW w:type="dxa" w:w="5040"/>
+          </w:tcPr>
+          <w:p>
+            <w:pPr>
+              <w:spacing w:after="0"/>
+            </w:pPr>
+            <w:r/>
+            <w:r>
+              <w:rPr>
+                <w:rFonts w:ascii="Cascadia Code" w:hAnsi="Cascadia Code"/>
+                <w:b/>
+                <w:color w:val="6A78F6"/>
+                <w:sz w:val="16"/>
+              </w:rPr>
+              <w:t>Main / deploy</w:t>
+            </w:r>
+          </w:p>
+        </w:tc>
+        <w:tc>
+          <w:tcPr>
+            <w:tcW w:type="dxa" w:w="5040"/>
+          </w:tcPr>
+          <w:p>
+            <w:pPr>
+              <w:spacing w:after="0"/>
+            </w:pPr>
+            <w:r/>
+            <w:r>
+              <w:rPr>
+                <w:rFonts w:ascii="Cascadia Code" w:hAnsi="Cascadia Code"/>
+                <w:b w:val="0"/>
+                <w:color w:val="18132E"/>
+                <w:sz w:val="16"/>
+              </w:rPr>
+              <w:t>Nenhum merge em main e nenhum deploy foram realizados.</w:t>
+            </w:r>
+          </w:p>
+        </w:tc>
+      </w:tr>
+    </w:tbl>
+    <w:p>
+      <w:pPr>
+        <w:pStyle w:val="Heading1"/>
+      </w:pPr>
+      <w:r>
+        <w:t>21. COMMITS CANÔNICOS APÓS REWRITE</w:t>
+      </w:r>
+    </w:p>
+    <w:p>
+      <w:pPr>
+        <w:spacing w:after="60"/>
+      </w:pPr>
+      <w:r>
+        <w:rPr>
+          <w:rFonts w:ascii="Cascadia Code" w:hAnsi="Cascadia Code"/>
+          <w:b/>
+          <w:color w:val="AF66F9"/>
+          <w:sz w:val="18"/>
+        </w:rPr>
+        <w:t xml:space="preserve">65b245e  </w:t>
+      </w:r>
+      <w:r>
+        <w:rPr>
+          <w:rFonts w:ascii="Cascadia Code" w:hAnsi="Cascadia Code"/>
+          <w:color w:val="18132E"/>
+          <w:sz w:val="18"/>
+        </w:rPr>
+        <w:t>docs: add brand docs and agent instructions</w:t>
+      </w:r>
+    </w:p>
+    <w:p>
+      <w:pPr>
+        <w:spacing w:after="60"/>
+      </w:pPr>
+      <w:r>
+        <w:rPr>
+          <w:rFonts w:ascii="Cascadia Code" w:hAnsi="Cascadia Code"/>
+          <w:b/>
+          <w:color w:val="AF66F9"/>
+          <w:sz w:val="18"/>
+        </w:rPr>
+        <w:t xml:space="preserve">ee3ae50  </w:t>
+      </w:r>
+      <w:r>
+        <w:rPr>
+          <w:rFonts w:ascii="Cascadia Code" w:hAnsi="Cascadia Code"/>
+          <w:color w:val="18132E"/>
+          <w:sz w:val="18"/>
+        </w:rPr>
+        <w:t>feat: establish site v2 foundation and global shell</w:t>
+      </w:r>
+    </w:p>
+    <w:p>
+      <w:pPr>
+        <w:spacing w:after="60"/>
+      </w:pPr>
+      <w:r>
+        <w:rPr>
+          <w:rFonts w:ascii="Cascadia Code" w:hAnsi="Cascadia Code"/>
+          <w:b/>
+          <w:color w:val="AF66F9"/>
+          <w:sz w:val="18"/>
+        </w:rPr>
+        <w:t xml:space="preserve">a14dab5  </w:t>
+      </w:r>
+      <w:r>
+        <w:rPr>
+          <w:rFonts w:ascii="Cascadia Code" w:hAnsi="Cascadia Code"/>
+          <w:color w:val="18132E"/>
+          <w:sz w:val="18"/>
+        </w:rPr>
+        <w:t>feat: rebuild home and diagnostic entry experience</w:t>
+      </w:r>
+    </w:p>
+    <w:p>
+      <w:pPr>
+        <w:spacing w:after="60"/>
+      </w:pPr>
+      <w:r>
+        <w:rPr>
+          <w:rFonts w:ascii="Cascadia Code" w:hAnsi="Cascadia Code"/>
+          <w:b/>
+          <w:color w:val="AF66F9"/>
+          <w:sz w:val="18"/>
+        </w:rPr>
+        <w:t xml:space="preserve">355ff73  </w:t>
+      </w:r>
+      <w:r>
+        <w:rPr>
+          <w:rFonts w:ascii="Cascadia Code" w:hAnsi="Cascadia Code"/>
+          <w:color w:val="18132E"/>
+          <w:sz w:val="18"/>
+        </w:rPr>
+        <w:t>fix: add identifiers to estimator form fields</w:t>
+      </w:r>
+    </w:p>
+    <w:p>
+      <w:pPr>
+        <w:spacing w:after="60"/>
+      </w:pPr>
+      <w:r>
+        <w:rPr>
+          <w:rFonts w:ascii="Cascadia Code" w:hAnsi="Cascadia Code"/>
+          <w:b/>
+          <w:color w:val="AF66F9"/>
+          <w:sz w:val="18"/>
+        </w:rPr>
+        <w:t xml:space="preserve">0150611  </w:t>
+      </w:r>
+      <w:r>
+        <w:rPr>
+          <w:rFonts w:ascii="Cascadia Code" w:hAnsi="Cascadia Code"/>
+          <w:color w:val="18132E"/>
+          <w:sz w:val="18"/>
+        </w:rPr>
+        <w:t>feat: add diagnostic v2 technical foundation</w:t>
+      </w:r>
+    </w:p>
+    <w:p>
+      <w:pPr>
+        <w:spacing w:after="60"/>
+      </w:pPr>
+      <w:r>
+        <w:rPr>
+          <w:rFonts w:ascii="Cascadia Code" w:hAnsi="Cascadia Code"/>
+          <w:b/>
+          <w:color w:val="AF66F9"/>
+          <w:sz w:val="18"/>
+        </w:rPr>
+        <w:t xml:space="preserve">a2b0f74  </w:t>
+      </w:r>
+      <w:r>
+        <w:rPr>
+          <w:rFonts w:ascii="Cascadia Code" w:hAnsi="Cascadia Code"/>
+          <w:color w:val="18132E"/>
+          <w:sz w:val="18"/>
+        </w:rPr>
+        <w:t>feat: implement diagnostic v2 experience</w:t>
+      </w:r>
+    </w:p>
+    <w:p>
+      <w:pPr>
+        <w:spacing w:after="60"/>
+      </w:pPr>
+      <w:r>
+        <w:rPr>
+          <w:rFonts w:ascii="Cascadia Code" w:hAnsi="Cascadia Code"/>
+          <w:b/>
+          <w:color w:val="AF66F9"/>
+          <w:sz w:val="18"/>
+        </w:rPr>
+        <w:t xml:space="preserve">0dcb283  </w:t>
+      </w:r>
+      <w:r>
+        <w:rPr>
+          <w:rFonts w:ascii="Cascadia Code" w:hAnsi="Cascadia Code"/>
+          <w:color w:val="18132E"/>
+          <w:sz w:val="18"/>
+        </w:rPr>
+        <w:t>feat: finalize home v6g experience</w:t>
+      </w:r>
+    </w:p>
+    <w:p>
+      <w:pPr>
+        <w:spacing w:after="60"/>
+      </w:pPr>
+      <w:r>
+        <w:rPr>
+          <w:rFonts w:ascii="Cascadia Code" w:hAnsi="Cascadia Code"/>
+          <w:b/>
+          <w:color w:val="AF66F9"/>
+          <w:sz w:val="18"/>
+        </w:rPr>
+        <w:t xml:space="preserve">bd2530c  </w:t>
+      </w:r>
+      <w:r>
+        <w:rPr>
+          <w:rFonts w:ascii="Cascadia Code" w:hAnsi="Cascadia Code"/>
+          <w:color w:val="18132E"/>
+          <w:sz w:val="18"/>
+        </w:rPr>
+        <w:t>docs: record home v6g development milestone</w:t>
+      </w:r>
+    </w:p>
+    <w:p>
+      <w:pPr>
+        <w:pStyle w:val="Heading1"/>
+      </w:pPr>
+      <w:r>
+        <w:t>22. APRENDIZADOS REUTILIZÁVEIS</w:t>
+      </w:r>
+    </w:p>
+    <w:p>
+      <w:pPr>
+        <w:ind w:left="317" w:hanging="173"/>
+      </w:pPr>
+      <w:r>
+        <w:rPr>
+          <w:rFonts w:ascii="Cascadia Code" w:hAnsi="Cascadia Code"/>
+          <w:color w:val="18132E"/>
+          <w:sz w:val="18"/>
+        </w:rPr>
+        <w:t>• Antes de adicionar binários grandes ao Git, verificar tamanho e estratégia de armazenamento.</w:t>
+      </w:r>
+    </w:p>
+    <w:p>
+      <w:pPr>
+        <w:ind w:left="317" w:hanging="173"/>
+      </w:pPr>
+      <w:r>
+        <w:rPr>
+          <w:rFonts w:ascii="Cascadia Code" w:hAnsi="Cascadia Code"/>
+          <w:color w:val="18132E"/>
+          <w:sz w:val="18"/>
+        </w:rPr>
+        <w:t>• Um arquivo oficial pode ser fonte de verdade sem precisar estar no Git comum; o importante é registrar onde ele vive e por que foi excluído.</w:t>
+      </w:r>
+    </w:p>
+    <w:p>
+      <w:pPr>
+        <w:ind w:left="317" w:hanging="173"/>
+      </w:pPr>
+      <w:r>
+        <w:rPr>
+          <w:rFonts w:ascii="Cascadia Code" w:hAnsi="Cascadia Code"/>
+          <w:color w:val="18132E"/>
+          <w:sz w:val="18"/>
+        </w:rPr>
+        <w:t>• Reescrever histórico é aceitável antes do primeiro push quando há backup, escopo controlado e validação de equivalência de conteúdo.</w:t>
+      </w:r>
+    </w:p>
+    <w:p>
+      <w:pPr>
+        <w:ind w:left="317" w:hanging="173"/>
+      </w:pPr>
+      <w:r>
+        <w:rPr>
+          <w:rFonts w:ascii="Cascadia Code" w:hAnsi="Cascadia Code"/>
+          <w:color w:val="18132E"/>
+          <w:sz w:val="18"/>
+        </w:rPr>
+        <w:t>• Depois de rebase/rewrite, hashes antigos deixam de ser referências canônicas e a documentação deve ser atualizada.</w:t>
+      </w:r>
+    </w:p>
+    <w:p>
+      <w:pPr>
+        <w:ind w:left="317" w:hanging="173"/>
+      </w:pPr>
+      <w:r>
+        <w:rPr>
+          <w:rFonts w:ascii="Cascadia Code" w:hAnsi="Cascadia Code"/>
+          <w:color w:val="18132E"/>
+          <w:sz w:val="18"/>
+        </w:rPr>
+        <w:t>• Push de feature não é merge nem deploy: serve também como checkpoint remoto e rastreabilidade.</w:t>
+      </w:r>
+    </w:p>
+    <w:p>
+      <w:pPr>
+        <w:ind w:left="317" w:hanging="173"/>
+      </w:pPr>
+      <w:r>
+        <w:rPr>
+          <w:rFonts w:ascii="Cascadia Code" w:hAnsi="Cascadia Code"/>
+          <w:color w:val="18132E"/>
+          <w:sz w:val="18"/>
+        </w:rPr>
+        <w:t>• Problemas de preview/deploy devem ser separados de regressões de código. O 500 Nitro/Cloudflare observado em vite preview ficou registrado para investigação futura do ambiente.</w:t>
+      </w:r>
+    </w:p>
+    <w:p>
+      <w:pPr>
+        <w:pStyle w:val="Heading1"/>
+      </w:pPr>
+      <w:r>
+        <w:t>23. PRÓXIMO MARCO</w:t>
+      </w:r>
+    </w:p>
+    <w:tbl>
+      <w:tblPr>
+        <w:tblW w:type="auto" w:w="0"/>
+        <w:jc w:val="left"/>
+        <w:tblLook w:firstColumn="1" w:firstRow="1" w:lastColumn="0" w:lastRow="0" w:noHBand="0" w:noVBand="1" w:val="04A0"/>
+      </w:tblPr>
+      <w:tblGrid>
+        <w:gridCol w:w="5040"/>
+        <w:gridCol w:w="5040"/>
+      </w:tblGrid>
+      <w:tr>
+        <w:tc>
+          <w:tcPr>
+            <w:tcW w:type="dxa" w:w="5040"/>
+            <w:shd w:fill="FFF3F8"/>
+          </w:tcPr>
+          <w:p>
+            <w:pPr>
+              <w:spacing w:after="0"/>
+            </w:pPr>
+            <w:r/>
+            <w:r>
+              <w:rPr>
+                <w:rFonts w:ascii="Cascadia Code" w:hAnsi="Cascadia Code"/>
+                <w:b/>
+                <w:color w:val="AF66F9"/>
+                <w:sz w:val="16"/>
+              </w:rPr>
+              <w:t>PRÓXIMO</w:t>
+            </w:r>
+          </w:p>
+        </w:tc>
+        <w:tc>
+          <w:tcPr>
+            <w:tcW w:type="dxa" w:w="5040"/>
+            <w:shd w:fill="FFF3F8"/>
+          </w:tcPr>
+          <w:p>
+            <w:pPr>
+              <w:spacing w:after="0"/>
+            </w:pPr>
+            <w:r/>
+            <w:r>
+              <w:rPr>
+                <w:rFonts w:ascii="Cascadia Code" w:hAnsi="Cascadia Code"/>
+                <w:b w:val="0"/>
+                <w:color w:val="18132E"/>
+                <w:sz w:val="17"/>
+              </w:rPr>
+              <w:t>Auditar as rotas existentes diretamente no código e classificar cada uma em: manter/finalizar, fundir, redirecionar, ocultar, interna ou remover do escopo de lançamento.</w:t>
+            </w:r>
+          </w:p>
+        </w:tc>
+      </w:tr>
+    </w:tbl>
     <w:sectPr>
       <w:footerReference w:type="default" r:id="rId9"/>
       <w:pgSz w:w="12240" w:h="15840"/>

</xml_diff>

<commit_message>
docs: record contact and solutions milestones
Co-authored-by: Cursor <cursoragent@cursor.com>
</commit_message>
<xml_diff>
--- a/docs/DREAMSCRAFT_SITE_REGISTRO_DESENVOLVIMENTO.docx
+++ b/docs/DREAMSCRAFT_SITE_REGISTRO_DESENVOLVIMENTO.docx
@@ -48,10 +48,11 @@
       <w:r>
         <w:rPr>
           <w:rFonts w:ascii="Cascadia Code" w:hAnsi="Cascadia Code"/>
+          <w:b w:val="0"/>
           <w:color w:val="625B72"/>
           <w:sz w:val="18"/>
         </w:rPr>
-        <w:t>Versão 1.2  ·  16/09/2026</w:t>
+        <w:t>Versão 1.3  ·  22/09/2026</w:t>
       </w:r>
     </w:p>
     <w:tbl>
@@ -1861,11 +1862,6 @@
       </w:r>
     </w:p>
     <w:p>
-      <w:r>
-        <w:br w:type="page"/>
-      </w:r>
-    </w:p>
-    <w:p>
       <w:pPr>
         <w:pStyle w:val="Heading1"/>
       </w:pPr>
@@ -2539,10 +2535,10 @@
               <w:rPr>
                 <w:rFonts w:ascii="Cascadia Code" w:hAnsi="Cascadia Code"/>
                 <w:b/>
-                <w:color w:val="AF66F9"/>
+                <w:color w:val="6A78F6"/>
                 <w:sz w:val="16"/>
               </w:rPr>
-              <w:t>PRÓXIMO</w:t>
+              <w:t>CONCLUÍDO</w:t>
             </w:r>
           </w:p>
         </w:tc>
@@ -2570,7 +2566,7 @@
                 <w:color w:val="18132E"/>
                 <w:sz w:val="17"/>
               </w:rPr>
-              <w:t>Auditoria de rotas: manter, finalizar, fundir, redirecionar, ocultar ou tratar como interna.</w:t>
+              <w:t>Auditoria inicial de rotas concluída; escopo público de lançamento reduzido e priorizado.</w:t>
             </w:r>
           </w:p>
         </w:tc>
@@ -2604,14 +2600,15 @@
             <w:pPr>
               <w:spacing w:after="0"/>
             </w:pPr>
+            <w:r/>
             <w:r>
               <w:rPr>
                 <w:rFonts w:ascii="Cascadia Code" w:hAnsi="Cascadia Code"/>
                 <w:b/>
-                <w:color w:val="21104E"/>
+                <w:color w:val="AF66F9"/>
                 <w:sz w:val="16"/>
               </w:rPr>
-              <w:t>PLANEJADO</w:t>
+              <w:t>EM EXECUÇÃO</w:t>
             </w:r>
           </w:p>
         </w:tc>
@@ -2631,13 +2628,15 @@
             <w:pPr>
               <w:spacing w:after="0"/>
             </w:pPr>
+            <w:r/>
             <w:r>
               <w:rPr>
                 <w:rFonts w:ascii="Cascadia Code" w:hAnsi="Cascadia Code"/>
+                <w:b w:val="0"/>
                 <w:color w:val="18132E"/>
                 <w:sz w:val="17"/>
               </w:rPr>
-              <w:t>Finalizar shell global e páginas necessárias para lançamento.</w:t>
+              <w:t>Páginas públicas essenciais sendo finalizadas na branch feat/site-launch-core.</w:t>
             </w:r>
           </w:p>
         </w:tc>
@@ -4411,7 +4410,825 @@
                 <w:color w:val="18132E"/>
                 <w:sz w:val="17"/>
               </w:rPr>
-              <w:t>Auditar as rotas existentes diretamente no código e classificar cada uma em: manter/finalizar, fundir, redirecionar, ocultar, interna ou remover do escopo de lançamento.</w:t>
+              <w:t>Finalizar Projetos/Portfolio com evidências reais; preparar CatCare como protagonista e só depois fazer a troca OURLEADS → CatCare na Home.</w:t>
+            </w:r>
+          </w:p>
+        </w:tc>
+      </w:tr>
+    </w:tbl>
+    <w:p>
+      <w:r>
+        <w:br w:type="page"/>
+      </w:r>
+    </w:p>
+    <w:p>
+      <w:pPr>
+        <w:pStyle w:val="Heading1"/>
+      </w:pPr>
+      <w:r>
+        <w:t>24. 22/09/2026 · MARCO — CONTATO + SOLUÇÕES + CTA CONTEXTUAL</w:t>
+      </w:r>
+    </w:p>
+    <w:tbl>
+      <w:tblPr>
+        <w:tblW w:type="auto" w:w="0"/>
+        <w:jc w:val="left"/>
+        <w:tblLook w:firstColumn="1" w:firstRow="1" w:lastColumn="0" w:lastRow="0" w:noHBand="0" w:noVBand="1" w:val="04A0"/>
+      </w:tblPr>
+      <w:tblGrid>
+        <w:gridCol w:w="5040"/>
+        <w:gridCol w:w="5040"/>
+      </w:tblGrid>
+      <w:tr>
+        <w:tc>
+          <w:tcPr>
+            <w:tcW w:type="dxa" w:w="5040"/>
+            <w:shd w:fill="F1F3FF"/>
+          </w:tcPr>
+          <w:p>
+            <w:pPr>
+              <w:spacing w:after="0"/>
+            </w:pPr>
+            <w:r/>
+            <w:r>
+              <w:rPr>
+                <w:rFonts w:ascii="Cascadia Code" w:hAnsi="Cascadia Code"/>
+                <w:b/>
+                <w:color w:val="6A78F6"/>
+                <w:sz w:val="16"/>
+              </w:rPr>
+              <w:t>MARCO</w:t>
+            </w:r>
+          </w:p>
+        </w:tc>
+        <w:tc>
+          <w:tcPr>
+            <w:tcW w:type="dxa" w:w="5040"/>
+            <w:shd w:fill="F1F3FF"/>
+          </w:tcPr>
+          <w:p>
+            <w:pPr>
+              <w:spacing w:after="0"/>
+            </w:pPr>
+            <w:r/>
+            <w:r>
+              <w:rPr>
+                <w:rFonts w:ascii="Cascadia Code" w:hAnsi="Cascadia Code"/>
+                <w:b w:val="0"/>
+                <w:color w:val="18132E"/>
+                <w:sz w:val="17"/>
+              </w:rPr>
+              <w:t>Primeiro bloco de páginas internas da fase de lançamento fechado na branch feat/site-launch-core, com Contato e Soluções aprovados e versionados.</w:t>
+            </w:r>
+          </w:p>
+        </w:tc>
+      </w:tr>
+    </w:tbl>
+    <w:tbl>
+      <w:tblPr>
+        <w:tblW w:type="auto" w:w="0"/>
+        <w:jc w:val="center"/>
+        <w:tblLook w:firstColumn="1" w:firstRow="1" w:lastColumn="0" w:lastRow="0" w:noHBand="0" w:noVBand="1" w:val="04A0"/>
+      </w:tblPr>
+      <w:tblGrid>
+        <w:gridCol w:w="5040"/>
+        <w:gridCol w:w="5040"/>
+      </w:tblGrid>
+      <w:tr>
+        <w:tc>
+          <w:tcPr>
+            <w:tcW w:type="dxa" w:w="5040"/>
+            <w:shd w:fill="21104E"/>
+          </w:tcPr>
+          <w:p>
+            <w:pPr>
+              <w:spacing w:after="0"/>
+            </w:pPr>
+            <w:r/>
+            <w:r>
+              <w:rPr>
+                <w:rFonts w:ascii="Cascadia Code" w:hAnsi="Cascadia Code"/>
+                <w:b/>
+                <w:color w:val="EFE5FD"/>
+                <w:sz w:val="16"/>
+              </w:rPr>
+              <w:t>ITEM</w:t>
+            </w:r>
+          </w:p>
+        </w:tc>
+        <w:tc>
+          <w:tcPr>
+            <w:tcW w:type="dxa" w:w="5040"/>
+            <w:shd w:fill="21104E"/>
+          </w:tcPr>
+          <w:p>
+            <w:pPr>
+              <w:spacing w:after="0"/>
+            </w:pPr>
+            <w:r/>
+            <w:r>
+              <w:rPr>
+                <w:rFonts w:ascii="Cascadia Code" w:hAnsi="Cascadia Code"/>
+                <w:b/>
+                <w:color w:val="EFE5FD"/>
+                <w:sz w:val="16"/>
+              </w:rPr>
+              <w:t>REGISTRO</w:t>
+            </w:r>
+          </w:p>
+        </w:tc>
+      </w:tr>
+      <w:tr>
+        <w:tc>
+          <w:tcPr>
+            <w:tcW w:type="dxa" w:w="5040"/>
+          </w:tcPr>
+          <w:p>
+            <w:pPr>
+              <w:spacing w:after="0"/>
+            </w:pPr>
+            <w:r/>
+            <w:r>
+              <w:rPr>
+                <w:rFonts w:ascii="Cascadia Code" w:hAnsi="Cascadia Code"/>
+                <w:b/>
+                <w:color w:val="6A78F6"/>
+                <w:sz w:val="16"/>
+              </w:rPr>
+              <w:t>Branch</w:t>
+            </w:r>
+          </w:p>
+        </w:tc>
+        <w:tc>
+          <w:tcPr>
+            <w:tcW w:type="dxa" w:w="5040"/>
+          </w:tcPr>
+          <w:p>
+            <w:pPr>
+              <w:spacing w:after="0"/>
+            </w:pPr>
+            <w:r/>
+            <w:r>
+              <w:rPr>
+                <w:rFonts w:ascii="Cascadia Code" w:hAnsi="Cascadia Code"/>
+                <w:b w:val="0"/>
+                <w:color w:val="18132E"/>
+                <w:sz w:val="16"/>
+              </w:rPr>
+              <w:t>feat/site-launch-core, derivada do checkpoint aprovado da Home.</w:t>
+            </w:r>
+          </w:p>
+        </w:tc>
+      </w:tr>
+      <w:tr>
+        <w:tc>
+          <w:tcPr>
+            <w:tcW w:type="dxa" w:w="5040"/>
+          </w:tcPr>
+          <w:p>
+            <w:pPr>
+              <w:spacing w:after="0"/>
+            </w:pPr>
+            <w:r/>
+            <w:r>
+              <w:rPr>
+                <w:rFonts w:ascii="Cascadia Code" w:hAnsi="Cascadia Code"/>
+                <w:b/>
+                <w:color w:val="6A78F6"/>
+                <w:sz w:val="16"/>
+              </w:rPr>
+              <w:t>Contato</w:t>
+            </w:r>
+          </w:p>
+        </w:tc>
+        <w:tc>
+          <w:tcPr>
+            <w:tcW w:type="dxa" w:w="5040"/>
+          </w:tcPr>
+          <w:p>
+            <w:pPr>
+              <w:spacing w:after="0"/>
+            </w:pPr>
+            <w:r/>
+            <w:r>
+              <w:rPr>
+                <w:rFonts w:ascii="Cascadia Code" w:hAnsi="Cascadia Code"/>
+                <w:b w:val="0"/>
+                <w:color w:val="18132E"/>
+                <w:sz w:val="16"/>
+              </w:rPr>
+              <w:t>V2.2 aprovada e versionada no commit 88ea608 — feat: finalize contact experience.</w:t>
+            </w:r>
+          </w:p>
+        </w:tc>
+      </w:tr>
+      <w:tr>
+        <w:tc>
+          <w:tcPr>
+            <w:tcW w:type="dxa" w:w="5040"/>
+          </w:tcPr>
+          <w:p>
+            <w:pPr>
+              <w:spacing w:after="0"/>
+            </w:pPr>
+            <w:r/>
+            <w:r>
+              <w:rPr>
+                <w:rFonts w:ascii="Cascadia Code" w:hAnsi="Cascadia Code"/>
+                <w:b/>
+                <w:color w:val="6A78F6"/>
+                <w:sz w:val="16"/>
+              </w:rPr>
+              <w:t>Soluções</w:t>
+            </w:r>
+          </w:p>
+        </w:tc>
+        <w:tc>
+          <w:tcPr>
+            <w:tcW w:type="dxa" w:w="5040"/>
+          </w:tcPr>
+          <w:p>
+            <w:pPr>
+              <w:spacing w:after="0"/>
+            </w:pPr>
+            <w:r/>
+            <w:r>
+              <w:rPr>
+                <w:rFonts w:ascii="Cascadia Code" w:hAnsi="Cascadia Code"/>
+                <w:b w:val="0"/>
+                <w:color w:val="18132E"/>
+                <w:sz w:val="16"/>
+              </w:rPr>
+              <w:t>V2 aprovada e versionada no commit b4bc65d — feat: finalize solutions experience.</w:t>
+            </w:r>
+          </w:p>
+        </w:tc>
+      </w:tr>
+      <w:tr>
+        <w:tc>
+          <w:tcPr>
+            <w:tcW w:type="dxa" w:w="5040"/>
+          </w:tcPr>
+          <w:p>
+            <w:pPr>
+              <w:spacing w:after="0"/>
+            </w:pPr>
+            <w:r/>
+            <w:r>
+              <w:rPr>
+                <w:rFonts w:ascii="Cascadia Code" w:hAnsi="Cascadia Code"/>
+                <w:b/>
+                <w:color w:val="6A78F6"/>
+                <w:sz w:val="16"/>
+              </w:rPr>
+              <w:t>Header CTA</w:t>
+            </w:r>
+          </w:p>
+        </w:tc>
+        <w:tc>
+          <w:tcPr>
+            <w:tcW w:type="dxa" w:w="5040"/>
+          </w:tcPr>
+          <w:p>
+            <w:pPr>
+              <w:spacing w:after="0"/>
+            </w:pPr>
+            <w:r/>
+            <w:r>
+              <w:rPr>
+                <w:rFonts w:ascii="Cascadia Code" w:hAnsi="Cascadia Code"/>
+                <w:b w:val="0"/>
+                <w:color w:val="18132E"/>
+                <w:sz w:val="16"/>
+              </w:rPr>
+              <w:t>“Solicitar diagnóstico” do header agora é ocultado em /estimar, /contato e /solucoes quando a própria rota já contém CTA local equivalente.</w:t>
+            </w:r>
+          </w:p>
+        </w:tc>
+      </w:tr>
+      <w:tr>
+        <w:tc>
+          <w:tcPr>
+            <w:tcW w:type="dxa" w:w="5040"/>
+          </w:tcPr>
+          <w:p>
+            <w:pPr>
+              <w:spacing w:after="0"/>
+            </w:pPr>
+            <w:r/>
+            <w:r>
+              <w:rPr>
+                <w:rFonts w:ascii="Cascadia Code" w:hAnsi="Cascadia Code"/>
+                <w:b/>
+                <w:color w:val="6A78F6"/>
+                <w:sz w:val="16"/>
+              </w:rPr>
+              <w:t>Estado remoto</w:t>
+            </w:r>
+          </w:p>
+        </w:tc>
+        <w:tc>
+          <w:tcPr>
+            <w:tcW w:type="dxa" w:w="5040"/>
+          </w:tcPr>
+          <w:p>
+            <w:pPr>
+              <w:spacing w:after="0"/>
+            </w:pPr>
+            <w:r/>
+            <w:r>
+              <w:rPr>
+                <w:rFonts w:ascii="Cascadia Code" w:hAnsi="Cascadia Code"/>
+                <w:b w:val="0"/>
+                <w:color w:val="18132E"/>
+                <w:sz w:val="16"/>
+              </w:rPr>
+              <w:t>Push concluído para origin/feat/site-launch-core; sem force, sem merge em main e sem deploy.</w:t>
+            </w:r>
+          </w:p>
+        </w:tc>
+      </w:tr>
+      <w:tr>
+        <w:tc>
+          <w:tcPr>
+            <w:tcW w:type="dxa" w:w="5040"/>
+          </w:tcPr>
+          <w:p>
+            <w:pPr>
+              <w:spacing w:after="0"/>
+            </w:pPr>
+            <w:r/>
+            <w:r>
+              <w:rPr>
+                <w:rFonts w:ascii="Cascadia Code" w:hAnsi="Cascadia Code"/>
+                <w:b/>
+                <w:color w:val="6A78F6"/>
+                <w:sz w:val="16"/>
+              </w:rPr>
+              <w:t>QA</w:t>
+            </w:r>
+          </w:p>
+        </w:tc>
+        <w:tc>
+          <w:tcPr>
+            <w:tcW w:type="dxa" w:w="5040"/>
+          </w:tcPr>
+          <w:p>
+            <w:pPr>
+              <w:spacing w:after="0"/>
+            </w:pPr>
+            <w:r/>
+            <w:r>
+              <w:rPr>
+                <w:rFonts w:ascii="Cascadia Code" w:hAnsi="Cascadia Code"/>
+                <w:b w:val="0"/>
+                <w:color w:val="18132E"/>
+                <w:sz w:val="16"/>
+              </w:rPr>
+              <w:t>Relatórios finais: test 43/43, TypeScript OK, build OK, diff-check OK, sem overflow e sem pageerror fatal nas rotas revisadas.</w:t>
+            </w:r>
+          </w:p>
+        </w:tc>
+      </w:tr>
+    </w:tbl>
+    <w:p>
+      <w:pPr>
+        <w:pStyle w:val="Heading1"/>
+      </w:pPr>
+      <w:r>
+        <w:t>25. CONTATO — DECISÕES CONSOLIDADAS</w:t>
+      </w:r>
+    </w:p>
+    <w:p>
+      <w:pPr>
+        <w:ind w:left="317" w:hanging="173"/>
+      </w:pPr>
+      <w:r>
+        <w:rPr>
+          <w:rFonts w:ascii="Cascadia Code" w:hAnsi="Cascadia Code"/>
+          <w:b w:val="0"/>
+          <w:color w:val="18132E"/>
+          <w:sz w:val="18"/>
+        </w:rPr>
+        <w:t>• Fluxo visual final: hero editorial → orientação 01/02 → ponte 03 “Escrever o contexto” → grande superfície lavanda com formulário + canais + próximos passos → footer.</w:t>
+      </w:r>
+    </w:p>
+    <w:p>
+      <w:pPr>
+        <w:ind w:left="317" w:hanging="173"/>
+      </w:pPr>
+      <w:r>
+        <w:rPr>
+          <w:rFonts w:ascii="Cascadia Code" w:hAnsi="Cascadia Code"/>
+          <w:b w:val="0"/>
+          <w:color w:val="18132E"/>
+          <w:sz w:val="18"/>
+        </w:rPr>
+        <w:t>• Bug real corrigido: o valor landing passou a ser aceito pelo schema e o select foi substituído por componente visual coerente com a identidade.</w:t>
+      </w:r>
+    </w:p>
+    <w:p>
+      <w:pPr>
+        <w:ind w:left="317" w:hanging="173"/>
+      </w:pPr>
+      <w:r>
+        <w:rPr>
+          <w:rFonts w:ascii="Cascadia Code" w:hAnsi="Cascadia Code"/>
+          <w:b w:val="0"/>
+          <w:color w:val="18132E"/>
+          <w:sz w:val="18"/>
+        </w:rPr>
+        <w:t>• Removidos claims sem sustentação, como prazo de resposta em 1 dia útil, além de links falsos de LinkedIn/localização.</w:t>
+      </w:r>
+    </w:p>
+    <w:p>
+      <w:pPr>
+        <w:ind w:left="317" w:hanging="173"/>
+      </w:pPr>
+      <w:r>
+        <w:rPr>
+          <w:rFonts w:ascii="Cascadia Code" w:hAnsi="Cascadia Code"/>
+          <w:b w:val="0"/>
+          <w:color w:val="18132E"/>
+          <w:sz w:val="18"/>
+        </w:rPr>
+        <w:t>• WhatsApp e diagnóstico foram desduplicados: a rota mantém um CTA de diagnóstico no hero, um CTA de WhatsApp no hero e links textuais nos canais diretos.</w:t>
+      </w:r>
+    </w:p>
+    <w:p>
+      <w:pPr>
+        <w:ind w:left="317" w:hanging="173"/>
+      </w:pPr>
+      <w:r>
+        <w:rPr>
+          <w:rFonts w:ascii="Cascadia Code" w:hAnsi="Cascadia Code"/>
+          <w:b w:val="0"/>
+          <w:color w:val="18132E"/>
+          <w:sz w:val="18"/>
+        </w:rPr>
+        <w:t>• Motion segue ENTRY → SETTLE → HOLD; rail 01→02 e entrada do painel são os gestos principais. Nada de CodeRain, typewriter ou efeitos por caractere.</w:t>
+      </w:r>
+    </w:p>
+    <w:p>
+      <w:pPr>
+        <w:pStyle w:val="Heading1"/>
+      </w:pPr>
+      <w:r>
+        <w:t>26. SOLUÇÕES — DECISÕES CONSOLIDADAS</w:t>
+      </w:r>
+    </w:p>
+    <w:p>
+      <w:pPr>
+        <w:ind w:left="317" w:hanging="173"/>
+      </w:pPr>
+      <w:r>
+        <w:rPr>
+          <w:rFonts w:ascii="Cascadia Code" w:hAnsi="Cascadia Code"/>
+          <w:b w:val="0"/>
+          <w:color w:val="18132E"/>
+          <w:sz w:val="18"/>
+        </w:rPr>
+        <w:t>• A página deixou de ser catálogo por tecnologia e passou a começar pela mudança necessária no negócio.</w:t>
+      </w:r>
+    </w:p>
+    <w:p>
+      <w:pPr>
+        <w:ind w:left="317" w:hanging="173"/>
+      </w:pPr>
+      <w:r>
+        <w:rPr>
+          <w:rFonts w:ascii="Cascadia Code" w:hAnsi="Cascadia Code"/>
+          <w:b w:val="0"/>
+          <w:color w:val="18132E"/>
+          <w:sz w:val="18"/>
+        </w:rPr>
+        <w:t>• Quatro caminhos atuais: 01 Automação e atendimento; 02 Sistema sob medida; 03 Produtos digitais; 04 Sites institucionais.</w:t>
+      </w:r>
+    </w:p>
+    <w:p>
+      <w:pPr>
+        <w:ind w:left="317" w:hanging="173"/>
+      </w:pPr>
+      <w:r>
+        <w:rPr>
+          <w:rFonts w:ascii="Cascadia Code" w:hAnsi="Cascadia Code"/>
+          <w:b w:val="0"/>
+          <w:color w:val="18132E"/>
+          <w:sz w:val="18"/>
+        </w:rPr>
+        <w:t>• Foram removidos da rota: CodeRain, uso excessivo de //, glass cards, EditorWindow, ROI calculator, modelos comerciais públicos, FAQ antiga com claims e preços/prazos não validados.</w:t>
+      </w:r>
+    </w:p>
+    <w:p>
+      <w:pPr>
+        <w:ind w:left="317" w:hanging="173"/>
+      </w:pPr>
+      <w:r>
+        <w:rPr>
+          <w:rFonts w:ascii="Cascadia Code" w:hAnsi="Cascadia Code"/>
+          <w:b w:val="0"/>
+          <w:color w:val="18132E"/>
+          <w:sz w:val="18"/>
+        </w:rPr>
+        <w:t>• Direção visual: sequência editorial vertical com rail progressivo 01→04; superfícies escuras e lavanda alternadas com intenção, sem virar grade de cards.</w:t>
+      </w:r>
+    </w:p>
+    <w:p>
+      <w:pPr>
+        <w:ind w:left="317" w:hanging="173"/>
+      </w:pPr>
+      <w:r>
+        <w:rPr>
+          <w:rFonts w:ascii="Cascadia Code" w:hAnsi="Cascadia Code"/>
+          <w:b w:val="0"/>
+          <w:color w:val="18132E"/>
+          <w:sz w:val="18"/>
+        </w:rPr>
+        <w:t>• Regra tipográfica reforçada: quebra de linha é decisão de composição, não consequência de max-width estreito. Headlines internas não devem virar “torres” de palavras.</w:t>
+      </w:r>
+    </w:p>
+    <w:p>
+      <w:pPr>
+        <w:ind w:left="317" w:hanging="173"/>
+      </w:pPr>
+      <w:r>
+        <w:rPr>
+          <w:rFonts w:ascii="Cascadia Code" w:hAnsi="Cascadia Code"/>
+          <w:b w:val="0"/>
+          <w:color w:val="18132E"/>
+          <w:sz w:val="18"/>
+        </w:rPr>
+        <w:t>• Fechamento final deixou de ser uma segunda hero e virou conclusão editorial horizontal: “O problema vem antes da solução.” + suporte + CTA para /estimar.</w:t>
+      </w:r>
+    </w:p>
+    <w:p>
+      <w:pPr>
+        <w:pStyle w:val="Heading1"/>
+      </w:pPr>
+      <w:r>
+        <w:t>27. REGRA GLOBAL — CTA DE DIAGNÓSTICO NO HEADER</w:t>
+      </w:r>
+    </w:p>
+    <w:tbl>
+      <w:tblPr>
+        <w:tblW w:type="auto" w:w="0"/>
+        <w:jc w:val="left"/>
+        <w:tblLook w:firstColumn="1" w:firstRow="1" w:lastColumn="0" w:lastRow="0" w:noHBand="0" w:noVBand="1" w:val="04A0"/>
+      </w:tblPr>
+      <w:tblGrid>
+        <w:gridCol w:w="5040"/>
+        <w:gridCol w:w="5040"/>
+      </w:tblGrid>
+      <w:tr>
+        <w:tc>
+          <w:tcPr>
+            <w:tcW w:type="dxa" w:w="5040"/>
+            <w:shd w:fill="EFE5FD"/>
+          </w:tcPr>
+          <w:p>
+            <w:pPr>
+              <w:spacing w:after="0"/>
+            </w:pPr>
+            <w:r/>
+            <w:r>
+              <w:rPr>
+                <w:rFonts w:ascii="Cascadia Code" w:hAnsi="Cascadia Code"/>
+                <w:b/>
+                <w:color w:val="21104E"/>
+                <w:sz w:val="16"/>
+              </w:rPr>
+              <w:t>REGRA</w:t>
+            </w:r>
+          </w:p>
+        </w:tc>
+        <w:tc>
+          <w:tcPr>
+            <w:tcW w:type="dxa" w:w="5040"/>
+            <w:shd w:fill="EFE5FD"/>
+          </w:tcPr>
+          <w:p>
+            <w:pPr>
+              <w:spacing w:after="0"/>
+            </w:pPr>
+            <w:r/>
+            <w:r>
+              <w:rPr>
+                <w:rFonts w:ascii="Cascadia Code" w:hAnsi="Cascadia Code"/>
+                <w:b w:val="0"/>
+                <w:color w:val="18132E"/>
+                <w:sz w:val="17"/>
+              </w:rPr>
+              <w:t>O CTA global “Solicitar diagnóstico” deve ser ocultado quando a rota atual já oferece a mesma ação local de forma clara. A implementação atual cobre /estimar, /contato e /solucoes em desktop e mobile.</w:t>
+            </w:r>
+          </w:p>
+        </w:tc>
+      </w:tr>
+    </w:tbl>
+    <w:p>
+      <w:pPr>
+        <w:ind w:left="317" w:hanging="173"/>
+      </w:pPr>
+      <w:r>
+        <w:rPr>
+          <w:rFonts w:ascii="Cascadia Code" w:hAnsi="Cascadia Code"/>
+          <w:b w:val="0"/>
+          <w:color w:val="18132E"/>
+          <w:sz w:val="18"/>
+        </w:rPr>
+        <w:t>• A Home mantém o CTA global porque seu fluxo local é “Analisar cenário”, uma entrada contextual diferente do CTA literal do header.</w:t>
+      </w:r>
+    </w:p>
+    <w:p>
+      <w:pPr>
+        <w:ind w:left="317" w:hanging="173"/>
+      </w:pPr>
+      <w:r>
+        <w:rPr>
+          <w:rFonts w:ascii="Cascadia Code" w:hAnsi="Cascadia Code"/>
+          <w:b w:val="0"/>
+          <w:color w:val="18132E"/>
+          <w:sz w:val="18"/>
+        </w:rPr>
+        <w:t>• Futuras rotas só entram na lista de ocultação quando realmente tiverem CTA local equivalente; não detectar via DOM e não esconder de forma genérica.</w:t>
+      </w:r>
+    </w:p>
+    <w:p>
+      <w:pPr>
+        <w:pStyle w:val="Heading1"/>
+      </w:pPr>
+      <w:r>
+        <w:t>28. DECISÃO DE PORTFÓLIO — CATCARE</w:t>
+      </w:r>
+    </w:p>
+    <w:tbl>
+      <w:tblPr>
+        <w:tblW w:type="auto" w:w="0"/>
+        <w:jc w:val="left"/>
+        <w:tblLook w:firstColumn="1" w:firstRow="1" w:lastColumn="0" w:lastRow="0" w:noHBand="0" w:noVBand="1" w:val="04A0"/>
+      </w:tblPr>
+      <w:tblGrid>
+        <w:gridCol w:w="5040"/>
+        <w:gridCol w:w="5040"/>
+      </w:tblGrid>
+      <w:tr>
+        <w:tc>
+          <w:tcPr>
+            <w:tcW w:type="dxa" w:w="5040"/>
+            <w:shd w:fill="FFF3F8"/>
+          </w:tcPr>
+          <w:p>
+            <w:pPr>
+              <w:spacing w:after="0"/>
+            </w:pPr>
+            <w:r/>
+            <w:r>
+              <w:rPr>
+                <w:rFonts w:ascii="Cascadia Code" w:hAnsi="Cascadia Code"/>
+                <w:b/>
+                <w:color w:val="AF66F9"/>
+                <w:sz w:val="16"/>
+              </w:rPr>
+              <w:t>PLANEJADO</w:t>
+            </w:r>
+          </w:p>
+        </w:tc>
+        <w:tc>
+          <w:tcPr>
+            <w:tcW w:type="dxa" w:w="5040"/>
+            <w:shd w:fill="FFF3F8"/>
+          </w:tcPr>
+          <w:p>
+            <w:pPr>
+              <w:spacing w:after="0"/>
+            </w:pPr>
+            <w:r/>
+            <w:r>
+              <w:rPr>
+                <w:rFonts w:ascii="Cascadia Code" w:hAnsi="Cascadia Code"/>
+                <w:b w:val="0"/>
+                <w:color w:val="18132E"/>
+                <w:sz w:val="17"/>
+              </w:rPr>
+              <w:t>Após fechar o bloco de páginas internas, substituir o card OURLEADS na Home por CatCare, preservando a estrutura/motion aprovados da seção Projetos.</w:t>
+            </w:r>
+          </w:p>
+        </w:tc>
+      </w:tr>
+    </w:tbl>
+    <w:p>
+      <w:pPr>
+        <w:ind w:left="317" w:hanging="173"/>
+      </w:pPr>
+      <w:r>
+        <w:rPr>
+          <w:rFonts w:ascii="Cascadia Code" w:hAnsi="Cascadia Code"/>
+          <w:b w:val="0"/>
+          <w:color w:val="18132E"/>
+          <w:sz w:val="18"/>
+        </w:rPr>
+        <w:t>• Motivo: CatCare está em estágio mais avançado, possui identidade própria e terá destino público/linkável; OURLEADS ainda não oferece uma experiência pública adequada para o CTA do card.</w:t>
+      </w:r>
+    </w:p>
+    <w:p>
+      <w:pPr>
+        <w:ind w:left="317" w:hanging="173"/>
+      </w:pPr>
+      <w:r>
+        <w:rPr>
+          <w:rFonts w:ascii="Cascadia Code" w:hAnsi="Cascadia Code"/>
+          <w:b w:val="0"/>
+          <w:color w:val="18132E"/>
+          <w:sz w:val="18"/>
+        </w:rPr>
+        <w:t>• Antes da troca: validar URL pública atual, logo/assets oficiais e copy/status factual do CatCare.</w:t>
+      </w:r>
+    </w:p>
+    <w:p>
+      <w:pPr>
+        <w:ind w:left="317" w:hanging="173"/>
+      </w:pPr>
+      <w:r>
+        <w:rPr>
+          <w:rFonts w:ascii="Cascadia Code" w:hAnsi="Cascadia Code"/>
+          <w:b w:val="0"/>
+          <w:color w:val="18132E"/>
+          <w:sz w:val="18"/>
+        </w:rPr>
+        <w:t>• Classificação provisória para site: PROJETO/PRODUTO PRÓPRIO. Não apresentar como cliente nem inventar métricas ou resultados.</w:t>
+      </w:r>
+    </w:p>
+    <w:p>
+      <w:pPr>
+        <w:ind w:left="317" w:hanging="173"/>
+      </w:pPr>
+      <w:r>
+        <w:rPr>
+          <w:rFonts w:ascii="Cascadia Code" w:hAnsi="Cascadia Code"/>
+          <w:b w:val="0"/>
+          <w:color w:val="18132E"/>
+          <w:sz w:val="18"/>
+        </w:rPr>
+        <w:t>• OURLEADS permanece preservado como projeto próprio; sai apenas do protagonismo da Home por enquanto.</w:t>
+      </w:r>
+    </w:p>
+    <w:p>
+      <w:pPr>
+        <w:pStyle w:val="Heading1"/>
+      </w:pPr>
+      <w:r>
+        <w:t>29. PRÓXIMO MARCO</w:t>
+      </w:r>
+    </w:p>
+    <w:tbl>
+      <w:tblPr>
+        <w:tblW w:type="auto" w:w="0"/>
+        <w:jc w:val="left"/>
+        <w:tblLook w:firstColumn="1" w:firstRow="1" w:lastColumn="0" w:lastRow="0" w:noHBand="0" w:noVBand="1" w:val="04A0"/>
+      </w:tblPr>
+      <w:tblGrid>
+        <w:gridCol w:w="5040"/>
+        <w:gridCol w:w="5040"/>
+      </w:tblGrid>
+      <w:tr>
+        <w:tc>
+          <w:tcPr>
+            <w:tcW w:type="dxa" w:w="5040"/>
+            <w:shd w:fill="FFF3F8"/>
+          </w:tcPr>
+          <w:p>
+            <w:pPr>
+              <w:spacing w:after="0"/>
+            </w:pPr>
+            <w:r/>
+            <w:r>
+              <w:rPr>
+                <w:rFonts w:ascii="Cascadia Code" w:hAnsi="Cascadia Code"/>
+                <w:b/>
+                <w:color w:val="AF66F9"/>
+                <w:sz w:val="16"/>
+              </w:rPr>
+              <w:t>PRÓXIMO</w:t>
+            </w:r>
+          </w:p>
+        </w:tc>
+        <w:tc>
+          <w:tcPr>
+            <w:tcW w:type="dxa" w:w="5040"/>
+            <w:shd w:fill="FFF3F8"/>
+          </w:tcPr>
+          <w:p>
+            <w:pPr>
+              <w:spacing w:after="0"/>
+            </w:pPr>
+            <w:r/>
+            <w:r>
+              <w:rPr>
+                <w:rFonts w:ascii="Cascadia Code" w:hAnsi="Cascadia Code"/>
+                <w:b w:val="0"/>
+                <w:color w:val="18132E"/>
+                <w:sz w:val="17"/>
+              </w:rPr>
+              <w:t>Auditar e reconstruir /portfolio (Projetos) com foco em evidências reais, classificação correta e CatCare como possível protagonista. Depois revisar /sobre, Legal e a superfície pública/SEO antes de staging.</w:t>
             </w:r>
           </w:p>
         </w:tc>

</xml_diff>

<commit_message>
docs: record projects and solutions milestone
Co-authored-by: Cursor <cursoragent@cursor.com>
</commit_message>
<xml_diff>
--- a/docs/DREAMSCRAFT_SITE_REGISTRO_DESENVOLVIMENTO.docx
+++ b/docs/DREAMSCRAFT_SITE_REGISTRO_DESENVOLVIMENTO.docx
@@ -52,7 +52,7 @@
           <w:color w:val="625B72"/>
           <w:sz w:val="18"/>
         </w:rPr>
-        <w:t>Versão 1.3  ·  22/09/2026</w:t>
+        <w:t>Versão 1.4  ·  24/10/2026</w:t>
       </w:r>
     </w:p>
     <w:tbl>
@@ -5234,8 +5234,1056 @@
         </w:tc>
       </w:tr>
     </w:tbl>
+    <w:p>
+      <w:pPr>
+        <w:pStyle w:val="Heading1"/>
+      </w:pPr>
+      <w:r>
+        <w:t>30. 24/10/2026 · MARCO — PROJETOS + SOLUÇÕES</w:t>
+      </w:r>
+    </w:p>
+    <w:tbl>
+      <w:tblPr>
+        <w:tblW w:type="auto" w:w="0"/>
+        <w:jc w:val="left"/>
+        <w:tblLook w:firstColumn="1" w:firstRow="1" w:lastColumn="0" w:lastRow="0" w:noHBand="0" w:noVBand="1" w:val="04A0"/>
+      </w:tblPr>
+      <w:tblGrid>
+        <w:gridCol w:w="5040"/>
+        <w:gridCol w:w="5040"/>
+      </w:tblGrid>
+      <w:tr>
+        <w:tc>
+          <w:tcPr>
+            <w:tcW w:type="dxa" w:w="5040"/>
+            <w:shd w:fill="F1F3FF"/>
+          </w:tcPr>
+          <w:p>
+            <w:pPr>
+              <w:spacing w:after="0"/>
+            </w:pPr>
+            <w:r/>
+            <w:r>
+              <w:rPr>
+                <w:rFonts w:ascii="Cascadia Code" w:hAnsi="Cascadia Code"/>
+                <w:b/>
+                <w:color w:val="6A78F6"/>
+                <w:sz w:val="16"/>
+              </w:rPr>
+              <w:t>MARCO</w:t>
+            </w:r>
+          </w:p>
+        </w:tc>
+        <w:tc>
+          <w:tcPr>
+            <w:tcW w:type="dxa" w:w="5040"/>
+            <w:shd w:fill="F1F3FF"/>
+          </w:tcPr>
+          <w:p>
+            <w:pPr>
+              <w:spacing w:after="0"/>
+            </w:pPr>
+            <w:r/>
+            <w:r>
+              <w:rPr>
+                <w:rFonts w:ascii="Cascadia Code" w:hAnsi="Cascadia Code"/>
+                <w:b w:val="0"/>
+                <w:color w:val="18132E"/>
+                <w:sz w:val="17"/>
+              </w:rPr>
+              <w:t>/portfolio e /solucoes foram aprovados visualmente e congelados. O commit funcional 47e23f8 está na branch feat/site-launch-core e foi enviado a origin sem force push, sem merge e sem Pull Request. O site ainda não está classificado como pronto para merge ou deploy final.</w:t>
+            </w:r>
+          </w:p>
+        </w:tc>
+      </w:tr>
+    </w:tbl>
+    <w:tbl>
+      <w:tblPr>
+        <w:tblW w:type="auto" w:w="0"/>
+        <w:jc w:val="center"/>
+        <w:tblLook w:firstColumn="1" w:firstRow="1" w:lastColumn="0" w:lastRow="0" w:noHBand="0" w:noVBand="1" w:val="04A0"/>
+      </w:tblPr>
+      <w:tblGrid>
+        <w:gridCol w:w="5040"/>
+        <w:gridCol w:w="5040"/>
+      </w:tblGrid>
+      <w:tr>
+        <w:tc>
+          <w:tcPr>
+            <w:tcW w:type="dxa" w:w="5040"/>
+            <w:shd w:fill="21104E"/>
+          </w:tcPr>
+          <w:p>
+            <w:pPr>
+              <w:spacing w:after="0"/>
+            </w:pPr>
+            <w:r/>
+            <w:r>
+              <w:rPr>
+                <w:rFonts w:ascii="Cascadia Code" w:hAnsi="Cascadia Code"/>
+                <w:b/>
+                <w:color w:val="EFE5FD"/>
+                <w:sz w:val="16"/>
+              </w:rPr>
+              <w:t>ITEM</w:t>
+            </w:r>
+          </w:p>
+        </w:tc>
+        <w:tc>
+          <w:tcPr>
+            <w:tcW w:type="dxa" w:w="5040"/>
+            <w:shd w:fill="21104E"/>
+          </w:tcPr>
+          <w:p>
+            <w:pPr>
+              <w:spacing w:after="0"/>
+            </w:pPr>
+            <w:r/>
+            <w:r>
+              <w:rPr>
+                <w:rFonts w:ascii="Cascadia Code" w:hAnsi="Cascadia Code"/>
+                <w:b/>
+                <w:color w:val="EFE5FD"/>
+                <w:sz w:val="16"/>
+              </w:rPr>
+              <w:t>REGISTRO</w:t>
+            </w:r>
+          </w:p>
+        </w:tc>
+      </w:tr>
+      <w:tr>
+        <w:tc>
+          <w:tcPr>
+            <w:tcW w:type="dxa" w:w="5040"/>
+          </w:tcPr>
+          <w:p>
+            <w:pPr>
+              <w:spacing w:after="0"/>
+            </w:pPr>
+            <w:r/>
+            <w:r>
+              <w:rPr>
+                <w:rFonts w:ascii="Cascadia Code" w:hAnsi="Cascadia Code"/>
+                <w:b/>
+                <w:color w:val="6A78F6"/>
+                <w:sz w:val="16"/>
+              </w:rPr>
+              <w:t>Portfolio</w:t>
+            </w:r>
+          </w:p>
+        </w:tc>
+        <w:tc>
+          <w:tcPr>
+            <w:tcW w:type="dxa" w:w="5040"/>
+          </w:tcPr>
+          <w:p>
+            <w:pPr>
+              <w:spacing w:after="0"/>
+            </w:pPr>
+            <w:r/>
+            <w:r>
+              <w:rPr>
+                <w:rFonts w:ascii="Cascadia Code" w:hAnsi="Cascadia Code"/>
+                <w:b w:val="0"/>
+                <w:color w:val="18132E"/>
+                <w:sz w:val="16"/>
+              </w:rPr>
+              <w:t>APROVADO VISUALMENTE · CONGELADO. Página institucional apresentada como Projetos. Baseline V2 reconstruído visualmente a partir da gravação histórica e aprovado.</w:t>
+            </w:r>
+          </w:p>
+        </w:tc>
+      </w:tr>
+      <w:tr>
+        <w:tc>
+          <w:tcPr>
+            <w:tcW w:type="dxa" w:w="5040"/>
+          </w:tcPr>
+          <w:p>
+            <w:pPr>
+              <w:spacing w:after="0"/>
+            </w:pPr>
+            <w:r/>
+            <w:r>
+              <w:rPr>
+                <w:rFonts w:ascii="Cascadia Code" w:hAnsi="Cascadia Code"/>
+                <w:b/>
+                <w:color w:val="6A78F6"/>
+                <w:sz w:val="16"/>
+              </w:rPr>
+              <w:t>Café</w:t>
+            </w:r>
+          </w:p>
+        </w:tc>
+        <w:tc>
+          <w:tcPr>
+            <w:tcW w:type="dxa" w:w="5040"/>
+          </w:tcPr>
+          <w:p>
+            <w:pPr>
+              <w:spacing w:after="0"/>
+            </w:pPr>
+            <w:r/>
+            <w:r>
+              <w:rPr>
+                <w:rFonts w:ascii="Cascadia Code" w:hAnsi="Cascadia Code"/>
+                <w:b w:val="0"/>
+                <w:color w:val="18132E"/>
+                <w:sz w:val="16"/>
+              </w:rPr>
+              <w:t>Scroll bidirecional. O progresso deriva do scrollYProgress atual. Linha, marcador, nós e contraste avançam ao descer e retornam ao subir. Reduced motion permanece estático e legível.</w:t>
+            </w:r>
+          </w:p>
+        </w:tc>
+      </w:tr>
+      <w:tr>
+        <w:tc>
+          <w:tcPr>
+            <w:tcW w:type="dxa" w:w="5040"/>
+          </w:tcPr>
+          <w:p>
+            <w:pPr>
+              <w:spacing w:after="0"/>
+            </w:pPr>
+            <w:r/>
+            <w:r>
+              <w:rPr>
+                <w:rFonts w:ascii="Cascadia Code" w:hAnsi="Cascadia Code"/>
+                <w:b/>
+                <w:color w:val="6A78F6"/>
+                <w:sz w:val="16"/>
+              </w:rPr>
+              <w:t>Soluções</w:t>
+            </w:r>
+          </w:p>
+        </w:tc>
+        <w:tc>
+          <w:tcPr>
+            <w:tcW w:type="dxa" w:w="5040"/>
+          </w:tcPr>
+          <w:p>
+            <w:pPr>
+              <w:spacing w:after="0"/>
+            </w:pPr>
+            <w:r/>
+            <w:r>
+              <w:rPr>
+                <w:rFonts w:ascii="Cascadia Code" w:hAnsi="Cascadia Code"/>
+                <w:b w:val="0"/>
+                <w:color w:val="18132E"/>
+                <w:sz w:val="16"/>
+              </w:rPr>
+              <w:t>APROVADO VISUALMENTE · CONGELADO. A página deixou de ser uma sequência editorial semelhante ao Portfolio e passou a funcionar como mapa de decisão. Abertura: “O que precisa mudar?”.</w:t>
+            </w:r>
+          </w:p>
+        </w:tc>
+      </w:tr>
+      <w:tr>
+        <w:tc>
+          <w:tcPr>
+            <w:tcW w:type="dxa" w:w="5040"/>
+          </w:tcPr>
+          <w:p>
+            <w:pPr>
+              <w:spacing w:after="0"/>
+            </w:pPr>
+            <w:r/>
+            <w:r>
+              <w:rPr>
+                <w:rFonts w:ascii="Cascadia Code" w:hAnsi="Cascadia Code"/>
+                <w:b/>
+                <w:color w:val="6A78F6"/>
+                <w:sz w:val="16"/>
+              </w:rPr>
+              <w:t>QA</w:t>
+            </w:r>
+          </w:p>
+        </w:tc>
+        <w:tc>
+          <w:tcPr>
+            <w:tcW w:type="dxa" w:w="5040"/>
+          </w:tcPr>
+          <w:p>
+            <w:pPr>
+              <w:spacing w:after="0"/>
+            </w:pPr>
+            <w:r/>
+            <w:r>
+              <w:rPr>
+                <w:rFonts w:ascii="Cascadia Code" w:hAnsi="Cascadia Code"/>
+                <w:b w:val="0"/>
+                <w:color w:val="18132E"/>
+                <w:sz w:val="16"/>
+              </w:rPr>
+              <w:t>Antes do commit: 5 arquivos / 43 testes, typecheck aprovado, build aprovado, git diff --check limpo, sem overflow nos breakpoints testados e pageerror vazio nas verificações realizadas.</w:t>
+            </w:r>
+          </w:p>
+        </w:tc>
+      </w:tr>
+      <w:tr>
+        <w:tc>
+          <w:tcPr>
+            <w:tcW w:type="dxa" w:w="5040"/>
+          </w:tcPr>
+          <w:p>
+            <w:pPr>
+              <w:spacing w:after="0"/>
+            </w:pPr>
+            <w:r/>
+            <w:r>
+              <w:rPr>
+                <w:rFonts w:ascii="Cascadia Code" w:hAnsi="Cascadia Code"/>
+                <w:b/>
+                <w:color w:val="6A78F6"/>
+                <w:sz w:val="16"/>
+              </w:rPr>
+              <w:t>Git</w:t>
+            </w:r>
+          </w:p>
+        </w:tc>
+        <w:tc>
+          <w:tcPr>
+            <w:tcW w:type="dxa" w:w="5040"/>
+          </w:tcPr>
+          <w:p>
+            <w:pPr>
+              <w:spacing w:after="0"/>
+            </w:pPr>
+            <w:r/>
+            <w:r>
+              <w:rPr>
+                <w:rFonts w:ascii="Cascadia Code" w:hAnsi="Cascadia Code"/>
+                <w:b w:val="0"/>
+                <w:color w:val="18132E"/>
+                <w:sz w:val="16"/>
+              </w:rPr>
+              <w:t>47e23f8aae90befc9d8d0d57b421e6ca8c0d2e58 — feat: finalize projects and solutions experiences. Push normal para origin/feat/site-launch-core. Sem force push, sem merge e sem Pull Request.</w:t>
+            </w:r>
+          </w:p>
+        </w:tc>
+      </w:tr>
+      <w:tr>
+        <w:tc>
+          <w:tcPr>
+            <w:tcW w:type="dxa" w:w="5040"/>
+          </w:tcPr>
+          <w:p>
+            <w:pPr>
+              <w:spacing w:after="0"/>
+            </w:pPr>
+            <w:r/>
+            <w:r>
+              <w:rPr>
+                <w:rFonts w:ascii="Cascadia Code" w:hAnsi="Cascadia Code"/>
+                <w:b/>
+                <w:color w:val="6A78F6"/>
+                <w:sz w:val="16"/>
+              </w:rPr>
+              <w:t>Governança</w:t>
+            </w:r>
+          </w:p>
+        </w:tc>
+        <w:tc>
+          <w:tcPr>
+            <w:tcW w:type="dxa" w:w="5040"/>
+          </w:tcPr>
+          <w:p>
+            <w:pPr>
+              <w:spacing w:after="0"/>
+            </w:pPr>
+            <w:r/>
+            <w:r>
+              <w:rPr>
+                <w:rFonts w:ascii="Cascadia Code" w:hAnsi="Cascadia Code"/>
+                <w:b w:val="0"/>
+                <w:color w:val="18132E"/>
+                <w:sz w:val="16"/>
+              </w:rPr>
+              <w:t>/portfolio e /solucoes ficam congelados até nova autorização ou bug concreto. A próxima frente planejada é Contato.</w:t>
+            </w:r>
+          </w:p>
+        </w:tc>
+      </w:tr>
+    </w:tbl>
+    <w:p>
+      <w:pPr>
+        <w:pStyle w:val="Heading1"/>
+      </w:pPr>
+      <w:r>
+        <w:t>31. PROJETOS /portfolio — CONGELADO</w:t>
+      </w:r>
+    </w:p>
+    <w:p>
+      <w:pPr>
+        <w:ind w:left="317" w:hanging="173"/>
+      </w:pPr>
+      <w:r>
+        <w:rPr>
+          <w:rFonts w:ascii="Cascadia Code" w:hAnsi="Cascadia Code"/>
+          <w:b w:val="0"/>
+          <w:color w:val="18132E"/>
+          <w:sz w:val="18"/>
+        </w:rPr>
+        <w:t>• Status: APROVADO VISUALMENTE · CONGELADO.</w:t>
+      </w:r>
+    </w:p>
+    <w:p>
+      <w:pPr>
+        <w:ind w:left="317" w:hanging="173"/>
+      </w:pPr>
+      <w:r>
+        <w:rPr>
+          <w:rFonts w:ascii="Cascadia Code" w:hAnsi="Cascadia Code"/>
+          <w:b w:val="0"/>
+          <w:color w:val="18132E"/>
+          <w:sz w:val="18"/>
+        </w:rPr>
+        <w:t>• A página institucional é apresentada como “Projetos”.</w:t>
+      </w:r>
+    </w:p>
+    <w:p>
+      <w:pPr>
+        <w:ind w:left="317" w:hanging="173"/>
+      </w:pPr>
+      <w:r>
+        <w:rPr>
+          <w:rFonts w:ascii="Cascadia Code" w:hAnsi="Cascadia Code"/>
+          <w:b w:val="0"/>
+          <w:color w:val="18132E"/>
+          <w:sz w:val="18"/>
+        </w:rPr>
+        <w:t>• O baseline V2 foi reconstruído visualmente a partir da gravação histórica e aprovado.</w:t>
+      </w:r>
+    </w:p>
+    <w:p>
+      <w:pPr>
+        <w:ind w:left="317" w:hanging="173"/>
+      </w:pPr>
+      <w:r>
+        <w:rPr>
+          <w:rFonts w:ascii="Cascadia Code" w:hAnsi="Cascadia Code"/>
+          <w:b w:val="0"/>
+          <w:color w:val="18132E"/>
+          <w:sz w:val="18"/>
+        </w:rPr>
+        <w:t>• Cuidadim, Café Orquestra e Secretária.Code aparecem com conteúdo factual.</w:t>
+      </w:r>
+    </w:p>
+    <w:p>
+      <w:pPr>
+        <w:ind w:left="317" w:hanging="173"/>
+      </w:pPr>
+      <w:r>
+        <w:rPr>
+          <w:rFonts w:ascii="Cascadia Code" w:hAnsi="Cascadia Code"/>
+          <w:b w:val="0"/>
+          <w:color w:val="18132E"/>
+          <w:sz w:val="18"/>
+        </w:rPr>
+        <w:t>• Não há cases, métricas, screenshots ou resultados inventados.</w:t>
+      </w:r>
+    </w:p>
+    <w:p>
+      <w:pPr>
+        <w:ind w:left="317" w:hanging="173"/>
+      </w:pPr>
+      <w:r>
+        <w:rPr>
+          <w:rFonts w:ascii="Cascadia Code" w:hAnsi="Cascadia Code"/>
+          <w:b w:val="0"/>
+          <w:color w:val="18132E"/>
+          <w:sz w:val="18"/>
+        </w:rPr>
+        <w:t>• O progresso do Café Orquestra é bidirecional e deriva do scrollYProgress atual: a posição real do scroll, não um índice que só avança.</w:t>
+      </w:r>
+    </w:p>
+    <w:p>
+      <w:pPr>
+        <w:ind w:left="317" w:hanging="173"/>
+      </w:pPr>
+      <w:r>
+        <w:rPr>
+          <w:rFonts w:ascii="Cascadia Code" w:hAnsi="Cascadia Code"/>
+          <w:b w:val="0"/>
+          <w:color w:val="18132E"/>
+          <w:sz w:val="18"/>
+        </w:rPr>
+        <w:t>• Linha, marcador, nós e contraste retornam ao subir.</w:t>
+      </w:r>
+    </w:p>
+    <w:p>
+      <w:pPr>
+        <w:ind w:left="317" w:hanging="173"/>
+      </w:pPr>
+      <w:r>
+        <w:rPr>
+          <w:rFonts w:ascii="Cascadia Code" w:hAnsi="Cascadia Code"/>
+          <w:b w:val="0"/>
+          <w:color w:val="18132E"/>
+          <w:sz w:val="18"/>
+        </w:rPr>
+        <w:t>• Reduced motion permanece estático e legível.</w:t>
+      </w:r>
+    </w:p>
+    <w:p>
+      <w:pPr>
+        <w:ind w:left="317" w:hanging="173"/>
+      </w:pPr>
+      <w:r>
+        <w:rPr>
+          <w:rFonts w:ascii="Cascadia Code" w:hAnsi="Cascadia Code"/>
+          <w:b w:val="0"/>
+          <w:color w:val="18132E"/>
+          <w:sz w:val="18"/>
+        </w:rPr>
+        <w:t>• Cuidadim e Secretária.Code foram preservados no baseline aprovado.</w:t>
+      </w:r>
+    </w:p>
+    <w:p>
+      <w:pPr>
+        <w:ind w:left="317" w:hanging="173"/>
+      </w:pPr>
+      <w:r>
+        <w:rPr>
+          <w:rFonts w:ascii="Cascadia Code" w:hAnsi="Cascadia Code"/>
+          <w:b w:val="0"/>
+          <w:color w:val="18132E"/>
+          <w:sz w:val="18"/>
+        </w:rPr>
+        <w:t>• Há CTA local para diagnóstico.</w:t>
+      </w:r>
+    </w:p>
+    <w:p>
+      <w:pPr>
+        <w:ind w:left="317" w:hanging="173"/>
+      </w:pPr>
+      <w:r>
+        <w:rPr>
+          <w:rFonts w:ascii="Cascadia Code" w:hAnsi="Cascadia Code"/>
+          <w:b w:val="0"/>
+          <w:color w:val="18132E"/>
+          <w:sz w:val="18"/>
+        </w:rPr>
+        <w:t>• O header não repete o CTA de diagnóstico em /portfolio.</w:t>
+      </w:r>
+    </w:p>
+    <w:p>
+      <w:pPr>
+        <w:pStyle w:val="Heading1"/>
+      </w:pPr>
+      <w:r>
+        <w:t>32. SOLUÇÕES /solucoes — MAPA DE DECISÃO</w:t>
+      </w:r>
+    </w:p>
+    <w:p>
+      <w:pPr>
+        <w:ind w:left="317" w:hanging="173"/>
+      </w:pPr>
+      <w:r>
+        <w:rPr>
+          <w:rFonts w:ascii="Cascadia Code" w:hAnsi="Cascadia Code"/>
+          <w:b w:val="0"/>
+          <w:color w:val="18132E"/>
+          <w:sz w:val="18"/>
+        </w:rPr>
+        <w:t>• Status: APROVADO VISUALMENTE · CONGELADO.</w:t>
+      </w:r>
+    </w:p>
+    <w:p>
+      <w:pPr>
+        <w:ind w:left="317" w:hanging="173"/>
+      </w:pPr>
+      <w:r>
+        <w:rPr>
+          <w:rFonts w:ascii="Cascadia Code" w:hAnsi="Cascadia Code"/>
+          <w:b w:val="0"/>
+          <w:color w:val="18132E"/>
+          <w:sz w:val="18"/>
+        </w:rPr>
+        <w:t>• A página deixou de ser uma sequência editorial semelhante ao Portfolio e passou a funcionar como mapa de decisão.</w:t>
+      </w:r>
+    </w:p>
+    <w:p>
+      <w:pPr>
+        <w:ind w:left="317" w:hanging="173"/>
+      </w:pPr>
+      <w:r>
+        <w:rPr>
+          <w:rFonts w:ascii="Cascadia Code" w:hAnsi="Cascadia Code"/>
+          <w:b w:val="0"/>
+          <w:color w:val="18132E"/>
+          <w:sz w:val="18"/>
+        </w:rPr>
+        <w:t>• Abertura: “O que precisa mudar?”.</w:t>
+      </w:r>
+    </w:p>
+    <w:p>
+      <w:pPr>
+        <w:ind w:left="317" w:hanging="173"/>
+      </w:pPr>
+      <w:r>
+        <w:rPr>
+          <w:rFonts w:ascii="Cascadia Code" w:hAnsi="Cascadia Code"/>
+          <w:b w:val="0"/>
+          <w:color w:val="18132E"/>
+          <w:sz w:val="18"/>
+        </w:rPr>
+        <w:t>• Operação manual ou repetitiva → Automação e atendimento.</w:t>
+      </w:r>
+    </w:p>
+    <w:p>
+      <w:pPr>
+        <w:ind w:left="317" w:hanging="173"/>
+      </w:pPr>
+      <w:r>
+        <w:rPr>
+          <w:rFonts w:ascii="Cascadia Code" w:hAnsi="Cascadia Code"/>
+          <w:b w:val="0"/>
+          <w:color w:val="18132E"/>
+          <w:sz w:val="18"/>
+        </w:rPr>
+        <w:t>• Operação sem ferramenta adequada → Sistema sob medida.</w:t>
+      </w:r>
+    </w:p>
+    <w:p>
+      <w:pPr>
+        <w:ind w:left="317" w:hanging="173"/>
+      </w:pPr>
+      <w:r>
+        <w:rPr>
+          <w:rFonts w:ascii="Cascadia Code" w:hAnsi="Cascadia Code"/>
+          <w:b w:val="0"/>
+          <w:color w:val="18132E"/>
+          <w:sz w:val="18"/>
+        </w:rPr>
+        <w:t>• Ideia que precisa virar produto → Produtos digitais.</w:t>
+      </w:r>
+    </w:p>
+    <w:p>
+      <w:pPr>
+        <w:ind w:left="317" w:hanging="173"/>
+      </w:pPr>
+      <w:r>
+        <w:rPr>
+          <w:rFonts w:ascii="Cascadia Code" w:hAnsi="Cascadia Code"/>
+          <w:b w:val="0"/>
+          <w:color w:val="18132E"/>
+          <w:sz w:val="18"/>
+        </w:rPr>
+        <w:t>• Marca que precisa existir melhor na internet → Sites institucionais.</w:t>
+      </w:r>
+    </w:p>
+    <w:p>
+      <w:pPr>
+        <w:ind w:left="317" w:hanging="173"/>
+      </w:pPr>
+      <w:r>
+        <w:rPr>
+          <w:rFonts w:ascii="Cascadia Code" w:hAnsi="Cascadia Code"/>
+          <w:b w:val="0"/>
+          <w:color w:val="18132E"/>
+          <w:sz w:val="18"/>
+        </w:rPr>
+        <w:t>• Hover e focus fazem preview visual. Click fixa a escolha.</w:t>
+      </w:r>
+    </w:p>
+    <w:p>
+      <w:pPr>
+        <w:ind w:left="317" w:hanging="173"/>
+      </w:pPr>
+      <w:r>
+        <w:rPr>
+          <w:rFonts w:ascii="Cascadia Code" w:hAnsi="Cascadia Code"/>
+          <w:b w:val="0"/>
+          <w:color w:val="18132E"/>
+          <w:sz w:val="18"/>
+        </w:rPr>
+        <w:t>• Enter e Space fixam a escolha por teclado. Escape volta ao estado neutro. Touch fixa o caminho.</w:t>
+      </w:r>
+    </w:p>
+    <w:p>
+      <w:pPr>
+        <w:ind w:left="317" w:hanging="173"/>
+      </w:pPr>
+      <w:r>
+        <w:rPr>
+          <w:rFonts w:ascii="Cascadia Code" w:hAnsi="Cascadia Code"/>
+          <w:b w:val="0"/>
+          <w:color w:val="18132E"/>
+          <w:sz w:val="18"/>
+        </w:rPr>
+        <w:t>• Apenas um caminho fica aberto. No mobile, o detalhe expande imediatamente abaixo do caminho.</w:t>
+      </w:r>
+    </w:p>
+    <w:p>
+      <w:pPr>
+        <w:ind w:left="317" w:hanging="173"/>
+      </w:pPr>
+      <w:r>
+        <w:rPr>
+          <w:rFonts w:ascii="Cascadia Code" w:hAnsi="Cascadia Code"/>
+          <w:b w:val="0"/>
+          <w:color w:val="18132E"/>
+          <w:sz w:val="18"/>
+        </w:rPr>
+        <w:t>• Não há rail de progresso por scroll. Reduced motion mantém o conteúdo completo e legível.</w:t>
+      </w:r>
+    </w:p>
+    <w:p>
+      <w:pPr>
+        <w:ind w:left="317" w:hanging="173"/>
+      </w:pPr>
+      <w:r>
+        <w:rPr>
+          <w:rFonts w:ascii="Cascadia Code" w:hAnsi="Cascadia Code"/>
+          <w:b w:val="0"/>
+          <w:color w:val="18132E"/>
+          <w:sz w:val="18"/>
+        </w:rPr>
+        <w:t>• Mantidos: “Não começamos escolhendo a stack.”; Problema → Contexto → Restrições → Prioridade; CTA único “Solicitar diagnóstico” para /estimar; factualidade e copy já auditadas.</w:t>
+      </w:r>
+    </w:p>
+    <w:p>
+      <w:pPr>
+        <w:pStyle w:val="Heading1"/>
+      </w:pPr>
+      <w:r>
+        <w:t>33. GOVERNANÇA — ROTAS CONGELADAS</w:t>
+      </w:r>
+    </w:p>
+    <w:p>
+      <w:pPr>
+        <w:ind w:left="317" w:hanging="173"/>
+      </w:pPr>
+      <w:r>
+        <w:rPr>
+          <w:rFonts w:ascii="Cascadia Code" w:hAnsi="Cascadia Code"/>
+          <w:b w:val="0"/>
+          <w:color w:val="18132E"/>
+          <w:sz w:val="18"/>
+        </w:rPr>
+        <w:t>• /portfolio: CONGELADO até nova autorização ou bug concreto.</w:t>
+      </w:r>
+    </w:p>
+    <w:p>
+      <w:pPr>
+        <w:ind w:left="317" w:hanging="173"/>
+      </w:pPr>
+      <w:r>
+        <w:rPr>
+          <w:rFonts w:ascii="Cascadia Code" w:hAnsi="Cascadia Code"/>
+          <w:b w:val="0"/>
+          <w:color w:val="18132E"/>
+          <w:sz w:val="18"/>
+        </w:rPr>
+        <w:t>• /solucoes: CONGELADO até nova autorização ou bug concreto.</w:t>
+      </w:r>
+    </w:p>
+    <w:p>
+      <w:pPr>
+        <w:ind w:left="317" w:hanging="173"/>
+      </w:pPr>
+      <w:r>
+        <w:rPr>
+          <w:rFonts w:ascii="Cascadia Code" w:hAnsi="Cascadia Code"/>
+          <w:b w:val="0"/>
+          <w:color w:val="18132E"/>
+          <w:sz w:val="18"/>
+        </w:rPr>
+        <w:t>• Não reabrir uma rota só porque outra rota mudar.</w:t>
+      </w:r>
+    </w:p>
+    <w:p>
+      <w:pPr>
+        <w:ind w:left="317" w:hanging="173"/>
+      </w:pPr>
+      <w:r>
+        <w:rPr>
+          <w:rFonts w:ascii="Cascadia Code" w:hAnsi="Cascadia Code"/>
+          <w:b w:val="0"/>
+          <w:color w:val="18132E"/>
+          <w:sz w:val="18"/>
+        </w:rPr>
+        <w:t>• A próxima frente planejada é Contato.</w:t>
+      </w:r>
+    </w:p>
+    <w:p>
+      <w:pPr>
+        <w:ind w:left="317" w:hanging="173"/>
+      </w:pPr>
+      <w:r>
+        <w:rPr>
+          <w:rFonts w:ascii="Cascadia Code" w:hAnsi="Cascadia Code"/>
+          <w:b w:val="0"/>
+          <w:color w:val="18132E"/>
+          <w:sz w:val="18"/>
+        </w:rPr>
+        <w:t>• O site ainda não está classificado como pronto para merge ou deploy final.</w:t>
+      </w:r>
+    </w:p>
+    <w:p>
+      <w:pPr>
+        <w:pStyle w:val="Heading1"/>
+      </w:pPr>
+      <w:r>
+        <w:t>34. QA DO MILESTONE</w:t>
+      </w:r>
+    </w:p>
+    <w:p>
+      <w:pPr>
+        <w:ind w:left="317" w:hanging="173"/>
+      </w:pPr>
+      <w:r>
+        <w:rPr>
+          <w:rFonts w:ascii="Cascadia Code" w:hAnsi="Cascadia Code"/>
+          <w:b w:val="0"/>
+          <w:color w:val="18132E"/>
+          <w:sz w:val="18"/>
+        </w:rPr>
+        <w:t>• Confirmado antes do commit funcional.</w:t>
+      </w:r>
+    </w:p>
+    <w:p>
+      <w:pPr>
+        <w:ind w:left="317" w:hanging="173"/>
+      </w:pPr>
+      <w:r>
+        <w:rPr>
+          <w:rFonts w:ascii="Cascadia Code" w:hAnsi="Cascadia Code"/>
+          <w:b w:val="0"/>
+          <w:color w:val="18132E"/>
+          <w:sz w:val="18"/>
+        </w:rPr>
+        <w:t>• bun run test: 5 arquivos / 43 testes passando.</w:t>
+      </w:r>
+    </w:p>
+    <w:p>
+      <w:pPr>
+        <w:ind w:left="317" w:hanging="173"/>
+      </w:pPr>
+      <w:r>
+        <w:rPr>
+          <w:rFonts w:ascii="Cascadia Code" w:hAnsi="Cascadia Code"/>
+          <w:b w:val="0"/>
+          <w:color w:val="18132E"/>
+          <w:sz w:val="18"/>
+        </w:rPr>
+        <w:t>• bunx tsc --noEmit: aprovado.</w:t>
+      </w:r>
+    </w:p>
+    <w:p>
+      <w:pPr>
+        <w:ind w:left="317" w:hanging="173"/>
+      </w:pPr>
+      <w:r>
+        <w:rPr>
+          <w:rFonts w:ascii="Cascadia Code" w:hAnsi="Cascadia Code"/>
+          <w:b w:val="0"/>
+          <w:color w:val="18132E"/>
+          <w:sz w:val="18"/>
+        </w:rPr>
+        <w:t>• bun run build: aprovado.</w:t>
+      </w:r>
+    </w:p>
+    <w:p>
+      <w:pPr>
+        <w:ind w:left="317" w:hanging="173"/>
+      </w:pPr>
+      <w:r>
+        <w:rPr>
+          <w:rFonts w:ascii="Cascadia Code" w:hAnsi="Cascadia Code"/>
+          <w:b w:val="0"/>
+          <w:color w:val="18132E"/>
+          <w:sz w:val="18"/>
+        </w:rPr>
+        <w:t>• git diff --check: limpo.</w:t>
+      </w:r>
+    </w:p>
+    <w:p>
+      <w:pPr>
+        <w:ind w:left="317" w:hanging="173"/>
+      </w:pPr>
+      <w:r>
+        <w:rPr>
+          <w:rFonts w:ascii="Cascadia Code" w:hAnsi="Cascadia Code"/>
+          <w:b w:val="0"/>
+          <w:color w:val="18132E"/>
+          <w:sz w:val="18"/>
+        </w:rPr>
+        <w:t>• Sem overflow nos breakpoints testados.</w:t>
+      </w:r>
+    </w:p>
+    <w:p>
+      <w:pPr>
+        <w:ind w:left="317" w:hanging="173"/>
+      </w:pPr>
+      <w:r>
+        <w:rPr>
+          <w:rFonts w:ascii="Cascadia Code" w:hAnsi="Cascadia Code"/>
+          <w:b w:val="0"/>
+          <w:color w:val="18132E"/>
+          <w:sz w:val="18"/>
+        </w:rPr>
+        <w:t>• pageerror vazio nas verificações realizadas.</w:t>
+      </w:r>
+    </w:p>
+    <w:p>
+      <w:pPr>
+        <w:ind w:left="317" w:hanging="173"/>
+      </w:pPr>
+      <w:r>
+        <w:rPr>
+          <w:rFonts w:ascii="Cascadia Code" w:hAnsi="Cascadia Code"/>
+          <w:b w:val="0"/>
+          <w:color w:val="18132E"/>
+          <w:sz w:val="18"/>
+        </w:rPr>
+        <w:t>• routeTree.gen.ts foi restaurado quando o build o alterou apenas por line ending.</w:t>
+      </w:r>
+    </w:p>
+    <w:p>
+      <w:pPr>
+        <w:pStyle w:val="Heading1"/>
+      </w:pPr>
+      <w:r>
+        <w:t>35. GIT</w:t>
+      </w:r>
+    </w:p>
+    <w:p>
+      <w:pPr>
+        <w:ind w:left="317" w:hanging="173"/>
+      </w:pPr>
+      <w:r>
+        <w:rPr>
+          <w:rFonts w:ascii="Cascadia Code" w:hAnsi="Cascadia Code"/>
+          <w:b w:val="0"/>
+          <w:color w:val="18132E"/>
+          <w:sz w:val="18"/>
+        </w:rPr>
+        <w:t>• Commit funcional: 47e23f8aae90befc9d8d0d57b421e6ca8c0d2e58.</w:t>
+      </w:r>
+    </w:p>
+    <w:p>
+      <w:pPr>
+        <w:ind w:left="317" w:hanging="173"/>
+      </w:pPr>
+      <w:r>
+        <w:rPr>
+          <w:rFonts w:ascii="Cascadia Code" w:hAnsi="Cascadia Code"/>
+          <w:b w:val="0"/>
+          <w:color w:val="18132E"/>
+          <w:sz w:val="18"/>
+        </w:rPr>
+        <w:t>• Mensagem: feat: finalize projects and solutions experiences.</w:t>
+      </w:r>
+    </w:p>
+    <w:p>
+      <w:pPr>
+        <w:ind w:left="317" w:hanging="173"/>
+      </w:pPr>
+      <w:r>
+        <w:rPr>
+          <w:rFonts w:ascii="Cascadia Code" w:hAnsi="Cascadia Code"/>
+          <w:b w:val="0"/>
+          <w:color w:val="18132E"/>
+          <w:sz w:val="18"/>
+        </w:rPr>
+        <w:t>• Branch: feat/site-launch-core.</w:t>
+      </w:r>
+    </w:p>
+    <w:p>
+      <w:pPr>
+        <w:ind w:left="317" w:hanging="173"/>
+      </w:pPr>
+      <w:r>
+        <w:rPr>
+          <w:rFonts w:ascii="Cascadia Code" w:hAnsi="Cascadia Code"/>
+          <w:b w:val="0"/>
+          <w:color w:val="18132E"/>
+          <w:sz w:val="18"/>
+        </w:rPr>
+        <w:t>• Push normal para origin/feat/site-launch-core.</w:t>
+      </w:r>
+    </w:p>
+    <w:p>
+      <w:pPr>
+        <w:ind w:left="317" w:hanging="173"/>
+      </w:pPr>
+      <w:r>
+        <w:rPr>
+          <w:rFonts w:ascii="Cascadia Code" w:hAnsi="Cascadia Code"/>
+          <w:b w:val="0"/>
+          <w:color w:val="18132E"/>
+          <w:sz w:val="18"/>
+        </w:rPr>
+        <w:t>• Sem force push, sem merge e sem Pull Request.</w:t>
+      </w:r>
+    </w:p>
+    <w:p>
+      <w:pPr>
+        <w:pStyle w:val="Heading1"/>
+      </w:pPr>
+      <w:r>
+        <w:t>36. PRÓXIMO MARCO</w:t>
+      </w:r>
+    </w:p>
+    <w:tbl>
+      <w:tblPr>
+        <w:tblW w:type="auto" w:w="0"/>
+        <w:jc w:val="left"/>
+        <w:tblLook w:firstColumn="1" w:firstRow="1" w:lastColumn="0" w:lastRow="0" w:noHBand="0" w:noVBand="1" w:val="04A0"/>
+      </w:tblPr>
+      <w:tblGrid>
+        <w:gridCol w:w="5040"/>
+        <w:gridCol w:w="5040"/>
+      </w:tblGrid>
+      <w:tr>
+        <w:tc>
+          <w:tcPr>
+            <w:tcW w:type="dxa" w:w="5040"/>
+            <w:shd w:fill="FFF3F8"/>
+          </w:tcPr>
+          <w:p>
+            <w:pPr>
+              <w:spacing w:after="0"/>
+            </w:pPr>
+            <w:r/>
+            <w:r>
+              <w:rPr>
+                <w:rFonts w:ascii="Cascadia Code" w:hAnsi="Cascadia Code"/>
+                <w:b/>
+                <w:color w:val="AF66F9"/>
+                <w:sz w:val="16"/>
+              </w:rPr>
+              <w:t>PRÓXIMO</w:t>
+            </w:r>
+          </w:p>
+        </w:tc>
+        <w:tc>
+          <w:tcPr>
+            <w:tcW w:type="dxa" w:w="5040"/>
+            <w:shd w:fill="FFF3F8"/>
+          </w:tcPr>
+          <w:p>
+            <w:pPr>
+              <w:spacing w:after="0"/>
+            </w:pPr>
+            <w:r/>
+            <w:r>
+              <w:rPr>
+                <w:rFonts w:ascii="Cascadia Code" w:hAnsi="Cascadia Code"/>
+                <w:b w:val="0"/>
+                <w:color w:val="18132E"/>
+                <w:sz w:val="17"/>
+              </w:rPr>
+              <w:t>Contato. /portfolio e /solucoes permanecem congelados até nova autorização ou bug concreto. O site ainda não está classificado como pronto para merge ou deploy final.</w:t>
+            </w:r>
+          </w:p>
+        </w:tc>
+      </w:tr>
+    </w:tbl>
     <w:sectPr>
       <w:footerReference w:type="default" r:id="rId9"/>
+      <w:headerReference w:type="default" r:id="rId10"/>
       <w:pgSz w:w="12240" w:h="15840"/>
       <w:pgMar w:top="936" w:right="1080" w:bottom="936" w:left="1080" w:header="720" w:footer="720" w:gutter="0"/>
       <w:cols w:space="720"/>
@@ -5262,6 +6310,16 @@
     </w:r>
   </w:p>
 </w:ftr>
+</file>
+
+<file path=word/header1.xml><?xml version="1.0" encoding="utf-8"?>
+<w:hdr xmlns:m="http://schemas.openxmlformats.org/officeDocument/2006/math" xmlns:mc="http://schemas.openxmlformats.org/markup-compatibility/2006" xmlns:mo="http://schemas.microsoft.com/office/mac/office/2008/main" xmlns:mv="urn:schemas-microsoft-com:mac:vml" xmlns:o="urn:schemas-microsoft-com:office:office" xmlns:r="http://schemas.openxmlformats.org/officeDocument/2006/relationships" xmlns:v="urn:schemas-microsoft-com:vml" xmlns:w10="urn:schemas-microsoft-com:office:word" xmlns:w14="http://schemas.microsoft.com/office/word/2010/wordml" xmlns:w="http://schemas.openxmlformats.org/wordprocessingml/2006/main" xmlns:wne="http://schemas.microsoft.com/office/word/2006/wordml" xmlns:wp14="http://schemas.microsoft.com/office/word/2010/wordprocessingDrawing" xmlns:wp="http://schemas.openxmlformats.org/drawingml/2006/wordprocessingDrawing" xmlns:wpc="http://schemas.microsoft.com/office/word/2010/wordprocessingCanvas" xmlns:wpg="http://schemas.microsoft.com/office/word/2010/wordprocessingGroup" xmlns:wpi="http://schemas.microsoft.com/office/word/2010/wordprocessingInk" xmlns:wps="http://schemas.microsoft.com/office/word/2010/wordprocessingShape" mc:Ignorable="w14 wp14">
+  <w:p>
+    <w:pPr>
+      <w:pStyle w:val="Header"/>
+    </w:pPr>
+  </w:p>
+</w:hdr>
 </file>
 
 <file path=word/numbering.xml><?xml version="1.0" encoding="utf-8"?>

</xml_diff>

<commit_message>
docs: record contact milestone
Co-authored-by: Cursor <cursoragent@cursor.com>
</commit_message>
<xml_diff>
--- a/docs/DREAMSCRAFT_SITE_REGISTRO_DESENVOLVIMENTO.docx
+++ b/docs/DREAMSCRAFT_SITE_REGISTRO_DESENVOLVIMENTO.docx
@@ -52,7 +52,7 @@
           <w:color w:val="625B72"/>
           <w:sz w:val="18"/>
         </w:rPr>
-        <w:t>Versão 1.4  ·  24/10/2026</w:t>
+        <w:t>Versão 1.5  ·  25/10/2026</w:t>
       </w:r>
     </w:p>
     <w:tbl>
@@ -6281,6 +6281,1109 @@
         </w:tc>
       </w:tr>
     </w:tbl>
+    <w:p>
+      <w:pPr>
+        <w:pStyle w:val="Heading1"/>
+      </w:pPr>
+      <w:r>
+        <w:t>37. 25/10/2026 · MARCO — CONTATO V3</w:t>
+      </w:r>
+    </w:p>
+    <w:tbl>
+      <w:tblPr>
+        <w:tblW w:type="auto" w:w="0"/>
+        <w:jc w:val="left"/>
+        <w:tblLook w:firstColumn="1" w:firstRow="1" w:lastColumn="0" w:lastRow="0" w:noHBand="0" w:noVBand="1" w:val="04A0"/>
+      </w:tblPr>
+      <w:tblGrid>
+        <w:gridCol w:w="5040"/>
+        <w:gridCol w:w="5040"/>
+      </w:tblGrid>
+      <w:tr>
+        <w:tc>
+          <w:tcPr>
+            <w:tcW w:type="dxa" w:w="5040"/>
+            <w:shd w:fill="F1F3FF"/>
+          </w:tcPr>
+          <w:p>
+            <w:pPr>
+              <w:spacing w:after="0"/>
+            </w:pPr>
+            <w:r/>
+            <w:r>
+              <w:rPr>
+                <w:rFonts w:ascii="Cascadia Code" w:hAnsi="Cascadia Code"/>
+                <w:b/>
+                <w:color w:val="6A78F6"/>
+                <w:sz w:val="16"/>
+              </w:rPr>
+              <w:t>MARCO</w:t>
+            </w:r>
+          </w:p>
+        </w:tc>
+        <w:tc>
+          <w:tcPr>
+            <w:tcW w:type="dxa" w:w="5040"/>
+            <w:shd w:fill="F1F3FF"/>
+          </w:tcPr>
+          <w:p>
+            <w:pPr>
+              <w:spacing w:after="0"/>
+            </w:pPr>
+            <w:r/>
+            <w:r>
+              <w:rPr>
+                <w:rFonts w:ascii="Cascadia Code" w:hAnsi="Cascadia Code"/>
+                <w:b w:val="0"/>
+                <w:color w:val="18132E"/>
+                <w:sz w:val="17"/>
+              </w:rPr>
+              <w:t>/contato foi aprovado visualmente e congelado. O commit funcional 606d6e4 está na branch feat/site-launch-core. Push 5df7c85..606d6e4 para origin, sem force push, sem merge e sem Pull Request.</w:t>
+            </w:r>
+          </w:p>
+        </w:tc>
+      </w:tr>
+    </w:tbl>
+    <w:tbl>
+      <w:tblPr>
+        <w:tblW w:type="auto" w:w="0"/>
+        <w:jc w:val="center"/>
+        <w:tblLook w:firstColumn="1" w:firstRow="1" w:lastColumn="0" w:lastRow="0" w:noHBand="0" w:noVBand="1" w:val="04A0"/>
+      </w:tblPr>
+      <w:tblGrid>
+        <w:gridCol w:w="5040"/>
+        <w:gridCol w:w="5040"/>
+      </w:tblGrid>
+      <w:tr>
+        <w:tc>
+          <w:tcPr>
+            <w:tcW w:type="dxa" w:w="5040"/>
+            <w:shd w:fill="21104E"/>
+          </w:tcPr>
+          <w:p>
+            <w:pPr>
+              <w:spacing w:after="0"/>
+            </w:pPr>
+            <w:r/>
+            <w:r>
+              <w:rPr>
+                <w:rFonts w:ascii="Cascadia Code" w:hAnsi="Cascadia Code"/>
+                <w:b/>
+                <w:color w:val="EFE5FD"/>
+                <w:sz w:val="16"/>
+              </w:rPr>
+              <w:t>ITEM</w:t>
+            </w:r>
+          </w:p>
+        </w:tc>
+        <w:tc>
+          <w:tcPr>
+            <w:tcW w:type="dxa" w:w="5040"/>
+            <w:shd w:fill="21104E"/>
+          </w:tcPr>
+          <w:p>
+            <w:pPr>
+              <w:spacing w:after="0"/>
+            </w:pPr>
+            <w:r/>
+            <w:r>
+              <w:rPr>
+                <w:rFonts w:ascii="Cascadia Code" w:hAnsi="Cascadia Code"/>
+                <w:b/>
+                <w:color w:val="EFE5FD"/>
+                <w:sz w:val="16"/>
+              </w:rPr>
+              <w:t>REGISTRO</w:t>
+            </w:r>
+          </w:p>
+        </w:tc>
+      </w:tr>
+      <w:tr>
+        <w:tc>
+          <w:tcPr>
+            <w:tcW w:type="dxa" w:w="5040"/>
+          </w:tcPr>
+          <w:p>
+            <w:pPr>
+              <w:spacing w:after="0"/>
+            </w:pPr>
+            <w:r/>
+            <w:r>
+              <w:rPr>
+                <w:rFonts w:ascii="Cascadia Code" w:hAnsi="Cascadia Code"/>
+                <w:b/>
+                <w:color w:val="6A78F6"/>
+                <w:sz w:val="16"/>
+              </w:rPr>
+              <w:t>Status</w:t>
+            </w:r>
+          </w:p>
+        </w:tc>
+        <w:tc>
+          <w:tcPr>
+            <w:tcW w:type="dxa" w:w="5040"/>
+          </w:tcPr>
+          <w:p>
+            <w:pPr>
+              <w:spacing w:after="0"/>
+            </w:pPr>
+            <w:r/>
+            <w:r>
+              <w:rPr>
+                <w:rFonts w:ascii="Cascadia Code" w:hAnsi="Cascadia Code"/>
+                <w:b w:val="0"/>
+                <w:color w:val="18132E"/>
+                <w:sz w:val="16"/>
+              </w:rPr>
+              <w:t>APROVADO VISUALMENTE · CONGELADO. A página deixou de funcionar como landing editorial longa.</w:t>
+            </w:r>
+          </w:p>
+        </w:tc>
+      </w:tr>
+      <w:tr>
+        <w:tc>
+          <w:tcPr>
+            <w:tcW w:type="dxa" w:w="5040"/>
+          </w:tcPr>
+          <w:p>
+            <w:pPr>
+              <w:spacing w:after="0"/>
+            </w:pPr>
+            <w:r/>
+            <w:r>
+              <w:rPr>
+                <w:rFonts w:ascii="Cascadia Code" w:hAnsi="Cascadia Code"/>
+                <w:b/>
+                <w:color w:val="6A78F6"/>
+                <w:sz w:val="16"/>
+              </w:rPr>
+              <w:t>Composição</w:t>
+            </w:r>
+          </w:p>
+        </w:tc>
+        <w:tc>
+          <w:tcPr>
+            <w:tcW w:type="dxa" w:w="5040"/>
+          </w:tcPr>
+          <w:p>
+            <w:pPr>
+              <w:spacing w:after="0"/>
+            </w:pPr>
+            <w:r/>
+            <w:r>
+              <w:rPr>
+                <w:rFonts w:ascii="Cascadia Code" w:hAnsi="Cascadia Code"/>
+                <w:b w:val="0"/>
+                <w:color w:val="18132E"/>
+                <w:sz w:val="16"/>
+              </w:rPr>
+              <w:t>Removidos o hero 60/40, o trilho 01→02, a ponte “03 · Escrever o contexto”, o painel lavanda e o fechamento numerado.</w:t>
+            </w:r>
+          </w:p>
+        </w:tc>
+      </w:tr>
+      <w:tr>
+        <w:tc>
+          <w:tcPr>
+            <w:tcW w:type="dxa" w:w="5040"/>
+          </w:tcPr>
+          <w:p>
+            <w:pPr>
+              <w:spacing w:after="0"/>
+            </w:pPr>
+            <w:r/>
+            <w:r>
+              <w:rPr>
+                <w:rFonts w:ascii="Cascadia Code" w:hAnsi="Cascadia Code"/>
+                <w:b/>
+                <w:color w:val="6A78F6"/>
+                <w:sz w:val="16"/>
+              </w:rPr>
+              <w:t>Formulário</w:t>
+            </w:r>
+          </w:p>
+        </w:tc>
+        <w:tc>
+          <w:tcPr>
+            <w:tcW w:type="dxa" w:w="5040"/>
+          </w:tcPr>
+          <w:p>
+            <w:pPr>
+              <w:spacing w:after="0"/>
+            </w:pPr>
+            <w:r/>
+            <w:r>
+              <w:rPr>
+                <w:rFonts w:ascii="Cascadia Code" w:hAnsi="Cascadia Code"/>
+                <w:b w:val="0"/>
+                <w:color w:val="18132E"/>
+                <w:sz w:val="16"/>
+              </w:rPr>
+              <w:t>Passou a ser o protagonista já no primeiro viewport.</w:t>
+            </w:r>
+          </w:p>
+        </w:tc>
+      </w:tr>
+      <w:tr>
+        <w:tc>
+          <w:tcPr>
+            <w:tcW w:type="dxa" w:w="5040"/>
+          </w:tcPr>
+          <w:p>
+            <w:pPr>
+              <w:spacing w:after="0"/>
+            </w:pPr>
+            <w:r/>
+            <w:r>
+              <w:rPr>
+                <w:rFonts w:ascii="Cascadia Code" w:hAnsi="Cascadia Code"/>
+                <w:b/>
+                <w:color w:val="6A78F6"/>
+                <w:sz w:val="16"/>
+              </w:rPr>
+              <w:t>Canais</w:t>
+            </w:r>
+          </w:p>
+        </w:tc>
+        <w:tc>
+          <w:tcPr>
+            <w:tcW w:type="dxa" w:w="5040"/>
+          </w:tcPr>
+          <w:p>
+            <w:pPr>
+              <w:spacing w:after="0"/>
+            </w:pPr>
+            <w:r/>
+            <w:r>
+              <w:rPr>
+                <w:rFonts w:ascii="Cascadia Code" w:hAnsi="Cascadia Code"/>
+                <w:b w:val="0"/>
+                <w:color w:val="18132E"/>
+                <w:sz w:val="16"/>
+              </w:rPr>
+              <w:t>WhatsApp e e-mail permanecem como canais diretos. O diagnóstico permanece como caminho textual complementar.</w:t>
+            </w:r>
+          </w:p>
+        </w:tc>
+      </w:tr>
+      <w:tr>
+        <w:tc>
+          <w:tcPr>
+            <w:tcW w:type="dxa" w:w="5040"/>
+          </w:tcPr>
+          <w:p>
+            <w:pPr>
+              <w:spacing w:after="0"/>
+            </w:pPr>
+            <w:r/>
+            <w:r>
+              <w:rPr>
+                <w:rFonts w:ascii="Cascadia Code" w:hAnsi="Cascadia Code"/>
+                <w:b/>
+                <w:color w:val="6A78F6"/>
+                <w:sz w:val="16"/>
+              </w:rPr>
+              <w:t>Motion</w:t>
+            </w:r>
+          </w:p>
+        </w:tc>
+        <w:tc>
+          <w:tcPr>
+            <w:tcW w:type="dxa" w:w="5040"/>
+          </w:tcPr>
+          <w:p>
+            <w:pPr>
+              <w:spacing w:after="0"/>
+            </w:pPr>
+            <w:r/>
+            <w:r>
+              <w:rPr>
+                <w:rFonts w:ascii="Cascadia Code" w:hAnsi="Cascadia Code"/>
+                <w:b w:val="0"/>
+                <w:color w:val="18132E"/>
+                <w:sz w:val="16"/>
+              </w:rPr>
+              <w:t>Motion de scroll e stagger removido. O residual é um settle curto do formulário. Reduced motion apresenta a página de forma estática.</w:t>
+            </w:r>
+          </w:p>
+        </w:tc>
+      </w:tr>
+      <w:tr>
+        <w:tc>
+          <w:tcPr>
+            <w:tcW w:type="dxa" w:w="5040"/>
+          </w:tcPr>
+          <w:p>
+            <w:pPr>
+              <w:spacing w:after="0"/>
+            </w:pPr>
+            <w:r/>
+            <w:r>
+              <w:rPr>
+                <w:rFonts w:ascii="Cascadia Code" w:hAnsi="Cascadia Code"/>
+                <w:b/>
+                <w:color w:val="6A78F6"/>
+                <w:sz w:val="16"/>
+              </w:rPr>
+              <w:t>QA</w:t>
+            </w:r>
+          </w:p>
+        </w:tc>
+        <w:tc>
+          <w:tcPr>
+            <w:tcW w:type="dxa" w:w="5040"/>
+          </w:tcPr>
+          <w:p>
+            <w:pPr>
+              <w:spacing w:after="0"/>
+            </w:pPr>
+            <w:r/>
+            <w:r>
+              <w:rPr>
+                <w:rFonts w:ascii="Cascadia Code" w:hAnsi="Cascadia Code"/>
+                <w:b w:val="0"/>
+                <w:color w:val="18132E"/>
+                <w:sz w:val="16"/>
+              </w:rPr>
+              <w:t>5 arquivos / 43 testes, typecheck aprovado, build aprovado e git diff --check limpo. Sem overflow em 1440, 1024, 390 e 360. pageerror vazio.</w:t>
+            </w:r>
+          </w:p>
+        </w:tc>
+      </w:tr>
+      <w:tr>
+        <w:tc>
+          <w:tcPr>
+            <w:tcW w:type="dxa" w:w="5040"/>
+          </w:tcPr>
+          <w:p>
+            <w:pPr>
+              <w:spacing w:after="0"/>
+            </w:pPr>
+            <w:r/>
+            <w:r>
+              <w:rPr>
+                <w:rFonts w:ascii="Cascadia Code" w:hAnsi="Cascadia Code"/>
+                <w:b/>
+                <w:color w:val="6A78F6"/>
+                <w:sz w:val="16"/>
+              </w:rPr>
+              <w:t>Git</w:t>
+            </w:r>
+          </w:p>
+        </w:tc>
+        <w:tc>
+          <w:tcPr>
+            <w:tcW w:type="dxa" w:w="5040"/>
+          </w:tcPr>
+          <w:p>
+            <w:pPr>
+              <w:spacing w:after="0"/>
+            </w:pPr>
+            <w:r/>
+            <w:r>
+              <w:rPr>
+                <w:rFonts w:ascii="Cascadia Code" w:hAnsi="Cascadia Code"/>
+                <w:b w:val="0"/>
+                <w:color w:val="18132E"/>
+                <w:sz w:val="16"/>
+              </w:rPr>
+              <w:t>606d6e4413f2482d22b66e44220dd84f5f4ed372 — feat: simplify contact into conversation entry. Push 5df7c85..606d6e4 para origin/feat/site-launch-core.</w:t>
+            </w:r>
+          </w:p>
+        </w:tc>
+      </w:tr>
+    </w:tbl>
+    <w:p>
+      <w:pPr>
+        <w:pStyle w:val="Heading1"/>
+      </w:pPr>
+      <w:r>
+        <w:t>38. CONTATO /contato — PORTA PARA CONVERSA</w:t>
+      </w:r>
+    </w:p>
+    <w:p>
+      <w:pPr>
+        <w:ind w:left="317" w:hanging="173"/>
+      </w:pPr>
+      <w:r>
+        <w:rPr>
+          <w:rFonts w:ascii="Cascadia Code" w:hAnsi="Cascadia Code"/>
+          <w:b w:val="0"/>
+          <w:color w:val="18132E"/>
+          <w:sz w:val="18"/>
+        </w:rPr>
+        <w:t>• Status: APROVADO VISUALMENTE · CONGELADO.</w:t>
+      </w:r>
+    </w:p>
+    <w:p>
+      <w:pPr>
+        <w:ind w:left="317" w:hanging="173"/>
+      </w:pPr>
+      <w:r>
+        <w:rPr>
+          <w:rFonts w:ascii="Cascadia Code" w:hAnsi="Cascadia Code"/>
+          <w:b w:val="0"/>
+          <w:color w:val="18132E"/>
+          <w:sz w:val="18"/>
+        </w:rPr>
+        <w:t>• A página deixou de funcionar como landing editorial longa.</w:t>
+      </w:r>
+    </w:p>
+    <w:p>
+      <w:pPr>
+        <w:ind w:left="317" w:hanging="173"/>
+      </w:pPr>
+      <w:r>
+        <w:rPr>
+          <w:rFonts w:ascii="Cascadia Code" w:hAnsi="Cascadia Code"/>
+          <w:b w:val="0"/>
+          <w:color w:val="18132E"/>
+          <w:sz w:val="18"/>
+        </w:rPr>
+        <w:t>• O hero 60/40 foi removido.</w:t>
+      </w:r>
+    </w:p>
+    <w:p>
+      <w:pPr>
+        <w:ind w:left="317" w:hanging="173"/>
+      </w:pPr>
+      <w:r>
+        <w:rPr>
+          <w:rFonts w:ascii="Cascadia Code" w:hAnsi="Cascadia Code"/>
+          <w:b w:val="0"/>
+          <w:color w:val="18132E"/>
+          <w:sz w:val="18"/>
+        </w:rPr>
+        <w:t>• O trilho 01→02 foi removido.</w:t>
+      </w:r>
+    </w:p>
+    <w:p>
+      <w:pPr>
+        <w:ind w:left="317" w:hanging="173"/>
+      </w:pPr>
+      <w:r>
+        <w:rPr>
+          <w:rFonts w:ascii="Cascadia Code" w:hAnsi="Cascadia Code"/>
+          <w:b w:val="0"/>
+          <w:color w:val="18132E"/>
+          <w:sz w:val="18"/>
+        </w:rPr>
+        <w:t>• A ponte “03 · Escrever o contexto” foi removida.</w:t>
+      </w:r>
+    </w:p>
+    <w:p>
+      <w:pPr>
+        <w:ind w:left="317" w:hanging="173"/>
+      </w:pPr>
+      <w:r>
+        <w:rPr>
+          <w:rFonts w:ascii="Cascadia Code" w:hAnsi="Cascadia Code"/>
+          <w:b w:val="0"/>
+          <w:color w:val="18132E"/>
+          <w:sz w:val="18"/>
+        </w:rPr>
+        <w:t>• O painel lavanda foi removido.</w:t>
+      </w:r>
+    </w:p>
+    <w:p>
+      <w:pPr>
+        <w:ind w:left="317" w:hanging="173"/>
+      </w:pPr>
+      <w:r>
+        <w:rPr>
+          <w:rFonts w:ascii="Cascadia Code" w:hAnsi="Cascadia Code"/>
+          <w:b w:val="0"/>
+          <w:color w:val="18132E"/>
+          <w:sz w:val="18"/>
+        </w:rPr>
+        <w:t>• O fechamento numerado foi removido.</w:t>
+      </w:r>
+    </w:p>
+    <w:p>
+      <w:pPr>
+        <w:ind w:left="317" w:hanging="173"/>
+      </w:pPr>
+      <w:r>
+        <w:rPr>
+          <w:rFonts w:ascii="Cascadia Code" w:hAnsi="Cascadia Code"/>
+          <w:b w:val="0"/>
+          <w:color w:val="18132E"/>
+          <w:sz w:val="18"/>
+        </w:rPr>
+        <w:t>• O motion de scroll e o stagger foram removidos.</w:t>
+      </w:r>
+    </w:p>
+    <w:p>
+      <w:pPr>
+        <w:ind w:left="317" w:hanging="173"/>
+      </w:pPr>
+      <w:r>
+        <w:rPr>
+          <w:rFonts w:ascii="Cascadia Code" w:hAnsi="Cascadia Code"/>
+          <w:b w:val="0"/>
+          <w:color w:val="18132E"/>
+          <w:sz w:val="18"/>
+        </w:rPr>
+        <w:t>• O formulário passou a ser o protagonista já no primeiro viewport.</w:t>
+      </w:r>
+    </w:p>
+    <w:p>
+      <w:pPr>
+        <w:ind w:left="317" w:hanging="173"/>
+      </w:pPr>
+      <w:r>
+        <w:rPr>
+          <w:rFonts w:ascii="Cascadia Code" w:hAnsi="Cascadia Code"/>
+          <w:b w:val="0"/>
+          <w:color w:val="18132E"/>
+          <w:sz w:val="18"/>
+        </w:rPr>
+        <w:t>• WhatsApp e e-mail permanecem como canais diretos.</w:t>
+      </w:r>
+    </w:p>
+    <w:p>
+      <w:pPr>
+        <w:ind w:left="317" w:hanging="173"/>
+      </w:pPr>
+      <w:r>
+        <w:rPr>
+          <w:rFonts w:ascii="Cascadia Code" w:hAnsi="Cascadia Code"/>
+          <w:b w:val="0"/>
+          <w:color w:val="18132E"/>
+          <w:sz w:val="18"/>
+        </w:rPr>
+        <w:t>• O diagnóstico permanece como caminho textual complementar.</w:t>
+      </w:r>
+    </w:p>
+    <w:p>
+      <w:pPr>
+        <w:ind w:left="317" w:hanging="173"/>
+      </w:pPr>
+      <w:r>
+        <w:rPr>
+          <w:rFonts w:ascii="Cascadia Code" w:hAnsi="Cascadia Code"/>
+          <w:b w:val="0"/>
+          <w:color w:val="18132E"/>
+          <w:sz w:val="18"/>
+        </w:rPr>
+        <w:t>• O motion residual fica limitado a um settle curto do formulário.</w:t>
+      </w:r>
+    </w:p>
+    <w:p>
+      <w:pPr>
+        <w:ind w:left="317" w:hanging="173"/>
+      </w:pPr>
+      <w:r>
+        <w:rPr>
+          <w:rFonts w:ascii="Cascadia Code" w:hAnsi="Cascadia Code"/>
+          <w:b w:val="0"/>
+          <w:color w:val="18132E"/>
+          <w:sz w:val="18"/>
+        </w:rPr>
+        <w:t>• Reduced motion apresenta a página de forma estática.</w:t>
+      </w:r>
+    </w:p>
+    <w:p>
+      <w:pPr>
+        <w:pStyle w:val="Heading1"/>
+      </w:pPr>
+      <w:r>
+        <w:t>39. FUNCIONALIDADE PRESERVADA</w:t>
+      </w:r>
+    </w:p>
+    <w:p>
+      <w:pPr>
+        <w:ind w:left="317" w:hanging="173"/>
+      </w:pPr>
+      <w:r>
+        <w:rPr>
+          <w:rFonts w:ascii="Cascadia Code" w:hAnsi="Cascadia Code"/>
+          <w:b w:val="0"/>
+          <w:color w:val="18132E"/>
+          <w:sz w:val="18"/>
+        </w:rPr>
+        <w:t>• Validação Zod preservada.</w:t>
+      </w:r>
+    </w:p>
+    <w:p>
+      <w:pPr>
+        <w:ind w:left="317" w:hanging="173"/>
+      </w:pPr>
+      <w:r>
+        <w:rPr>
+          <w:rFonts w:ascii="Cascadia Code" w:hAnsi="Cascadia Code"/>
+          <w:b w:val="0"/>
+          <w:color w:val="18132E"/>
+          <w:sz w:val="18"/>
+        </w:rPr>
+        <w:t>• Select de tipo preservado.</w:t>
+      </w:r>
+    </w:p>
+    <w:p>
+      <w:pPr>
+        <w:ind w:left="317" w:hanging="173"/>
+      </w:pPr>
+      <w:r>
+        <w:rPr>
+          <w:rFonts w:ascii="Cascadia Code" w:hAnsi="Cascadia Code"/>
+          <w:b w:val="0"/>
+          <w:color w:val="18132E"/>
+          <w:sz w:val="18"/>
+        </w:rPr>
+        <w:t>• Submit via submitLead preservado.</w:t>
+      </w:r>
+    </w:p>
+    <w:p>
+      <w:pPr>
+        <w:ind w:left="317" w:hanging="173"/>
+      </w:pPr>
+      <w:r>
+        <w:rPr>
+          <w:rFonts w:ascii="Cascadia Code" w:hAnsi="Cascadia Code"/>
+          <w:b w:val="0"/>
+          <w:color w:val="18132E"/>
+          <w:sz w:val="18"/>
+        </w:rPr>
+        <w:t>• Toasts preservados.</w:t>
+      </w:r>
+    </w:p>
+    <w:p>
+      <w:pPr>
+        <w:ind w:left="317" w:hanging="173"/>
+      </w:pPr>
+      <w:r>
+        <w:rPr>
+          <w:rFonts w:ascii="Cascadia Code" w:hAnsi="Cascadia Code"/>
+          <w:b w:val="0"/>
+          <w:color w:val="18132E"/>
+          <w:sz w:val="18"/>
+        </w:rPr>
+        <w:t>• Estado de sucesso preservado.</w:t>
+      </w:r>
+    </w:p>
+    <w:p>
+      <w:pPr>
+        <w:ind w:left="317" w:hanging="173"/>
+      </w:pPr>
+      <w:r>
+        <w:rPr>
+          <w:rFonts w:ascii="Cascadia Code" w:hAnsi="Cascadia Code"/>
+          <w:b w:val="0"/>
+          <w:color w:val="18132E"/>
+          <w:sz w:val="18"/>
+        </w:rPr>
+        <w:t>• WhatsApp: +55 61 99174-8651.</w:t>
+      </w:r>
+    </w:p>
+    <w:p>
+      <w:pPr>
+        <w:ind w:left="317" w:hanging="173"/>
+      </w:pPr>
+      <w:r>
+        <w:rPr>
+          <w:rFonts w:ascii="Cascadia Code" w:hAnsi="Cascadia Code"/>
+          <w:b w:val="0"/>
+          <w:color w:val="18132E"/>
+          <w:sz w:val="18"/>
+        </w:rPr>
+        <w:t>• E-mail: contato@dreamscraftcode.com.</w:t>
+      </w:r>
+    </w:p>
+    <w:p>
+      <w:pPr>
+        <w:ind w:left="317" w:hanging="173"/>
+      </w:pPr>
+      <w:r>
+        <w:rPr>
+          <w:rFonts w:ascii="Cascadia Code" w:hAnsi="Cascadia Code"/>
+          <w:b w:val="0"/>
+          <w:color w:val="18132E"/>
+          <w:sz w:val="18"/>
+        </w:rPr>
+        <w:t>• SEO preservado.</w:t>
+      </w:r>
+    </w:p>
+    <w:p>
+      <w:pPr>
+        <w:ind w:left="317" w:hanging="173"/>
+      </w:pPr>
+      <w:r>
+        <w:rPr>
+          <w:rFonts w:ascii="Cascadia Code" w:hAnsi="Cascadia Code"/>
+          <w:b w:val="0"/>
+          <w:color w:val="18132E"/>
+          <w:sz w:val="18"/>
+        </w:rPr>
+        <w:t>• Não há prazo de resposta, SLA, horário ou endereço registrados, porque esses dados não foram confirmados.</w:t>
+      </w:r>
+    </w:p>
+    <w:p>
+      <w:pPr>
+        <w:pStyle w:val="Heading1"/>
+      </w:pPr>
+      <w:r>
+        <w:t>40. QA DO CONTATO</w:t>
+      </w:r>
+    </w:p>
+    <w:p>
+      <w:pPr>
+        <w:ind w:left="317" w:hanging="173"/>
+      </w:pPr>
+      <w:r>
+        <w:rPr>
+          <w:rFonts w:ascii="Cascadia Code" w:hAnsi="Cascadia Code"/>
+          <w:b w:val="0"/>
+          <w:color w:val="18132E"/>
+          <w:sz w:val="18"/>
+        </w:rPr>
+        <w:t>• bun run test: 5 arquivos / 43 testes passando.</w:t>
+      </w:r>
+    </w:p>
+    <w:p>
+      <w:pPr>
+        <w:ind w:left="317" w:hanging="173"/>
+      </w:pPr>
+      <w:r>
+        <w:rPr>
+          <w:rFonts w:ascii="Cascadia Code" w:hAnsi="Cascadia Code"/>
+          <w:b w:val="0"/>
+          <w:color w:val="18132E"/>
+          <w:sz w:val="18"/>
+        </w:rPr>
+        <w:t>• bunx tsc --noEmit: aprovado.</w:t>
+      </w:r>
+    </w:p>
+    <w:p>
+      <w:pPr>
+        <w:ind w:left="317" w:hanging="173"/>
+      </w:pPr>
+      <w:r>
+        <w:rPr>
+          <w:rFonts w:ascii="Cascadia Code" w:hAnsi="Cascadia Code"/>
+          <w:b w:val="0"/>
+          <w:color w:val="18132E"/>
+          <w:sz w:val="18"/>
+        </w:rPr>
+        <w:t>• bun run build: aprovado.</w:t>
+      </w:r>
+    </w:p>
+    <w:p>
+      <w:pPr>
+        <w:ind w:left="317" w:hanging="173"/>
+      </w:pPr>
+      <w:r>
+        <w:rPr>
+          <w:rFonts w:ascii="Cascadia Code" w:hAnsi="Cascadia Code"/>
+          <w:b w:val="0"/>
+          <w:color w:val="18132E"/>
+          <w:sz w:val="18"/>
+        </w:rPr>
+        <w:t>• git diff --check: limpo.</w:t>
+      </w:r>
+    </w:p>
+    <w:p>
+      <w:pPr>
+        <w:ind w:left="317" w:hanging="173"/>
+      </w:pPr>
+      <w:r>
+        <w:rPr>
+          <w:rFonts w:ascii="Cascadia Code" w:hAnsi="Cascadia Code"/>
+          <w:b w:val="0"/>
+          <w:color w:val="18132E"/>
+          <w:sz w:val="18"/>
+        </w:rPr>
+        <w:t>• Sem overflow em 1440, 1024, 390 e 360.</w:t>
+      </w:r>
+    </w:p>
+    <w:p>
+      <w:pPr>
+        <w:ind w:left="317" w:hanging="173"/>
+      </w:pPr>
+      <w:r>
+        <w:rPr>
+          <w:rFonts w:ascii="Cascadia Code" w:hAnsi="Cascadia Code"/>
+          <w:b w:val="0"/>
+          <w:color w:val="18132E"/>
+          <w:sz w:val="18"/>
+        </w:rPr>
+        <w:t>• pageerror vazio.</w:t>
+      </w:r>
+    </w:p>
+    <w:p>
+      <w:pPr>
+        <w:ind w:left="317" w:hanging="173"/>
+      </w:pPr>
+      <w:r>
+        <w:rPr>
+          <w:rFonts w:ascii="Cascadia Code" w:hAnsi="Cascadia Code"/>
+          <w:b w:val="0"/>
+          <w:color w:val="18132E"/>
+          <w:sz w:val="18"/>
+        </w:rPr>
+        <w:t>• Navegação por Tab e Shift+Tab validada.</w:t>
+      </w:r>
+    </w:p>
+    <w:p>
+      <w:pPr>
+        <w:ind w:left="317" w:hanging="173"/>
+      </w:pPr>
+      <w:r>
+        <w:rPr>
+          <w:rFonts w:ascii="Cascadia Code" w:hAnsi="Cascadia Code"/>
+          <w:b w:val="0"/>
+          <w:color w:val="18132E"/>
+          <w:sz w:val="18"/>
+        </w:rPr>
+        <w:t>• Enter com formulário vazio mantém a validação no cliente.</w:t>
+      </w:r>
+    </w:p>
+    <w:p>
+      <w:pPr>
+        <w:ind w:left="317" w:hanging="173"/>
+      </w:pPr>
+      <w:r>
+        <w:rPr>
+          <w:rFonts w:ascii="Cascadia Code" w:hAnsi="Cascadia Code"/>
+          <w:b w:val="0"/>
+          <w:color w:val="18132E"/>
+          <w:sz w:val="18"/>
+        </w:rPr>
+        <w:t>• Mensagens observadas: “Informe seu nome”; “Email inválido”; “Conte um pouco mais”.</w:t>
+      </w:r>
+    </w:p>
+    <w:p>
+      <w:pPr>
+        <w:pStyle w:val="Heading1"/>
+      </w:pPr>
+      <w:r>
+        <w:t>41. GIT</w:t>
+      </w:r>
+    </w:p>
+    <w:p>
+      <w:pPr>
+        <w:ind w:left="317" w:hanging="173"/>
+      </w:pPr>
+      <w:r>
+        <w:rPr>
+          <w:rFonts w:ascii="Cascadia Code" w:hAnsi="Cascadia Code"/>
+          <w:b w:val="0"/>
+          <w:color w:val="18132E"/>
+          <w:sz w:val="18"/>
+        </w:rPr>
+        <w:t>• Commit funcional: 606d6e4413f2482d22b66e44220dd84f5f4ed372.</w:t>
+      </w:r>
+    </w:p>
+    <w:p>
+      <w:pPr>
+        <w:ind w:left="317" w:hanging="173"/>
+      </w:pPr>
+      <w:r>
+        <w:rPr>
+          <w:rFonts w:ascii="Cascadia Code" w:hAnsi="Cascadia Code"/>
+          <w:b w:val="0"/>
+          <w:color w:val="18132E"/>
+          <w:sz w:val="18"/>
+        </w:rPr>
+        <w:t>• Mensagem: feat: simplify contact into conversation entry.</w:t>
+      </w:r>
+    </w:p>
+    <w:p>
+      <w:pPr>
+        <w:ind w:left="317" w:hanging="173"/>
+      </w:pPr>
+      <w:r>
+        <w:rPr>
+          <w:rFonts w:ascii="Cascadia Code" w:hAnsi="Cascadia Code"/>
+          <w:b w:val="0"/>
+          <w:color w:val="18132E"/>
+          <w:sz w:val="18"/>
+        </w:rPr>
+        <w:t>• Branch: feat/site-launch-core.</w:t>
+      </w:r>
+    </w:p>
+    <w:p>
+      <w:pPr>
+        <w:ind w:left="317" w:hanging="173"/>
+      </w:pPr>
+      <w:r>
+        <w:rPr>
+          <w:rFonts w:ascii="Cascadia Code" w:hAnsi="Cascadia Code"/>
+          <w:b w:val="0"/>
+          <w:color w:val="18132E"/>
+          <w:sz w:val="18"/>
+        </w:rPr>
+        <w:t>• Push: 5df7c85..606d6e4 para origin/feat/site-launch-core.</w:t>
+      </w:r>
+    </w:p>
+    <w:p>
+      <w:pPr>
+        <w:ind w:left="317" w:hanging="173"/>
+      </w:pPr>
+      <w:r>
+        <w:rPr>
+          <w:rFonts w:ascii="Cascadia Code" w:hAnsi="Cascadia Code"/>
+          <w:b w:val="0"/>
+          <w:color w:val="18132E"/>
+          <w:sz w:val="18"/>
+        </w:rPr>
+        <w:t>• Sem force push, sem merge e sem Pull Request.</w:t>
+      </w:r>
+    </w:p>
+    <w:p>
+      <w:pPr>
+        <w:pStyle w:val="Heading1"/>
+      </w:pPr>
+      <w:r>
+        <w:t>42. GOVERNANÇA</w:t>
+      </w:r>
+    </w:p>
+    <w:p>
+      <w:pPr>
+        <w:ind w:left="317" w:hanging="173"/>
+      </w:pPr>
+      <w:r>
+        <w:rPr>
+          <w:rFonts w:ascii="Cascadia Code" w:hAnsi="Cascadia Code"/>
+          <w:b w:val="0"/>
+          <w:color w:val="18132E"/>
+          <w:sz w:val="18"/>
+        </w:rPr>
+        <w:t>• /contato permanece CONGELADO até nova autorização ou bug concreto.</w:t>
+      </w:r>
+    </w:p>
+    <w:p>
+      <w:pPr>
+        <w:ind w:left="317" w:hanging="173"/>
+      </w:pPr>
+      <w:r>
+        <w:rPr>
+          <w:rFonts w:ascii="Cascadia Code" w:hAnsi="Cascadia Code"/>
+          <w:b w:val="0"/>
+          <w:color w:val="18132E"/>
+          <w:sz w:val="18"/>
+        </w:rPr>
+        <w:t>• /portfolio e /solucoes continuam congelados.</w:t>
+      </w:r>
+    </w:p>
+    <w:p>
+      <w:pPr>
+        <w:ind w:left="317" w:hanging="173"/>
+      </w:pPr>
+      <w:r>
+        <w:rPr>
+          <w:rFonts w:ascii="Cascadia Code" w:hAnsi="Cascadia Code"/>
+          <w:b w:val="0"/>
+          <w:color w:val="18132E"/>
+          <w:sz w:val="18"/>
+        </w:rPr>
+        <w:t>• Pendência técnica da próxima rodada: /portfolio, Secretária.Code, bloco “FLUXO ATUAL”.</w:t>
+      </w:r>
+    </w:p>
+    <w:p>
+      <w:pPr>
+        <w:ind w:left="317" w:hanging="173"/>
+      </w:pPr>
+      <w:r>
+        <w:rPr>
+          <w:rFonts w:ascii="Cascadia Code" w:hAnsi="Cascadia Code"/>
+          <w:b w:val="0"/>
+          <w:color w:val="18132E"/>
+          <w:sz w:val="18"/>
+        </w:rPr>
+        <w:t>• O motion ligado ao scroll progride ao descer, mas não retorna corretamente ao subir.</w:t>
+      </w:r>
+    </w:p>
+    <w:p>
+      <w:pPr>
+        <w:ind w:left="317" w:hanging="173"/>
+      </w:pPr>
+      <w:r>
+        <w:rPr>
+          <w:rFonts w:ascii="Cascadia Code" w:hAnsi="Cascadia Code"/>
+          <w:b w:val="0"/>
+          <w:color w:val="18132E"/>
+          <w:sz w:val="18"/>
+        </w:rPr>
+        <w:t>• Classificação: BUG CONCRETO. Não é redesign.</w:t>
+      </w:r>
+    </w:p>
+    <w:p>
+      <w:pPr>
+        <w:ind w:left="317" w:hanging="173"/>
+      </w:pPr>
+      <w:r>
+        <w:rPr>
+          <w:rFonts w:ascii="Cascadia Code" w:hAnsi="Cascadia Code"/>
+          <w:b w:val="0"/>
+          <w:color w:val="18132E"/>
+          <w:sz w:val="18"/>
+        </w:rPr>
+        <w:t>• Planejamento futuro, sem execução agora: a Home ainda deve ser revisitada para reduzir a estrutura recorrente de headline grande de um lado e visual explicativo do outro.</w:t>
+      </w:r>
+    </w:p>
+    <w:p>
+      <w:pPr>
+        <w:pStyle w:val="Heading1"/>
+      </w:pPr>
+      <w:r>
+        <w:t>43. PRÓXIMO MARCO</w:t>
+      </w:r>
+    </w:p>
+    <w:tbl>
+      <w:tblPr>
+        <w:tblW w:type="auto" w:w="0"/>
+        <w:jc w:val="left"/>
+        <w:tblLook w:firstColumn="1" w:firstRow="1" w:lastColumn="0" w:lastRow="0" w:noHBand="0" w:noVBand="1" w:val="04A0"/>
+      </w:tblPr>
+      <w:tblGrid>
+        <w:gridCol w:w="5040"/>
+        <w:gridCol w:w="5040"/>
+      </w:tblGrid>
+      <w:tr>
+        <w:tc>
+          <w:tcPr>
+            <w:tcW w:type="dxa" w:w="5040"/>
+            <w:shd w:fill="FFF3F8"/>
+          </w:tcPr>
+          <w:p>
+            <w:pPr>
+              <w:spacing w:after="0"/>
+            </w:pPr>
+            <w:r/>
+            <w:r>
+              <w:rPr>
+                <w:rFonts w:ascii="Cascadia Code" w:hAnsi="Cascadia Code"/>
+                <w:b/>
+                <w:color w:val="AF66F9"/>
+                <w:sz w:val="16"/>
+              </w:rPr>
+              <w:t>PRÓXIMO</w:t>
+            </w:r>
+          </w:p>
+        </w:tc>
+        <w:tc>
+          <w:tcPr>
+            <w:tcW w:type="dxa" w:w="5040"/>
+            <w:shd w:fill="FFF3F8"/>
+          </w:tcPr>
+          <w:p>
+            <w:pPr>
+              <w:spacing w:after="0"/>
+            </w:pPr>
+            <w:r/>
+            <w:r>
+              <w:rPr>
+                <w:rFonts w:ascii="Cascadia Code" w:hAnsi="Cascadia Code"/>
+                <w:b w:val="0"/>
+                <w:color w:val="18132E"/>
+                <w:sz w:val="17"/>
+              </w:rPr>
+              <w:t>Bug concreto no bloco “FLUXO ATUAL” da Secretária.Code, em /portfolio: o motion do scroll avança ao descer e não retorna corretamente ao subir. Não é redesign. /contato, /portfolio e /solucoes permanecem congelados. A revisão da composição da Home fica só como planejamento futuro.</w:t>
+            </w:r>
+          </w:p>
+        </w:tc>
+      </w:tr>
+    </w:tbl>
     <w:sectPr>
       <w:footerReference w:type="default" r:id="rId9"/>
       <w:headerReference w:type="default" r:id="rId10"/>

</xml_diff>

<commit_message>
docs: record secretary flow hotfix
Co-authored-by: Cursor <cursoragent@cursor.com>
</commit_message>
<xml_diff>
--- a/docs/DREAMSCRAFT_SITE_REGISTRO_DESENVOLVIMENTO.docx
+++ b/docs/DREAMSCRAFT_SITE_REGISTRO_DESENVOLVIMENTO.docx
@@ -52,7 +52,7 @@
           <w:color w:val="625B72"/>
           <w:sz w:val="18"/>
         </w:rPr>
-        <w:t>Versão 1.5  ·  25/10/2026</w:t>
+        <w:t>Versão 1.6  ·  25/10/2026</w:t>
       </w:r>
     </w:p>
     <w:tbl>
@@ -7379,6 +7379,1103 @@
                 <w:sz w:val="17"/>
               </w:rPr>
               <w:t>Bug concreto no bloco “FLUXO ATUAL” da Secretária.Code, em /portfolio: o motion do scroll avança ao descer e não retorna corretamente ao subir. Não é redesign. /contato, /portfolio e /solucoes permanecem congelados. A revisão da composição da Home fica só como planejamento futuro.</w:t>
+            </w:r>
+          </w:p>
+        </w:tc>
+      </w:tr>
+    </w:tbl>
+    <w:p>
+      <w:pPr>
+        <w:pStyle w:val="Heading1"/>
+      </w:pPr>
+      <w:r>
+        <w:t>44. 25/10/2026 · MARCO — SECRETÁRIA.CODE · FLUXO ATUAL</w:t>
+      </w:r>
+    </w:p>
+    <w:tbl>
+      <w:tblPr>
+        <w:tblW w:type="auto" w:w="0"/>
+        <w:jc w:val="left"/>
+        <w:tblLook w:firstColumn="1" w:firstRow="1" w:lastColumn="0" w:lastRow="0" w:noHBand="0" w:noVBand="1" w:val="04A0"/>
+      </w:tblPr>
+      <w:tblGrid>
+        <w:gridCol w:w="5040"/>
+        <w:gridCol w:w="5040"/>
+      </w:tblGrid>
+      <w:tr>
+        <w:tc>
+          <w:tcPr>
+            <w:tcW w:type="dxa" w:w="5040"/>
+            <w:shd w:fill="F1F3FF"/>
+          </w:tcPr>
+          <w:p>
+            <w:pPr>
+              <w:spacing w:after="0"/>
+            </w:pPr>
+            <w:r/>
+            <w:r>
+              <w:rPr>
+                <w:rFonts w:ascii="Cascadia Code" w:hAnsi="Cascadia Code"/>
+                <w:b/>
+                <w:color w:val="6A78F6"/>
+                <w:sz w:val="16"/>
+              </w:rPr>
+              <w:t>MARCO</w:t>
+            </w:r>
+          </w:p>
+        </w:tc>
+        <w:tc>
+          <w:tcPr>
+            <w:tcW w:type="dxa" w:w="5040"/>
+            <w:shd w:fill="F1F3FF"/>
+          </w:tcPr>
+          <w:p>
+            <w:pPr>
+              <w:spacing w:after="0"/>
+            </w:pPr>
+            <w:r/>
+            <w:r>
+              <w:rPr>
+                <w:rFonts w:ascii="Cascadia Code" w:hAnsi="Cascadia Code"/>
+                <w:b w:val="0"/>
+                <w:color w:val="18132E"/>
+                <w:sz w:val="17"/>
+              </w:rPr>
+              <w:t>Hotfix concluído no bloco “FLUXO ATUAL” da Secretária.Code. O progresso visual voltou a acompanhar a posição atual do scroll nos dois sentidos. O commit funcional c1e8c55 está na branch feat/site-launch-core. Push 93420ec..c1e8c55 para origin, sem force push, sem merge e sem Pull Request.</w:t>
+            </w:r>
+          </w:p>
+        </w:tc>
+      </w:tr>
+    </w:tbl>
+    <w:tbl>
+      <w:tblPr>
+        <w:tblW w:type="auto" w:w="0"/>
+        <w:jc w:val="center"/>
+        <w:tblLook w:firstColumn="1" w:firstRow="1" w:lastColumn="0" w:lastRow="0" w:noHBand="0" w:noVBand="1" w:val="04A0"/>
+      </w:tblPr>
+      <w:tblGrid>
+        <w:gridCol w:w="5040"/>
+        <w:gridCol w:w="5040"/>
+      </w:tblGrid>
+      <w:tr>
+        <w:tc>
+          <w:tcPr>
+            <w:tcW w:type="dxa" w:w="5040"/>
+            <w:shd w:fill="21104E"/>
+          </w:tcPr>
+          <w:p>
+            <w:pPr>
+              <w:spacing w:after="0"/>
+            </w:pPr>
+            <w:r/>
+            <w:r>
+              <w:rPr>
+                <w:rFonts w:ascii="Cascadia Code" w:hAnsi="Cascadia Code"/>
+                <w:b/>
+                <w:color w:val="EFE5FD"/>
+                <w:sz w:val="16"/>
+              </w:rPr>
+              <w:t>ITEM</w:t>
+            </w:r>
+          </w:p>
+        </w:tc>
+        <w:tc>
+          <w:tcPr>
+            <w:tcW w:type="dxa" w:w="5040"/>
+            <w:shd w:fill="21104E"/>
+          </w:tcPr>
+          <w:p>
+            <w:pPr>
+              <w:spacing w:after="0"/>
+            </w:pPr>
+            <w:r/>
+            <w:r>
+              <w:rPr>
+                <w:rFonts w:ascii="Cascadia Code" w:hAnsi="Cascadia Code"/>
+                <w:b/>
+                <w:color w:val="EFE5FD"/>
+                <w:sz w:val="16"/>
+              </w:rPr>
+              <w:t>REGISTRO</w:t>
+            </w:r>
+          </w:p>
+        </w:tc>
+      </w:tr>
+      <w:tr>
+        <w:tc>
+          <w:tcPr>
+            <w:tcW w:type="dxa" w:w="5040"/>
+          </w:tcPr>
+          <w:p>
+            <w:pPr>
+              <w:spacing w:after="0"/>
+            </w:pPr>
+            <w:r/>
+            <w:r>
+              <w:rPr>
+                <w:rFonts w:ascii="Cascadia Code" w:hAnsi="Cascadia Code"/>
+                <w:b/>
+                <w:color w:val="6A78F6"/>
+                <w:sz w:val="16"/>
+              </w:rPr>
+              <w:t>Status</w:t>
+            </w:r>
+          </w:p>
+        </w:tc>
+        <w:tc>
+          <w:tcPr>
+            <w:tcW w:type="dxa" w:w="5040"/>
+          </w:tcPr>
+          <w:p>
+            <w:pPr>
+              <w:spacing w:after="0"/>
+            </w:pPr>
+            <w:r/>
+            <w:r>
+              <w:rPr>
+                <w:rFonts w:ascii="Cascadia Code" w:hAnsi="Cascadia Code"/>
+                <w:b w:val="0"/>
+                <w:color w:val="18132E"/>
+                <w:sz w:val="16"/>
+              </w:rPr>
+              <w:t>HOTFIX CONCLUÍDO. Motion bidirecional confirmado sem latch.</w:t>
+            </w:r>
+          </w:p>
+        </w:tc>
+      </w:tr>
+      <w:tr>
+        <w:tc>
+          <w:tcPr>
+            <w:tcW w:type="dxa" w:w="5040"/>
+          </w:tcPr>
+          <w:p>
+            <w:pPr>
+              <w:spacing w:after="0"/>
+            </w:pPr>
+            <w:r/>
+            <w:r>
+              <w:rPr>
+                <w:rFonts w:ascii="Cascadia Code" w:hAnsi="Cascadia Code"/>
+                <w:b/>
+                <w:color w:val="6A78F6"/>
+                <w:sz w:val="16"/>
+              </w:rPr>
+              <w:t>Problema</w:t>
+            </w:r>
+          </w:p>
+        </w:tc>
+        <w:tc>
+          <w:tcPr>
+            <w:tcW w:type="dxa" w:w="5040"/>
+          </w:tcPr>
+          <w:p>
+            <w:pPr>
+              <w:spacing w:after="0"/>
+            </w:pPr>
+            <w:r/>
+            <w:r>
+              <w:rPr>
+                <w:rFonts w:ascii="Cascadia Code" w:hAnsi="Cascadia Code"/>
+                <w:b w:val="0"/>
+                <w:color w:val="18132E"/>
+                <w:sz w:val="16"/>
+              </w:rPr>
+              <w:t>O progresso visual do bloco “FLUXO ATUAL” avançava ao descer, mas permanecia preso ao subir.</w:t>
+            </w:r>
+          </w:p>
+        </w:tc>
+      </w:tr>
+      <w:tr>
+        <w:tc>
+          <w:tcPr>
+            <w:tcW w:type="dxa" w:w="5040"/>
+          </w:tcPr>
+          <w:p>
+            <w:pPr>
+              <w:spacing w:after="0"/>
+            </w:pPr>
+            <w:r/>
+            <w:r>
+              <w:rPr>
+                <w:rFonts w:ascii="Cascadia Code" w:hAnsi="Cascadia Code"/>
+                <w:b/>
+                <w:color w:val="6A78F6"/>
+                <w:sz w:val="16"/>
+              </w:rPr>
+              <w:t>Causa</w:t>
+            </w:r>
+          </w:p>
+        </w:tc>
+        <w:tc>
+          <w:tcPr>
+            <w:tcW w:type="dxa" w:w="5040"/>
+          </w:tcPr>
+          <w:p>
+            <w:pPr>
+              <w:spacing w:after="0"/>
+            </w:pPr>
+            <w:r/>
+            <w:r>
+              <w:rPr>
+                <w:rFonts w:ascii="Cascadia Code" w:hAnsi="Cascadia Code"/>
+                <w:b w:val="0"/>
+                <w:color w:val="18132E"/>
+                <w:sz w:val="16"/>
+              </w:rPr>
+              <w:t>useLatchedProgress mantinha somente o maior progresso já alcançado e ainda forçava o valor 1 no fim da página. useReachedStep só aumentava o índice.</w:t>
+            </w:r>
+          </w:p>
+        </w:tc>
+      </w:tr>
+      <w:tr>
+        <w:tc>
+          <w:tcPr>
+            <w:tcW w:type="dxa" w:w="5040"/>
+          </w:tcPr>
+          <w:p>
+            <w:pPr>
+              <w:spacing w:after="0"/>
+            </w:pPr>
+            <w:r/>
+            <w:r>
+              <w:rPr>
+                <w:rFonts w:ascii="Cascadia Code" w:hAnsi="Cascadia Code"/>
+                <w:b/>
+                <w:color w:val="6A78F6"/>
+                <w:sz w:val="16"/>
+              </w:rPr>
+              <w:t>Correção</w:t>
+            </w:r>
+          </w:p>
+        </w:tc>
+        <w:tc>
+          <w:tcPr>
+            <w:tcW w:type="dxa" w:w="5040"/>
+          </w:tcPr>
+          <w:p>
+            <w:pPr>
+              <w:spacing w:after="0"/>
+            </w:pPr>
+            <w:r/>
+            <w:r>
+              <w:rPr>
+                <w:rFonts w:ascii="Cascadia Code" w:hAnsi="Cascadia Code"/>
+                <w:b w:val="0"/>
+                <w:color w:val="18132E"/>
+                <w:sz w:val="16"/>
+              </w:rPr>
+              <w:t>O bloco deixou de usar progresso acumulado. A posição atual do scroll, no mesmo intervalo da seção, virou foco contínuo de Mensagem a Retorno.</w:t>
+            </w:r>
+          </w:p>
+        </w:tc>
+      </w:tr>
+      <w:tr>
+        <w:tc>
+          <w:tcPr>
+            <w:tcW w:type="dxa" w:w="5040"/>
+          </w:tcPr>
+          <w:p>
+            <w:pPr>
+              <w:spacing w:after="0"/>
+            </w:pPr>
+            <w:r/>
+            <w:r>
+              <w:rPr>
+                <w:rFonts w:ascii="Cascadia Code" w:hAnsi="Cascadia Code"/>
+                <w:b/>
+                <w:color w:val="6A78F6"/>
+                <w:sz w:val="16"/>
+              </w:rPr>
+              <w:t>Escopo</w:t>
+            </w:r>
+          </w:p>
+        </w:tc>
+        <w:tc>
+          <w:tcPr>
+            <w:tcW w:type="dxa" w:w="5040"/>
+          </w:tcPr>
+          <w:p>
+            <w:pPr>
+              <w:spacing w:after="0"/>
+            </w:pPr>
+            <w:r/>
+            <w:r>
+              <w:rPr>
+                <w:rFonts w:ascii="Cascadia Code" w:hAnsi="Cascadia Code"/>
+                <w:b w:val="0"/>
+                <w:color w:val="18132E"/>
+                <w:sz w:val="16"/>
+              </w:rPr>
+              <w:t>Somente src/routes/portfolio.tsx. Composição, copy, cores e espaçamento permaneceram. Cuidadim, Café Orquestra, hero, fechamento e as outras rotas não foram alterados.</w:t>
+            </w:r>
+          </w:p>
+        </w:tc>
+      </w:tr>
+      <w:tr>
+        <w:tc>
+          <w:tcPr>
+            <w:tcW w:type="dxa" w:w="5040"/>
+          </w:tcPr>
+          <w:p>
+            <w:pPr>
+              <w:spacing w:after="0"/>
+            </w:pPr>
+            <w:r/>
+            <w:r>
+              <w:rPr>
+                <w:rFonts w:ascii="Cascadia Code" w:hAnsi="Cascadia Code"/>
+                <w:b/>
+                <w:color w:val="6A78F6"/>
+                <w:sz w:val="16"/>
+              </w:rPr>
+              <w:t>QA</w:t>
+            </w:r>
+          </w:p>
+        </w:tc>
+        <w:tc>
+          <w:tcPr>
+            <w:tcW w:type="dxa" w:w="5040"/>
+          </w:tcPr>
+          <w:p>
+            <w:pPr>
+              <w:spacing w:after="0"/>
+            </w:pPr>
+            <w:r/>
+            <w:r>
+              <w:rPr>
+                <w:rFonts w:ascii="Cascadia Code" w:hAnsi="Cascadia Code"/>
+                <w:b w:val="0"/>
+                <w:color w:val="18132E"/>
+                <w:sz w:val="16"/>
+              </w:rPr>
+              <w:t>43 testes passando, tsc --noEmit aprovado, build aprovado e git diff --check limpo. pageerror []. Sem overflow em 1440. routeTree.gen.ts restaurado. Localhost encerrado.</w:t>
+            </w:r>
+          </w:p>
+        </w:tc>
+      </w:tr>
+      <w:tr>
+        <w:tc>
+          <w:tcPr>
+            <w:tcW w:type="dxa" w:w="5040"/>
+          </w:tcPr>
+          <w:p>
+            <w:pPr>
+              <w:spacing w:after="0"/>
+            </w:pPr>
+            <w:r/>
+            <w:r>
+              <w:rPr>
+                <w:rFonts w:ascii="Cascadia Code" w:hAnsi="Cascadia Code"/>
+                <w:b/>
+                <w:color w:val="6A78F6"/>
+                <w:sz w:val="16"/>
+              </w:rPr>
+              <w:t>Git</w:t>
+            </w:r>
+          </w:p>
+        </w:tc>
+        <w:tc>
+          <w:tcPr>
+            <w:tcW w:type="dxa" w:w="5040"/>
+          </w:tcPr>
+          <w:p>
+            <w:pPr>
+              <w:spacing w:after="0"/>
+            </w:pPr>
+            <w:r/>
+            <w:r>
+              <w:rPr>
+                <w:rFonts w:ascii="Cascadia Code" w:hAnsi="Cascadia Code"/>
+                <w:b w:val="0"/>
+                <w:color w:val="18132E"/>
+                <w:sz w:val="16"/>
+              </w:rPr>
+              <w:t>c1e8c55af7268e568968e9a1881ec70b088c9ae4 — fix: make secretary flow follow scroll bidirectionally. Push 93420ec..c1e8c55 para origin/feat/site-launch-core.</w:t>
+            </w:r>
+          </w:p>
+        </w:tc>
+      </w:tr>
+    </w:tbl>
+    <w:p>
+      <w:pPr>
+        <w:pStyle w:val="Heading1"/>
+      </w:pPr>
+      <w:r>
+        <w:t>45. PROBLEMA REGISTRADO E CAUSA</w:t>
+      </w:r>
+    </w:p>
+    <w:p>
+      <w:pPr>
+        <w:ind w:left="317" w:hanging="173"/>
+      </w:pPr>
+      <w:r>
+        <w:rPr>
+          <w:rFonts w:ascii="Cascadia Code" w:hAnsi="Cascadia Code"/>
+          <w:b w:val="0"/>
+          <w:color w:val="18132E"/>
+          <w:sz w:val="18"/>
+        </w:rPr>
+        <w:t>• Problema registrado anteriormente: o progresso visual do bloco “FLUXO ATUAL” avançava ao descer, mas permanecia preso ao subir.</w:t>
+      </w:r>
+    </w:p>
+    <w:p>
+      <w:pPr>
+        <w:ind w:left="317" w:hanging="173"/>
+      </w:pPr>
+      <w:r>
+        <w:rPr>
+          <w:rFonts w:ascii="Cascadia Code" w:hAnsi="Cascadia Code"/>
+          <w:b w:val="0"/>
+          <w:color w:val="18132E"/>
+          <w:sz w:val="18"/>
+        </w:rPr>
+        <w:t>• useLatchedProgress mantinha somente o maior progresso já alcançado.</w:t>
+      </w:r>
+    </w:p>
+    <w:p>
+      <w:pPr>
+        <w:ind w:left="317" w:hanging="173"/>
+      </w:pPr>
+      <w:r>
+        <w:rPr>
+          <w:rFonts w:ascii="Cascadia Code" w:hAnsi="Cascadia Code"/>
+          <w:b w:val="0"/>
+          <w:color w:val="18132E"/>
+          <w:sz w:val="18"/>
+        </w:rPr>
+        <w:t>• useLatchedProgress ainda forçava o valor 1 no fim da página.</w:t>
+      </w:r>
+    </w:p>
+    <w:p>
+      <w:pPr>
+        <w:ind w:left="317" w:hanging="173"/>
+      </w:pPr>
+      <w:r>
+        <w:rPr>
+          <w:rFonts w:ascii="Cascadia Code" w:hAnsi="Cascadia Code"/>
+          <w:b w:val="0"/>
+          <w:color w:val="18132E"/>
+          <w:sz w:val="18"/>
+        </w:rPr>
+        <w:t>• useReachedStep só aumentava o índice.</w:t>
+      </w:r>
+    </w:p>
+    <w:p>
+      <w:pPr>
+        <w:ind w:left="317" w:hanging="173"/>
+      </w:pPr>
+      <w:r>
+        <w:rPr>
+          <w:rFonts w:ascii="Cascadia Code" w:hAnsi="Cascadia Code"/>
+          <w:b w:val="0"/>
+          <w:color w:val="18132E"/>
+          <w:sz w:val="18"/>
+        </w:rPr>
+        <w:t>• Etapas, nós, contraste, linha e marcador permaneciam no estado já alcançado.</w:t>
+      </w:r>
+    </w:p>
+    <w:p>
+      <w:pPr>
+        <w:pStyle w:val="Heading1"/>
+      </w:pPr>
+      <w:r>
+        <w:t>46. CORREÇÃO</w:t>
+      </w:r>
+    </w:p>
+    <w:p>
+      <w:pPr>
+        <w:ind w:left="317" w:hanging="173"/>
+      </w:pPr>
+      <w:r>
+        <w:rPr>
+          <w:rFonts w:ascii="Cascadia Code" w:hAnsi="Cascadia Code"/>
+          <w:b w:val="0"/>
+          <w:color w:val="18132E"/>
+          <w:sz w:val="18"/>
+        </w:rPr>
+        <w:t>• O bloco deixou de usar progresso acumulado.</w:t>
+      </w:r>
+    </w:p>
+    <w:p>
+      <w:pPr>
+        <w:ind w:left="317" w:hanging="173"/>
+      </w:pPr>
+      <w:r>
+        <w:rPr>
+          <w:rFonts w:ascii="Cascadia Code" w:hAnsi="Cascadia Code"/>
+          <w:b w:val="0"/>
+          <w:color w:val="18132E"/>
+          <w:sz w:val="18"/>
+        </w:rPr>
+        <w:t>• O progresso agora depende da posição atual do scroll no mesmo intervalo da seção.</w:t>
+      </w:r>
+    </w:p>
+    <w:p>
+      <w:pPr>
+        <w:ind w:left="317" w:hanging="173"/>
+      </w:pPr>
+      <w:r>
+        <w:rPr>
+          <w:rFonts w:ascii="Cascadia Code" w:hAnsi="Cascadia Code"/>
+          <w:b w:val="0"/>
+          <w:color w:val="18132E"/>
+          <w:sz w:val="18"/>
+        </w:rPr>
+        <w:t>• A posição atual é convertida em foco contínuo: 0 = Mensagem; 1 = Interpretação; 2 = Contexto; 3 = Resposta; 4 = Retorno.</w:t>
+      </w:r>
+    </w:p>
+    <w:p>
+      <w:pPr>
+        <w:ind w:left="317" w:hanging="173"/>
+      </w:pPr>
+      <w:r>
+        <w:rPr>
+          <w:rFonts w:ascii="Cascadia Code" w:hAnsi="Cascadia Code"/>
+          <w:b w:val="0"/>
+          <w:color w:val="18132E"/>
+          <w:sz w:val="18"/>
+        </w:rPr>
+        <w:t>• Cada etapa recebe peso contínuo pela distância até o foco atual.</w:t>
+      </w:r>
+    </w:p>
+    <w:p>
+      <w:pPr>
+        <w:ind w:left="317" w:hanging="173"/>
+      </w:pPr>
+      <w:r>
+        <w:rPr>
+          <w:rFonts w:ascii="Cascadia Code" w:hAnsi="Cascadia Code"/>
+          <w:b w:val="0"/>
+          <w:color w:val="18132E"/>
+          <w:sz w:val="18"/>
+        </w:rPr>
+        <w:t>• O mesmo valor controla linha, marcador, nó, preenchimento, contraste, opacidade e deslocamento.</w:t>
+      </w:r>
+    </w:p>
+    <w:p>
+      <w:pPr>
+        <w:ind w:left="317" w:hanging="173"/>
+      </w:pPr>
+      <w:r>
+        <w:rPr>
+          <w:rFonts w:ascii="Cascadia Code" w:hAnsi="Cascadia Code"/>
+          <w:b w:val="0"/>
+          <w:color w:val="18132E"/>
+          <w:sz w:val="18"/>
+        </w:rPr>
+        <w:t>• Ao subir, o estado retorna naturalmente.</w:t>
+      </w:r>
+    </w:p>
+    <w:p>
+      <w:pPr>
+        <w:ind w:left="317" w:hanging="173"/>
+      </w:pPr>
+      <w:r>
+        <w:rPr>
+          <w:rFonts w:ascii="Cascadia Code" w:hAnsi="Cascadia Code"/>
+          <w:b w:val="0"/>
+          <w:color w:val="18132E"/>
+          <w:sz w:val="18"/>
+        </w:rPr>
+        <w:t>• Não existe animação separada de retorno.</w:t>
+      </w:r>
+    </w:p>
+    <w:p>
+      <w:pPr>
+        <w:pStyle w:val="Heading1"/>
+      </w:pPr>
+      <w:r>
+        <w:t>47. EVIDÊNCIA DE REVERSIBILIDADE</w:t>
+      </w:r>
+    </w:p>
+    <w:p>
+      <w:pPr>
+        <w:ind w:left="317" w:hanging="173"/>
+      </w:pPr>
+      <w:r>
+        <w:rPr>
+          <w:rFonts w:ascii="Cascadia Code" w:hAnsi="Cascadia Code"/>
+          <w:b w:val="0"/>
+          <w:color w:val="18132E"/>
+          <w:sz w:val="18"/>
+        </w:rPr>
+        <w:t>• Viewport: 1440 × 900.</w:t>
+      </w:r>
+    </w:p>
+    <w:p>
+      <w:pPr>
+        <w:ind w:left="317" w:hanging="173"/>
+      </w:pPr>
+      <w:r>
+        <w:rPr>
+          <w:rFonts w:ascii="Cascadia Code" w:hAnsi="Cascadia Code"/>
+          <w:b w:val="0"/>
+          <w:color w:val="18132E"/>
+          <w:sz w:val="18"/>
+        </w:rPr>
+        <w:t>• scrollY inicial: 1950.</w:t>
+      </w:r>
+    </w:p>
+    <w:p>
+      <w:pPr>
+        <w:ind w:left="317" w:hanging="173"/>
+      </w:pPr>
+      <w:r>
+        <w:rPr>
+          <w:rFonts w:ascii="Cascadia Code" w:hAnsi="Cascadia Code"/>
+          <w:b w:val="0"/>
+          <w:color w:val="18132E"/>
+          <w:sz w:val="18"/>
+        </w:rPr>
+        <w:t>• Estado inicial: linha 58,19 px; Mensagem dominante; opacity 1; translateY 0; scale 1; nó preenchido.</w:t>
+      </w:r>
+    </w:p>
+    <w:p>
+      <w:pPr>
+        <w:ind w:left="317" w:hanging="173"/>
+      </w:pPr>
+      <w:r>
+        <w:rPr>
+          <w:rFonts w:ascii="Cascadia Code" w:hAnsi="Cascadia Code"/>
+          <w:b w:val="0"/>
+          <w:color w:val="18132E"/>
+          <w:sz w:val="18"/>
+        </w:rPr>
+        <w:t>• Demais etapas: opacity 0,45; translateY 6 px; scale 0,8; nó vazio.</w:t>
+      </w:r>
+    </w:p>
+    <w:p>
+      <w:pPr>
+        <w:ind w:left="317" w:hanging="173"/>
+      </w:pPr>
+      <w:r>
+        <w:rPr>
+          <w:rFonts w:ascii="Cascadia Code" w:hAnsi="Cascadia Code"/>
+          <w:b w:val="0"/>
+          <w:color w:val="18132E"/>
+          <w:sz w:val="18"/>
+        </w:rPr>
+        <w:t>• scrollY final da descida: 2300. Linha: 812,56 px.</w:t>
+      </w:r>
+    </w:p>
+    <w:p>
+      <w:pPr>
+        <w:ind w:left="317" w:hanging="173"/>
+      </w:pPr>
+      <w:r>
+        <w:rPr>
+          <w:rFonts w:ascii="Cascadia Code" w:hAnsi="Cascadia Code"/>
+          <w:b w:val="0"/>
+          <w:color w:val="18132E"/>
+          <w:sz w:val="18"/>
+        </w:rPr>
+        <w:t>• Retorno exato para scrollY 1950.</w:t>
+      </w:r>
+    </w:p>
+    <w:p>
+      <w:pPr>
+        <w:ind w:left="317" w:hanging="173"/>
+      </w:pPr>
+      <w:r>
+        <w:rPr>
+          <w:rFonts w:ascii="Cascadia Code" w:hAnsi="Cascadia Code"/>
+          <w:b w:val="0"/>
+          <w:color w:val="18132E"/>
+          <w:sz w:val="18"/>
+        </w:rPr>
+        <w:t>• Resultado: linha novamente 58,19 px; lineDelta = 0.</w:t>
+      </w:r>
+    </w:p>
+    <w:p>
+      <w:pPr>
+        <w:ind w:left="317" w:hanging="173"/>
+      </w:pPr>
+      <w:r>
+        <w:rPr>
+          <w:rFonts w:ascii="Cascadia Code" w:hAnsi="Cascadia Code"/>
+          <w:b w:val="0"/>
+          <w:color w:val="18132E"/>
+          <w:sz w:val="18"/>
+        </w:rPr>
+        <w:t>• Delta 0 em opacidade, deslocamento, escala e preenchimento dos nós.</w:t>
+      </w:r>
+    </w:p>
+    <w:p>
+      <w:pPr>
+        <w:ind w:left="317" w:hanging="173"/>
+      </w:pPr>
+      <w:r>
+        <w:rPr>
+          <w:rFonts w:ascii="Cascadia Code" w:hAnsi="Cascadia Code"/>
+          <w:b w:val="0"/>
+          <w:color w:val="18132E"/>
+          <w:sz w:val="18"/>
+        </w:rPr>
+        <w:t>• Conclusão: motion bidirecional confirmado sem latch.</w:t>
+      </w:r>
+    </w:p>
+    <w:p>
+      <w:pPr>
+        <w:pStyle w:val="Heading1"/>
+      </w:pPr>
+      <w:r>
+        <w:t>48. QA DO HOTFIX</w:t>
+      </w:r>
+    </w:p>
+    <w:p>
+      <w:pPr>
+        <w:ind w:left="317" w:hanging="173"/>
+      </w:pPr>
+      <w:r>
+        <w:rPr>
+          <w:rFonts w:ascii="Cascadia Code" w:hAnsi="Cascadia Code"/>
+          <w:b w:val="0"/>
+          <w:color w:val="18132E"/>
+          <w:sz w:val="18"/>
+        </w:rPr>
+        <w:t>• 43 testes passando.</w:t>
+      </w:r>
+    </w:p>
+    <w:p>
+      <w:pPr>
+        <w:ind w:left="317" w:hanging="173"/>
+      </w:pPr>
+      <w:r>
+        <w:rPr>
+          <w:rFonts w:ascii="Cascadia Code" w:hAnsi="Cascadia Code"/>
+          <w:b w:val="0"/>
+          <w:color w:val="18132E"/>
+          <w:sz w:val="18"/>
+        </w:rPr>
+        <w:t>• bunx tsc --noEmit: aprovado.</w:t>
+      </w:r>
+    </w:p>
+    <w:p>
+      <w:pPr>
+        <w:ind w:left="317" w:hanging="173"/>
+      </w:pPr>
+      <w:r>
+        <w:rPr>
+          <w:rFonts w:ascii="Cascadia Code" w:hAnsi="Cascadia Code"/>
+          <w:b w:val="0"/>
+          <w:color w:val="18132E"/>
+          <w:sz w:val="18"/>
+        </w:rPr>
+        <w:t>• bun run build: aprovado.</w:t>
+      </w:r>
+    </w:p>
+    <w:p>
+      <w:pPr>
+        <w:ind w:left="317" w:hanging="173"/>
+      </w:pPr>
+      <w:r>
+        <w:rPr>
+          <w:rFonts w:ascii="Cascadia Code" w:hAnsi="Cascadia Code"/>
+          <w:b w:val="0"/>
+          <w:color w:val="18132E"/>
+          <w:sz w:val="18"/>
+        </w:rPr>
+        <w:t>• git diff --check: limpo.</w:t>
+      </w:r>
+    </w:p>
+    <w:p>
+      <w:pPr>
+        <w:ind w:left="317" w:hanging="173"/>
+      </w:pPr>
+      <w:r>
+        <w:rPr>
+          <w:rFonts w:ascii="Cascadia Code" w:hAnsi="Cascadia Code"/>
+          <w:b w:val="0"/>
+          <w:color w:val="18132E"/>
+          <w:sz w:val="18"/>
+        </w:rPr>
+        <w:t>• pageerror [].</w:t>
+      </w:r>
+    </w:p>
+    <w:p>
+      <w:pPr>
+        <w:ind w:left="317" w:hanging="173"/>
+      </w:pPr>
+      <w:r>
+        <w:rPr>
+          <w:rFonts w:ascii="Cascadia Code" w:hAnsi="Cascadia Code"/>
+          <w:b w:val="0"/>
+          <w:color w:val="18132E"/>
+          <w:sz w:val="18"/>
+        </w:rPr>
+        <w:t>• Sem overflow em 1440.</w:t>
+      </w:r>
+    </w:p>
+    <w:p>
+      <w:pPr>
+        <w:ind w:left="317" w:hanging="173"/>
+      </w:pPr>
+      <w:r>
+        <w:rPr>
+          <w:rFonts w:ascii="Cascadia Code" w:hAnsi="Cascadia Code"/>
+          <w:b w:val="0"/>
+          <w:color w:val="18132E"/>
+          <w:sz w:val="18"/>
+        </w:rPr>
+        <w:t>• routeTree.gen.ts restaurado.</w:t>
+      </w:r>
+    </w:p>
+    <w:p>
+      <w:pPr>
+        <w:ind w:left="317" w:hanging="173"/>
+      </w:pPr>
+      <w:r>
+        <w:rPr>
+          <w:rFonts w:ascii="Cascadia Code" w:hAnsi="Cascadia Code"/>
+          <w:b w:val="0"/>
+          <w:color w:val="18132E"/>
+          <w:sz w:val="18"/>
+        </w:rPr>
+        <w:t>• Localhost encerrado.</w:t>
+      </w:r>
+    </w:p>
+    <w:p>
+      <w:pPr>
+        <w:pStyle w:val="Heading1"/>
+      </w:pPr>
+      <w:r>
+        <w:t>49. GIT</w:t>
+      </w:r>
+    </w:p>
+    <w:p>
+      <w:pPr>
+        <w:ind w:left="317" w:hanging="173"/>
+      </w:pPr>
+      <w:r>
+        <w:rPr>
+          <w:rFonts w:ascii="Cascadia Code" w:hAnsi="Cascadia Code"/>
+          <w:b w:val="0"/>
+          <w:color w:val="18132E"/>
+          <w:sz w:val="18"/>
+        </w:rPr>
+        <w:t>• Commit funcional: c1e8c55af7268e568968e9a1881ec70b088c9ae4.</w:t>
+      </w:r>
+    </w:p>
+    <w:p>
+      <w:pPr>
+        <w:ind w:left="317" w:hanging="173"/>
+      </w:pPr>
+      <w:r>
+        <w:rPr>
+          <w:rFonts w:ascii="Cascadia Code" w:hAnsi="Cascadia Code"/>
+          <w:b w:val="0"/>
+          <w:color w:val="18132E"/>
+          <w:sz w:val="18"/>
+        </w:rPr>
+        <w:t>• Mensagem: fix: make secretary flow follow scroll bidirectionally.</w:t>
+      </w:r>
+    </w:p>
+    <w:p>
+      <w:pPr>
+        <w:ind w:left="317" w:hanging="173"/>
+      </w:pPr>
+      <w:r>
+        <w:rPr>
+          <w:rFonts w:ascii="Cascadia Code" w:hAnsi="Cascadia Code"/>
+          <w:b w:val="0"/>
+          <w:color w:val="18132E"/>
+          <w:sz w:val="18"/>
+        </w:rPr>
+        <w:t>• Arquivo: src/routes/portfolio.tsx.</w:t>
+      </w:r>
+    </w:p>
+    <w:p>
+      <w:pPr>
+        <w:ind w:left="317" w:hanging="173"/>
+      </w:pPr>
+      <w:r>
+        <w:rPr>
+          <w:rFonts w:ascii="Cascadia Code" w:hAnsi="Cascadia Code"/>
+          <w:b w:val="0"/>
+          <w:color w:val="18132E"/>
+          <w:sz w:val="18"/>
+        </w:rPr>
+        <w:t>• Branch: feat/site-launch-core.</w:t>
+      </w:r>
+    </w:p>
+    <w:p>
+      <w:pPr>
+        <w:ind w:left="317" w:hanging="173"/>
+      </w:pPr>
+      <w:r>
+        <w:rPr>
+          <w:rFonts w:ascii="Cascadia Code" w:hAnsi="Cascadia Code"/>
+          <w:b w:val="0"/>
+          <w:color w:val="18132E"/>
+          <w:sz w:val="18"/>
+        </w:rPr>
+        <w:t>• Push: 93420ec..c1e8c55 para origin/feat/site-launch-core.</w:t>
+      </w:r>
+    </w:p>
+    <w:p>
+      <w:pPr>
+        <w:ind w:left="317" w:hanging="173"/>
+      </w:pPr>
+      <w:r>
+        <w:rPr>
+          <w:rFonts w:ascii="Cascadia Code" w:hAnsi="Cascadia Code"/>
+          <w:b w:val="0"/>
+          <w:color w:val="18132E"/>
+          <w:sz w:val="18"/>
+        </w:rPr>
+        <w:t>• Sem force push, sem merge e sem Pull Request.</w:t>
+      </w:r>
+    </w:p>
+    <w:p>
+      <w:pPr>
+        <w:pStyle w:val="Heading1"/>
+      </w:pPr>
+      <w:r>
+        <w:t>50. GOVERNANÇA</w:t>
+      </w:r>
+    </w:p>
+    <w:p>
+      <w:pPr>
+        <w:ind w:left="317" w:hanging="173"/>
+      </w:pPr>
+      <w:r>
+        <w:rPr>
+          <w:rFonts w:ascii="Cascadia Code" w:hAnsi="Cascadia Code"/>
+          <w:b w:val="0"/>
+          <w:color w:val="18132E"/>
+          <w:sz w:val="18"/>
+        </w:rPr>
+        <w:t>• /portfolio: APROVADO. Bugs de scroll corrigidos. CONGELADO.</w:t>
+      </w:r>
+    </w:p>
+    <w:p>
+      <w:pPr>
+        <w:ind w:left="317" w:hanging="173"/>
+      </w:pPr>
+      <w:r>
+        <w:rPr>
+          <w:rFonts w:ascii="Cascadia Code" w:hAnsi="Cascadia Code"/>
+          <w:b w:val="0"/>
+          <w:color w:val="18132E"/>
+          <w:sz w:val="18"/>
+        </w:rPr>
+        <w:t>• A Secretária.Code saiu da lista de pendências técnicas abertas.</w:t>
+      </w:r>
+    </w:p>
+    <w:p>
+      <w:pPr>
+        <w:ind w:left="317" w:hanging="173"/>
+      </w:pPr>
+      <w:r>
+        <w:rPr>
+          <w:rFonts w:ascii="Cascadia Code" w:hAnsi="Cascadia Code"/>
+          <w:b w:val="0"/>
+          <w:color w:val="18132E"/>
+          <w:sz w:val="18"/>
+        </w:rPr>
+        <w:t>• /portfolio não reabre sem bug concreto ou nova autorização.</w:t>
+      </w:r>
+    </w:p>
+    <w:p>
+      <w:pPr>
+        <w:ind w:left="317" w:hanging="173"/>
+      </w:pPr>
+      <w:r>
+        <w:rPr>
+          <w:rFonts w:ascii="Cascadia Code" w:hAnsi="Cascadia Code"/>
+          <w:b w:val="0"/>
+          <w:color w:val="18132E"/>
+          <w:sz w:val="18"/>
+        </w:rPr>
+        <w:t>• /contato e /solucoes continuam congelados.</w:t>
+      </w:r>
+    </w:p>
+    <w:p>
+      <w:pPr>
+        <w:ind w:left="317" w:hanging="173"/>
+      </w:pPr>
+      <w:r>
+        <w:rPr>
+          <w:rFonts w:ascii="Cascadia Code" w:hAnsi="Cascadia Code"/>
+          <w:b w:val="0"/>
+          <w:color w:val="18132E"/>
+          <w:sz w:val="18"/>
+        </w:rPr>
+        <w:t>• Próxima frente: /sobre.</w:t>
+      </w:r>
+    </w:p>
+    <w:p>
+      <w:pPr>
+        <w:ind w:left="317" w:hanging="173"/>
+      </w:pPr>
+      <w:r>
+        <w:rPr>
+          <w:rFonts w:ascii="Cascadia Code" w:hAnsi="Cascadia Code"/>
+          <w:b w:val="0"/>
+          <w:color w:val="18132E"/>
+          <w:sz w:val="18"/>
+        </w:rPr>
+        <w:t>• Planejado, sem execução: revisão cirúrgica da composição da Home, para quebrar o padrão recorrente de headline grande de um lado e objeto explicativo do outro.</w:t>
+      </w:r>
+    </w:p>
+    <w:p>
+      <w:pPr>
+        <w:pStyle w:val="Heading1"/>
+      </w:pPr>
+      <w:r>
+        <w:t>51. PRÓXIMO MARCO</w:t>
+      </w:r>
+    </w:p>
+    <w:tbl>
+      <w:tblPr>
+        <w:tblW w:type="auto" w:w="0"/>
+        <w:jc w:val="left"/>
+        <w:tblLook w:firstColumn="1" w:firstRow="1" w:lastColumn="0" w:lastRow="0" w:noHBand="0" w:noVBand="1" w:val="04A0"/>
+      </w:tblPr>
+      <w:tblGrid>
+        <w:gridCol w:w="5040"/>
+        <w:gridCol w:w="5040"/>
+      </w:tblGrid>
+      <w:tr>
+        <w:tc>
+          <w:tcPr>
+            <w:tcW w:type="dxa" w:w="5040"/>
+            <w:shd w:fill="FFF3F8"/>
+          </w:tcPr>
+          <w:p>
+            <w:pPr>
+              <w:spacing w:after="0"/>
+            </w:pPr>
+            <w:r/>
+            <w:r>
+              <w:rPr>
+                <w:rFonts w:ascii="Cascadia Code" w:hAnsi="Cascadia Code"/>
+                <w:b/>
+                <w:color w:val="AF66F9"/>
+                <w:sz w:val="16"/>
+              </w:rPr>
+              <w:t>PRÓXIMO</w:t>
+            </w:r>
+          </w:p>
+        </w:tc>
+        <w:tc>
+          <w:tcPr>
+            <w:tcW w:type="dxa" w:w="5040"/>
+            <w:shd w:fill="FFF3F8"/>
+          </w:tcPr>
+          <w:p>
+            <w:pPr>
+              <w:spacing w:after="0"/>
+            </w:pPr>
+            <w:r/>
+            <w:r>
+              <w:rPr>
+                <w:rFonts w:ascii="Cascadia Code" w:hAnsi="Cascadia Code"/>
+                <w:b w:val="0"/>
+                <w:color w:val="18132E"/>
+                <w:sz w:val="17"/>
+              </w:rPr>
+              <w:t>/sobre. /portfolio, /contato e /solucoes permanecem congelados. A Secretária.Code não está mais entre as pendências técnicas abertas. A revisão cirúrgica da composição da Home permanece planejada, sem execução.</w:t>
             </w:r>
           </w:p>
         </w:tc>

</xml_diff>